<commit_message>
Spell out acronyms at first use and add glossary appendix
Every acronym in the rules and methodology document is now introduced in
full with the abbreviation in brackets. New Appendix A lists acronyms and
key terms.

Co-Authored-By: Claude Opus 5.5 <noreply@anthropic.com>
Claude-Session: https://claude.ai/code/session_013woDwy1Jw8XbwbT1HUNgCF
</commit_message>
<xml_diff>
--- a/docs/ASX_Value_Screener_Rules_and_Methodology.docx
+++ b/docs/ASX_Value_Screener_Rules_and_Methodology.docx
@@ -59,7 +59,7 @@
         <w:spacing w:after="120"/>
       </w:pPr>
       <w:r>
-        <w:t xml:space="preserve">This document sets out every rule the ASX Value Screener applies, from raw market data through to the suggested action for each company, so that any output can be traced back to a defined test and threshold.</w:t>
+        <w:t xml:space="preserve">This document sets out every rule applied by the ASX Value Screener, a research tool for shares listed on the Australian Securities Exchange (ASX), from raw market data through to the suggested action for each company, so that any output can be traced back to a defined test and threshold.</w:t>
       </w:r>
     </w:p>
     <w:p>
@@ -87,7 +87,7 @@
         <w:t xml:space="preserve">Values</w:t>
       </w:r>
       <w:r>
-        <w:t xml:space="preserve"> around 500 ASX companies every trading day using two-stage cash flow models, choosing the model to suit the sector.</w:t>
+        <w:t xml:space="preserve"> around 500 ASX-listed companies every trading day using two-stage cash flow models, choosing the model to suit the sector.</w:t>
       </w:r>
     </w:p>
     <w:p>
@@ -147,7 +147,7 @@
         <w:t xml:space="preserve">Recommends a next step</w:t>
       </w:r>
       <w:r>
-        <w:t xml:space="preserve"> for each company, with the reason, and assesses shares you hold separately, including CGT timing.</w:t>
+        <w:t xml:space="preserve"> for each company, with the reason, and assesses shares you hold separately, including capital gains tax (CGT) timing.</w:t>
       </w:r>
     </w:p>
     <w:p>
@@ -156,6 +156,14 @@
       </w:pPr>
       <w:r>
         <w:t xml:space="preserve">Every rule is deliberately simple and explainable. The outputs are research prompts to direct attention, not buy or sell instructions.</w:t>
+      </w:r>
+    </w:p>
+    <w:p>
+      <w:pPr>
+        <w:spacing w:after="120"/>
+      </w:pPr>
+      <w:r>
+        <w:t xml:space="preserve">Acronyms are spelled out at first use and listed, with other key terms, in Appendix A: Glossary.</w:t>
       </w:r>
     </w:p>
     <w:p>
@@ -455,7 +463,7 @@
                 <w:sz w:val="18"/>
                 <w:szCs w:val="18"/>
               </w:rPr>
-              <w:t xml:space="preserve">Intrinsic value per share is estimated with a discounted cash flow (DCF) or dividend discount (DDM) model, depending on sector, and compared with the share price.</w:t>
+              <w:t xml:space="preserve">Intrinsic value per share is estimated with a discounted cash flow (DCF) model or a dividend discount model (DDM), depending on sector, and compared with the share price.</w:t>
             </w:r>
           </w:p>
         </w:tc>
@@ -642,7 +650,7 @@
                 <w:sz w:val="18"/>
                 <w:szCs w:val="18"/>
               </w:rPr>
-              <w:t xml:space="preserve">Change in margin of safety over 30 days, and the direction of ROE and revenue over three years.</w:t>
+              <w:t xml:space="preserve">Change in margin of safety over 30 days, and the direction of return on equity (ROE) and revenue over three years.</w:t>
             </w:r>
           </w:p>
         </w:tc>
@@ -987,7 +995,7 @@
         <w:t xml:space="preserve">Show everything, hide nothing.</w:t>
       </w:r>
       <w:r>
-        <w:t xml:space="preserve"> Every company appears with a Y/N result per test, so you can see how close a company is to passing.</w:t>
+        <w:t xml:space="preserve"> Every company appears with a Y (yes) or N (no) result per test, so you can see how close a company is to passing.</w:t>
       </w:r>
     </w:p>
     <w:p>
@@ -1027,7 +1035,7 @@
         <w:t xml:space="preserve">Right model for the sector.</w:t>
       </w:r>
       <w:r>
-        <w:t xml:space="preserve"> Banks, insurers and REITs are valued on dividends, because their free cash flow reflects balance-sheet movements rather than business performance.</w:t>
+        <w:t xml:space="preserve"> Banks, insurers and real estate investment trusts (REITs) are valued on dividends, because their free cash flow reflects balance-sheet movements rather than business performance.</w:t>
       </w:r>
     </w:p>
     <w:p>
@@ -1324,7 +1332,7 @@
                 <w:sz w:val="18"/>
                 <w:szCs w:val="18"/>
               </w:rPr>
-              <w:t xml:space="preserve">Annual (FY) reports only. The latest FY report drives every ratio.</w:t>
+              <w:t xml:space="preserve">Annual reports only, one per financial year (FY). The latest FY report drives every ratio.</w:t>
             </w:r>
           </w:p>
         </w:tc>
@@ -1580,7 +1588,7 @@
                 <w:sz w:val="18"/>
                 <w:szCs w:val="18"/>
               </w:rPr>
-              <w:t xml:space="preserve">Market capitalisation divided by closing price. If unavailable: net profit divided by EPS.</w:t>
+              <w:t xml:space="preserve">Market capitalisation divided by closing price. If unavailable: net profit divided by earnings per share (EPS).</w:t>
             </w:r>
           </w:p>
         </w:tc>
@@ -2142,7 +2150,7 @@
         <w:t xml:space="preserve">Base:</w:t>
       </w:r>
       <w:r>
-        <w:t xml:space="preserve"> average free cash flow over the last three FY reports. Must be greater than zero, otherwise no value is produced.</w:t>
+        <w:t xml:space="preserve"> average free cash flow (FCF) over the last three FY reports. Must be greater than zero, otherwise no value is produced.</w:t>
       </w:r>
     </w:p>
     <w:p>
@@ -3124,7 +3132,7 @@
         <w:t xml:space="preserve">graham_number = √(22.5 × EPS × book value per share)</w:t>
       </w:r>
       <w:r>
-        <w:t xml:space="preserve">, where 22.5 reflects Graham's ceilings of a P/E of 15 and a P/B of 1.5. Blank when EPS or book value is zero or negative. Shown for reference only; it is not used in any test or action.</w:t>
+        <w:t xml:space="preserve">, where 22.5 reflects Graham's ceilings of a price-to-earnings ratio (P/E) of 15 and a price-to-book ratio (P/B) of 1.5. Blank when EPS or book value is zero or negative. Shown for reference only; it is not used in any test or action.</w:t>
       </w:r>
     </w:p>
     <w:p>
@@ -3509,7 +3517,7 @@
                 <w:sz w:val="18"/>
                 <w:szCs w:val="18"/>
               </w:rPr>
-              <w:t xml:space="preserve">Price ÷ (free cash flow ÷ shares on issue)</w:t>
+              <w:t xml:space="preserve">Price ÷ (FCF ÷ shares on issue)</w:t>
             </w:r>
           </w:p>
         </w:tc>
@@ -3603,7 +3611,7 @@
                 <w:sz w:val="18"/>
                 <w:szCs w:val="18"/>
               </w:rPr>
-              <w:t xml:space="preserve">(Market cap + total debt − cash) ÷ EBIT</w:t>
+              <w:t xml:space="preserve">Enterprise value (EV) ÷ earnings before interest and tax (EBIT), where EV = market capitalisation + total debt − cash</w:t>
             </w:r>
           </w:p>
         </w:tc>
@@ -3633,7 +3641,7 @@
                 <w:sz w:val="18"/>
                 <w:szCs w:val="18"/>
               </w:rPr>
-              <w:t xml:space="preserve">Enterprise value multiple, independent of capital structure.</w:t>
+              <w:t xml:space="preserve">Valuation multiple that is independent of capital structure.</w:t>
             </w:r>
           </w:p>
         </w:tc>
@@ -3820,7 +3828,7 @@
                 <w:sz w:val="18"/>
                 <w:szCs w:val="18"/>
               </w:rPr>
-              <w:t xml:space="preserve">Return on invested capital, %.</w:t>
+              <w:t xml:space="preserve">Return on invested capital (ROIC), %.</w:t>
             </w:r>
           </w:p>
         </w:tc>
@@ -4305,7 +4313,7 @@
         <w:spacing w:after="120"/>
       </w:pPr>
       <w:r>
-        <w:t xml:space="preserve">These four tests are the heart of the screen. Each produces Y or N for every company.</w:t>
+        <w:t xml:space="preserve">These four tests are the heart of the screen. Each produces Y (yes) or N (no) for every company.</w:t>
       </w:r>
     </w:p>
     <w:tbl>
@@ -6404,7 +6412,7 @@
                 <w:sz w:val="18"/>
                 <w:szCs w:val="18"/>
               </w:rPr>
-              <w:t xml:space="preserve">Share of 11 checks present: close price, market cap, EPS, net profit, revenue, equity, total debt, operating cash flow, free cash flow, at least 3 FY reports, at least 200 days of prices. HIGH = 10 or 11; MEDIUM = 8 or 9; LOW = 7 or fewer.</w:t>
+              <w:t xml:space="preserve">Share of 11 checks present: closing price, market capitalisation, EPS, net profit, revenue, equity, total debt, operating cash flow, free cash flow, at least 3 FY reports, at least 200 days of prices. HIGH = 10 or 11; MEDIUM = 8 or 9; LOW = 7 or fewer.</w:t>
             </w:r>
           </w:p>
         </w:tc>
@@ -8505,7 +8513,7 @@
         <w:spacing w:after="120"/>
       </w:pPr>
       <w:r>
-        <w:t xml:space="preserve">Holdings are recorded parcel by parcel. The tax arithmetic follows the mechanical parts of the ATO rules for individuals.</w:t>
+        <w:t xml:space="preserve">Holdings are recorded parcel by parcel. The tax arithmetic follows the mechanical parts of the Australian Taxation Office (ATO) rules for individuals.</w:t>
       </w:r>
     </w:p>
     <w:tbl>
@@ -8653,7 +8661,7 @@
                 <w:sz w:val="18"/>
                 <w:szCs w:val="18"/>
               </w:rPr>
-              <w:t xml:space="preserve">Each acquisition is recorded separately: units, date, price, brokerage, method (purchase, DRP, bonus, transfer, other), broker and notes.</w:t>
+              <w:t xml:space="preserve">Each acquisition is recorded separately: units, date, price, brokerage, method (purchase, dividend reinvestment plan (DRP), bonus, transfer, other), broker and notes.</w:t>
             </w:r>
           </w:p>
         </w:tc>
@@ -9230,7 +9238,7 @@
                 <w:sz w:val="18"/>
                 <w:szCs w:val="18"/>
               </w:rPr>
-              <w:t xml:space="preserve">FIFO (oldest parcel first); min-tax (lowest taxable gain per unit first, with losses first and discount-eligible gains counted at half); or a specific parcel.</w:t>
+              <w:t xml:space="preserve">First in, first out (FIFO): oldest parcel first; min-tax (lowest taxable gain per unit first, with losses first and discount-eligible gains counted at half); or a specific parcel.</w:t>
             </w:r>
           </w:p>
         </w:tc>
@@ -9379,7 +9387,7 @@
         <w:t xml:space="preserve">Franking.</w:t>
       </w:r>
       <w:r>
-        <w:t xml:space="preserve"> Australian companies are assumed fully franked unless corrected by hand, so partly franked payers and some LICs are overstated.</w:t>
+        <w:t xml:space="preserve"> Australian companies are assumed fully franked unless corrected by hand, so partly franked payers and some listed investment companies (LICs) are overstated.</w:t>
       </w:r>
     </w:p>
     <w:p>
@@ -9442,6 +9450,3331 @@
         <w:t xml:space="preserve"> fundamentals_trend compares only the first and last years of the window, not the path between them.</w:t>
       </w:r>
     </w:p>
+    <w:p>
+      <w:pPr>
+        <w:pStyle w:val="Heading1"/>
+        <w:pageBreakBefore/>
+      </w:pPr>
+      <w:r>
+        <w:t xml:space="preserve">Appendix A: Glossary</w:t>
+      </w:r>
+    </w:p>
+    <w:p>
+      <w:pPr>
+        <w:pStyle w:val="Heading2"/>
+      </w:pPr>
+      <w:r>
+        <w:t xml:space="preserve">A.1 Acronyms</w:t>
+      </w:r>
+    </w:p>
+    <w:tbl>
+      <w:tblPr>
+        <w:tblW w:type="dxa" w:w="9638"/>
+        <w:tblBorders>
+          <w:top w:val="single" w:color="auto" w:sz="4"/>
+          <w:left w:val="single" w:color="auto" w:sz="4"/>
+          <w:bottom w:val="single" w:color="auto" w:sz="4"/>
+          <w:right w:val="single" w:color="auto" w:sz="4"/>
+          <w:insideH w:val="single" w:color="auto" w:sz="4"/>
+          <w:insideV w:val="single" w:color="auto" w:sz="4"/>
+        </w:tblBorders>
+      </w:tblPr>
+      <w:tblGrid>
+        <w:gridCol w:w="1156"/>
+        <w:gridCol w:w="2891"/>
+        <w:gridCol w:w="5591"/>
+      </w:tblGrid>
+      <w:tr>
+        <w:trPr>
+          <w:tblHeader/>
+        </w:trPr>
+        <w:tc>
+          <w:tcPr>
+            <w:tcW w:type="dxa" w:w="1156"/>
+            <w:tcBorders>
+              <w:top w:val="single" w:color="BFC9D9" w:sz="4"/>
+              <w:left w:val="single" w:color="BFC9D9" w:sz="4"/>
+              <w:bottom w:val="single" w:color="BFC9D9" w:sz="4"/>
+              <w:right w:val="single" w:color="BFC9D9" w:sz="4"/>
+            </w:tcBorders>
+            <w:shd w:fill="D9E2F3" w:color="auto" w:val="clear"/>
+            <w:tcMar>
+              <w:top w:type="dxa" w:w="60"/>
+              <w:left w:type="dxa" w:w="100"/>
+              <w:bottom w:type="dxa" w:w="60"/>
+              <w:right w:type="dxa" w:w="100"/>
+            </w:tcMar>
+          </w:tcPr>
+          <w:p>
+            <w:pPr>
+              <w:spacing w:after="0"/>
+            </w:pPr>
+            <w:r>
+              <w:rPr>
+                <w:b/>
+                <w:bCs/>
+                <w:color w:val="1F3864"/>
+                <w:sz w:val="18"/>
+                <w:szCs w:val="18"/>
+              </w:rPr>
+              <w:t xml:space="preserve">Acronym</w:t>
+            </w:r>
+          </w:p>
+        </w:tc>
+        <w:tc>
+          <w:tcPr>
+            <w:tcW w:type="dxa" w:w="2891"/>
+            <w:tcBorders>
+              <w:top w:val="single" w:color="BFC9D9" w:sz="4"/>
+              <w:left w:val="single" w:color="BFC9D9" w:sz="4"/>
+              <w:bottom w:val="single" w:color="BFC9D9" w:sz="4"/>
+              <w:right w:val="single" w:color="BFC9D9" w:sz="4"/>
+            </w:tcBorders>
+            <w:shd w:fill="D9E2F3" w:color="auto" w:val="clear"/>
+            <w:tcMar>
+              <w:top w:type="dxa" w:w="60"/>
+              <w:left w:type="dxa" w:w="100"/>
+              <w:bottom w:type="dxa" w:w="60"/>
+              <w:right w:type="dxa" w:w="100"/>
+            </w:tcMar>
+          </w:tcPr>
+          <w:p>
+            <w:pPr>
+              <w:spacing w:after="0"/>
+            </w:pPr>
+            <w:r>
+              <w:rPr>
+                <w:b/>
+                <w:bCs/>
+                <w:color w:val="1F3864"/>
+                <w:sz w:val="18"/>
+                <w:szCs w:val="18"/>
+              </w:rPr>
+              <w:t xml:space="preserve">Full term</w:t>
+            </w:r>
+          </w:p>
+        </w:tc>
+        <w:tc>
+          <w:tcPr>
+            <w:tcW w:type="dxa" w:w="5591"/>
+            <w:tcBorders>
+              <w:top w:val="single" w:color="BFC9D9" w:sz="4"/>
+              <w:left w:val="single" w:color="BFC9D9" w:sz="4"/>
+              <w:bottom w:val="single" w:color="BFC9D9" w:sz="4"/>
+              <w:right w:val="single" w:color="BFC9D9" w:sz="4"/>
+            </w:tcBorders>
+            <w:shd w:fill="D9E2F3" w:color="auto" w:val="clear"/>
+            <w:tcMar>
+              <w:top w:type="dxa" w:w="60"/>
+              <w:left w:type="dxa" w:w="100"/>
+              <w:bottom w:type="dxa" w:w="60"/>
+              <w:right w:type="dxa" w:w="100"/>
+            </w:tcMar>
+          </w:tcPr>
+          <w:p>
+            <w:pPr>
+              <w:spacing w:after="0"/>
+            </w:pPr>
+            <w:r>
+              <w:rPr>
+                <w:b/>
+                <w:bCs/>
+                <w:color w:val="1F3864"/>
+                <w:sz w:val="18"/>
+                <w:szCs w:val="18"/>
+              </w:rPr>
+              <w:t xml:space="preserve">Meaning in this document</w:t>
+            </w:r>
+          </w:p>
+        </w:tc>
+      </w:tr>
+      <w:tr>
+        <w:trPr>
+          <w:cantSplit/>
+        </w:trPr>
+        <w:tc>
+          <w:tcPr>
+            <w:tcW w:type="dxa" w:w="1156"/>
+            <w:tcBorders>
+              <w:top w:val="single" w:color="BFC9D9" w:sz="4"/>
+              <w:left w:val="single" w:color="BFC9D9" w:sz="4"/>
+              <w:bottom w:val="single" w:color="BFC9D9" w:sz="4"/>
+              <w:right w:val="single" w:color="BFC9D9" w:sz="4"/>
+            </w:tcBorders>
+            <w:tcMar>
+              <w:top w:type="dxa" w:w="60"/>
+              <w:left w:type="dxa" w:w="100"/>
+              <w:bottom w:type="dxa" w:w="60"/>
+              <w:right w:type="dxa" w:w="100"/>
+            </w:tcMar>
+          </w:tcPr>
+          <w:p>
+            <w:pPr>
+              <w:spacing w:after="0"/>
+            </w:pPr>
+            <w:r>
+              <w:rPr>
+                <w:sz w:val="18"/>
+                <w:szCs w:val="18"/>
+              </w:rPr>
+              <w:t xml:space="preserve">ASX</w:t>
+            </w:r>
+          </w:p>
+        </w:tc>
+        <w:tc>
+          <w:tcPr>
+            <w:tcW w:type="dxa" w:w="2891"/>
+            <w:tcBorders>
+              <w:top w:val="single" w:color="BFC9D9" w:sz="4"/>
+              <w:left w:val="single" w:color="BFC9D9" w:sz="4"/>
+              <w:bottom w:val="single" w:color="BFC9D9" w:sz="4"/>
+              <w:right w:val="single" w:color="BFC9D9" w:sz="4"/>
+            </w:tcBorders>
+            <w:tcMar>
+              <w:top w:type="dxa" w:w="60"/>
+              <w:left w:type="dxa" w:w="100"/>
+              <w:bottom w:type="dxa" w:w="60"/>
+              <w:right w:type="dxa" w:w="100"/>
+            </w:tcMar>
+          </w:tcPr>
+          <w:p>
+            <w:pPr>
+              <w:spacing w:after="0"/>
+            </w:pPr>
+            <w:r>
+              <w:rPr>
+                <w:sz w:val="18"/>
+                <w:szCs w:val="18"/>
+              </w:rPr>
+              <w:t xml:space="preserve">Australian Securities Exchange</w:t>
+            </w:r>
+          </w:p>
+        </w:tc>
+        <w:tc>
+          <w:tcPr>
+            <w:tcW w:type="dxa" w:w="5591"/>
+            <w:tcBorders>
+              <w:top w:val="single" w:color="BFC9D9" w:sz="4"/>
+              <w:left w:val="single" w:color="BFC9D9" w:sz="4"/>
+              <w:bottom w:val="single" w:color="BFC9D9" w:sz="4"/>
+              <w:right w:val="single" w:color="BFC9D9" w:sz="4"/>
+            </w:tcBorders>
+            <w:tcMar>
+              <w:top w:type="dxa" w:w="60"/>
+              <w:left w:type="dxa" w:w="100"/>
+              <w:bottom w:type="dxa" w:w="60"/>
+              <w:right w:type="dxa" w:w="100"/>
+            </w:tcMar>
+          </w:tcPr>
+          <w:p>
+            <w:pPr>
+              <w:spacing w:after="0"/>
+            </w:pPr>
+            <w:r>
+              <w:rPr>
+                <w:sz w:val="18"/>
+                <w:szCs w:val="18"/>
+              </w:rPr>
+              <w:t xml:space="preserve">Australia's main stock exchange. The companies screened are listed here.</w:t>
+            </w:r>
+          </w:p>
+        </w:tc>
+      </w:tr>
+      <w:tr>
+        <w:trPr>
+          <w:cantSplit/>
+        </w:trPr>
+        <w:tc>
+          <w:tcPr>
+            <w:tcW w:type="dxa" w:w="1156"/>
+            <w:tcBorders>
+              <w:top w:val="single" w:color="BFC9D9" w:sz="4"/>
+              <w:left w:val="single" w:color="BFC9D9" w:sz="4"/>
+              <w:bottom w:val="single" w:color="BFC9D9" w:sz="4"/>
+              <w:right w:val="single" w:color="BFC9D9" w:sz="4"/>
+            </w:tcBorders>
+            <w:shd w:fill="F2F5FA" w:color="auto" w:val="clear"/>
+            <w:tcMar>
+              <w:top w:type="dxa" w:w="60"/>
+              <w:left w:type="dxa" w:w="100"/>
+              <w:bottom w:type="dxa" w:w="60"/>
+              <w:right w:type="dxa" w:w="100"/>
+            </w:tcMar>
+          </w:tcPr>
+          <w:p>
+            <w:pPr>
+              <w:spacing w:after="0"/>
+            </w:pPr>
+            <w:r>
+              <w:rPr>
+                <w:sz w:val="18"/>
+                <w:szCs w:val="18"/>
+              </w:rPr>
+              <w:t xml:space="preserve">ATO</w:t>
+            </w:r>
+          </w:p>
+        </w:tc>
+        <w:tc>
+          <w:tcPr>
+            <w:tcW w:type="dxa" w:w="2891"/>
+            <w:tcBorders>
+              <w:top w:val="single" w:color="BFC9D9" w:sz="4"/>
+              <w:left w:val="single" w:color="BFC9D9" w:sz="4"/>
+              <w:bottom w:val="single" w:color="BFC9D9" w:sz="4"/>
+              <w:right w:val="single" w:color="BFC9D9" w:sz="4"/>
+            </w:tcBorders>
+            <w:shd w:fill="F2F5FA" w:color="auto" w:val="clear"/>
+            <w:tcMar>
+              <w:top w:type="dxa" w:w="60"/>
+              <w:left w:type="dxa" w:w="100"/>
+              <w:bottom w:type="dxa" w:w="60"/>
+              <w:right w:type="dxa" w:w="100"/>
+            </w:tcMar>
+          </w:tcPr>
+          <w:p>
+            <w:pPr>
+              <w:spacing w:after="0"/>
+            </w:pPr>
+            <w:r>
+              <w:rPr>
+                <w:sz w:val="18"/>
+                <w:szCs w:val="18"/>
+              </w:rPr>
+              <w:t xml:space="preserve">Australian Taxation Office</w:t>
+            </w:r>
+          </w:p>
+        </w:tc>
+        <w:tc>
+          <w:tcPr>
+            <w:tcW w:type="dxa" w:w="5591"/>
+            <w:tcBorders>
+              <w:top w:val="single" w:color="BFC9D9" w:sz="4"/>
+              <w:left w:val="single" w:color="BFC9D9" w:sz="4"/>
+              <w:bottom w:val="single" w:color="BFC9D9" w:sz="4"/>
+              <w:right w:val="single" w:color="BFC9D9" w:sz="4"/>
+            </w:tcBorders>
+            <w:shd w:fill="F2F5FA" w:color="auto" w:val="clear"/>
+            <w:tcMar>
+              <w:top w:type="dxa" w:w="60"/>
+              <w:left w:type="dxa" w:w="100"/>
+              <w:bottom w:type="dxa" w:w="60"/>
+              <w:right w:type="dxa" w:w="100"/>
+            </w:tcMar>
+          </w:tcPr>
+          <w:p>
+            <w:pPr>
+              <w:spacing w:after="0"/>
+            </w:pPr>
+            <w:r>
+              <w:rPr>
+                <w:sz w:val="18"/>
+                <w:szCs w:val="18"/>
+              </w:rPr>
+              <w:t xml:space="preserve">Sets the capital gains tax rules applied to your holdings.</w:t>
+            </w:r>
+          </w:p>
+        </w:tc>
+      </w:tr>
+      <w:tr>
+        <w:trPr>
+          <w:cantSplit/>
+        </w:trPr>
+        <w:tc>
+          <w:tcPr>
+            <w:tcW w:type="dxa" w:w="1156"/>
+            <w:tcBorders>
+              <w:top w:val="single" w:color="BFC9D9" w:sz="4"/>
+              <w:left w:val="single" w:color="BFC9D9" w:sz="4"/>
+              <w:bottom w:val="single" w:color="BFC9D9" w:sz="4"/>
+              <w:right w:val="single" w:color="BFC9D9" w:sz="4"/>
+            </w:tcBorders>
+            <w:tcMar>
+              <w:top w:type="dxa" w:w="60"/>
+              <w:left w:type="dxa" w:w="100"/>
+              <w:bottom w:type="dxa" w:w="60"/>
+              <w:right w:type="dxa" w:w="100"/>
+            </w:tcMar>
+          </w:tcPr>
+          <w:p>
+            <w:pPr>
+              <w:spacing w:after="0"/>
+            </w:pPr>
+            <w:r>
+              <w:rPr>
+                <w:sz w:val="18"/>
+                <w:szCs w:val="18"/>
+              </w:rPr>
+              <w:t xml:space="preserve">CGT</w:t>
+            </w:r>
+          </w:p>
+        </w:tc>
+        <w:tc>
+          <w:tcPr>
+            <w:tcW w:type="dxa" w:w="2891"/>
+            <w:tcBorders>
+              <w:top w:val="single" w:color="BFC9D9" w:sz="4"/>
+              <w:left w:val="single" w:color="BFC9D9" w:sz="4"/>
+              <w:bottom w:val="single" w:color="BFC9D9" w:sz="4"/>
+              <w:right w:val="single" w:color="BFC9D9" w:sz="4"/>
+            </w:tcBorders>
+            <w:tcMar>
+              <w:top w:type="dxa" w:w="60"/>
+              <w:left w:type="dxa" w:w="100"/>
+              <w:bottom w:type="dxa" w:w="60"/>
+              <w:right w:type="dxa" w:w="100"/>
+            </w:tcMar>
+          </w:tcPr>
+          <w:p>
+            <w:pPr>
+              <w:spacing w:after="0"/>
+            </w:pPr>
+            <w:r>
+              <w:rPr>
+                <w:sz w:val="18"/>
+                <w:szCs w:val="18"/>
+              </w:rPr>
+              <w:t xml:space="preserve">Capital gains tax</w:t>
+            </w:r>
+          </w:p>
+        </w:tc>
+        <w:tc>
+          <w:tcPr>
+            <w:tcW w:type="dxa" w:w="5591"/>
+            <w:tcBorders>
+              <w:top w:val="single" w:color="BFC9D9" w:sz="4"/>
+              <w:left w:val="single" w:color="BFC9D9" w:sz="4"/>
+              <w:bottom w:val="single" w:color="BFC9D9" w:sz="4"/>
+              <w:right w:val="single" w:color="BFC9D9" w:sz="4"/>
+            </w:tcBorders>
+            <w:tcMar>
+              <w:top w:type="dxa" w:w="60"/>
+              <w:left w:type="dxa" w:w="100"/>
+              <w:bottom w:type="dxa" w:w="60"/>
+              <w:right w:type="dxa" w:w="100"/>
+            </w:tcMar>
+          </w:tcPr>
+          <w:p>
+            <w:pPr>
+              <w:spacing w:after="0"/>
+            </w:pPr>
+            <w:r>
+              <w:rPr>
+                <w:sz w:val="18"/>
+                <w:szCs w:val="18"/>
+              </w:rPr>
+              <w:t xml:space="preserve">Tax on the gain made when an asset, such as a share parcel, is sold.</w:t>
+            </w:r>
+          </w:p>
+        </w:tc>
+      </w:tr>
+      <w:tr>
+        <w:trPr>
+          <w:cantSplit/>
+        </w:trPr>
+        <w:tc>
+          <w:tcPr>
+            <w:tcW w:type="dxa" w:w="1156"/>
+            <w:tcBorders>
+              <w:top w:val="single" w:color="BFC9D9" w:sz="4"/>
+              <w:left w:val="single" w:color="BFC9D9" w:sz="4"/>
+              <w:bottom w:val="single" w:color="BFC9D9" w:sz="4"/>
+              <w:right w:val="single" w:color="BFC9D9" w:sz="4"/>
+            </w:tcBorders>
+            <w:shd w:fill="F2F5FA" w:color="auto" w:val="clear"/>
+            <w:tcMar>
+              <w:top w:type="dxa" w:w="60"/>
+              <w:left w:type="dxa" w:w="100"/>
+              <w:bottom w:type="dxa" w:w="60"/>
+              <w:right w:type="dxa" w:w="100"/>
+            </w:tcMar>
+          </w:tcPr>
+          <w:p>
+            <w:pPr>
+              <w:spacing w:after="0"/>
+            </w:pPr>
+            <w:r>
+              <w:rPr>
+                <w:sz w:val="18"/>
+                <w:szCs w:val="18"/>
+              </w:rPr>
+              <w:t xml:space="preserve">DCF</w:t>
+            </w:r>
+          </w:p>
+        </w:tc>
+        <w:tc>
+          <w:tcPr>
+            <w:tcW w:type="dxa" w:w="2891"/>
+            <w:tcBorders>
+              <w:top w:val="single" w:color="BFC9D9" w:sz="4"/>
+              <w:left w:val="single" w:color="BFC9D9" w:sz="4"/>
+              <w:bottom w:val="single" w:color="BFC9D9" w:sz="4"/>
+              <w:right w:val="single" w:color="BFC9D9" w:sz="4"/>
+            </w:tcBorders>
+            <w:shd w:fill="F2F5FA" w:color="auto" w:val="clear"/>
+            <w:tcMar>
+              <w:top w:type="dxa" w:w="60"/>
+              <w:left w:type="dxa" w:w="100"/>
+              <w:bottom w:type="dxa" w:w="60"/>
+              <w:right w:type="dxa" w:w="100"/>
+            </w:tcMar>
+          </w:tcPr>
+          <w:p>
+            <w:pPr>
+              <w:spacing w:after="0"/>
+            </w:pPr>
+            <w:r>
+              <w:rPr>
+                <w:sz w:val="18"/>
+                <w:szCs w:val="18"/>
+              </w:rPr>
+              <w:t xml:space="preserve">Discounted cash flow</w:t>
+            </w:r>
+          </w:p>
+        </w:tc>
+        <w:tc>
+          <w:tcPr>
+            <w:tcW w:type="dxa" w:w="5591"/>
+            <w:tcBorders>
+              <w:top w:val="single" w:color="BFC9D9" w:sz="4"/>
+              <w:left w:val="single" w:color="BFC9D9" w:sz="4"/>
+              <w:bottom w:val="single" w:color="BFC9D9" w:sz="4"/>
+              <w:right w:val="single" w:color="BFC9D9" w:sz="4"/>
+            </w:tcBorders>
+            <w:shd w:fill="F2F5FA" w:color="auto" w:val="clear"/>
+            <w:tcMar>
+              <w:top w:type="dxa" w:w="60"/>
+              <w:left w:type="dxa" w:w="100"/>
+              <w:bottom w:type="dxa" w:w="60"/>
+              <w:right w:type="dxa" w:w="100"/>
+            </w:tcMar>
+          </w:tcPr>
+          <w:p>
+            <w:pPr>
+              <w:spacing w:after="0"/>
+            </w:pPr>
+            <w:r>
+              <w:rPr>
+                <w:sz w:val="18"/>
+                <w:szCs w:val="18"/>
+              </w:rPr>
+              <w:t xml:space="preserve">Valuation that converts expected future free cash flows into today's dollars.</w:t>
+            </w:r>
+          </w:p>
+        </w:tc>
+      </w:tr>
+      <w:tr>
+        <w:trPr>
+          <w:cantSplit/>
+        </w:trPr>
+        <w:tc>
+          <w:tcPr>
+            <w:tcW w:type="dxa" w:w="1156"/>
+            <w:tcBorders>
+              <w:top w:val="single" w:color="BFC9D9" w:sz="4"/>
+              <w:left w:val="single" w:color="BFC9D9" w:sz="4"/>
+              <w:bottom w:val="single" w:color="BFC9D9" w:sz="4"/>
+              <w:right w:val="single" w:color="BFC9D9" w:sz="4"/>
+            </w:tcBorders>
+            <w:tcMar>
+              <w:top w:type="dxa" w:w="60"/>
+              <w:left w:type="dxa" w:w="100"/>
+              <w:bottom w:type="dxa" w:w="60"/>
+              <w:right w:type="dxa" w:w="100"/>
+            </w:tcMar>
+          </w:tcPr>
+          <w:p>
+            <w:pPr>
+              <w:spacing w:after="0"/>
+            </w:pPr>
+            <w:r>
+              <w:rPr>
+                <w:sz w:val="18"/>
+                <w:szCs w:val="18"/>
+              </w:rPr>
+              <w:t xml:space="preserve">DDM</w:t>
+            </w:r>
+          </w:p>
+        </w:tc>
+        <w:tc>
+          <w:tcPr>
+            <w:tcW w:type="dxa" w:w="2891"/>
+            <w:tcBorders>
+              <w:top w:val="single" w:color="BFC9D9" w:sz="4"/>
+              <w:left w:val="single" w:color="BFC9D9" w:sz="4"/>
+              <w:bottom w:val="single" w:color="BFC9D9" w:sz="4"/>
+              <w:right w:val="single" w:color="BFC9D9" w:sz="4"/>
+            </w:tcBorders>
+            <w:tcMar>
+              <w:top w:type="dxa" w:w="60"/>
+              <w:left w:type="dxa" w:w="100"/>
+              <w:bottom w:type="dxa" w:w="60"/>
+              <w:right w:type="dxa" w:w="100"/>
+            </w:tcMar>
+          </w:tcPr>
+          <w:p>
+            <w:pPr>
+              <w:spacing w:after="0"/>
+            </w:pPr>
+            <w:r>
+              <w:rPr>
+                <w:sz w:val="18"/>
+                <w:szCs w:val="18"/>
+              </w:rPr>
+              <w:t xml:space="preserve">Dividend discount model</w:t>
+            </w:r>
+          </w:p>
+        </w:tc>
+        <w:tc>
+          <w:tcPr>
+            <w:tcW w:type="dxa" w:w="5591"/>
+            <w:tcBorders>
+              <w:top w:val="single" w:color="BFC9D9" w:sz="4"/>
+              <w:left w:val="single" w:color="BFC9D9" w:sz="4"/>
+              <w:bottom w:val="single" w:color="BFC9D9" w:sz="4"/>
+              <w:right w:val="single" w:color="BFC9D9" w:sz="4"/>
+            </w:tcBorders>
+            <w:tcMar>
+              <w:top w:type="dxa" w:w="60"/>
+              <w:left w:type="dxa" w:w="100"/>
+              <w:bottom w:type="dxa" w:w="60"/>
+              <w:right w:type="dxa" w:w="100"/>
+            </w:tcMar>
+          </w:tcPr>
+          <w:p>
+            <w:pPr>
+              <w:spacing w:after="0"/>
+            </w:pPr>
+            <w:r>
+              <w:rPr>
+                <w:sz w:val="18"/>
+                <w:szCs w:val="18"/>
+              </w:rPr>
+              <w:t xml:space="preserve">Valuation that converts expected future dividends into today's dollars. Used for financials and property.</w:t>
+            </w:r>
+          </w:p>
+        </w:tc>
+      </w:tr>
+      <w:tr>
+        <w:trPr>
+          <w:cantSplit/>
+        </w:trPr>
+        <w:tc>
+          <w:tcPr>
+            <w:tcW w:type="dxa" w:w="1156"/>
+            <w:tcBorders>
+              <w:top w:val="single" w:color="BFC9D9" w:sz="4"/>
+              <w:left w:val="single" w:color="BFC9D9" w:sz="4"/>
+              <w:bottom w:val="single" w:color="BFC9D9" w:sz="4"/>
+              <w:right w:val="single" w:color="BFC9D9" w:sz="4"/>
+            </w:tcBorders>
+            <w:shd w:fill="F2F5FA" w:color="auto" w:val="clear"/>
+            <w:tcMar>
+              <w:top w:type="dxa" w:w="60"/>
+              <w:left w:type="dxa" w:w="100"/>
+              <w:bottom w:type="dxa" w:w="60"/>
+              <w:right w:type="dxa" w:w="100"/>
+            </w:tcMar>
+          </w:tcPr>
+          <w:p>
+            <w:pPr>
+              <w:spacing w:after="0"/>
+            </w:pPr>
+            <w:r>
+              <w:rPr>
+                <w:sz w:val="18"/>
+                <w:szCs w:val="18"/>
+              </w:rPr>
+              <w:t xml:space="preserve">DRP</w:t>
+            </w:r>
+          </w:p>
+        </w:tc>
+        <w:tc>
+          <w:tcPr>
+            <w:tcW w:type="dxa" w:w="2891"/>
+            <w:tcBorders>
+              <w:top w:val="single" w:color="BFC9D9" w:sz="4"/>
+              <w:left w:val="single" w:color="BFC9D9" w:sz="4"/>
+              <w:bottom w:val="single" w:color="BFC9D9" w:sz="4"/>
+              <w:right w:val="single" w:color="BFC9D9" w:sz="4"/>
+            </w:tcBorders>
+            <w:shd w:fill="F2F5FA" w:color="auto" w:val="clear"/>
+            <w:tcMar>
+              <w:top w:type="dxa" w:w="60"/>
+              <w:left w:type="dxa" w:w="100"/>
+              <w:bottom w:type="dxa" w:w="60"/>
+              <w:right w:type="dxa" w:w="100"/>
+            </w:tcMar>
+          </w:tcPr>
+          <w:p>
+            <w:pPr>
+              <w:spacing w:after="0"/>
+            </w:pPr>
+            <w:r>
+              <w:rPr>
+                <w:sz w:val="18"/>
+                <w:szCs w:val="18"/>
+              </w:rPr>
+              <w:t xml:space="preserve">Dividend reinvestment plan</w:t>
+            </w:r>
+          </w:p>
+        </w:tc>
+        <w:tc>
+          <w:tcPr>
+            <w:tcW w:type="dxa" w:w="5591"/>
+            <w:tcBorders>
+              <w:top w:val="single" w:color="BFC9D9" w:sz="4"/>
+              <w:left w:val="single" w:color="BFC9D9" w:sz="4"/>
+              <w:bottom w:val="single" w:color="BFC9D9" w:sz="4"/>
+              <w:right w:val="single" w:color="BFC9D9" w:sz="4"/>
+            </w:tcBorders>
+            <w:shd w:fill="F2F5FA" w:color="auto" w:val="clear"/>
+            <w:tcMar>
+              <w:top w:type="dxa" w:w="60"/>
+              <w:left w:type="dxa" w:w="100"/>
+              <w:bottom w:type="dxa" w:w="60"/>
+              <w:right w:type="dxa" w:w="100"/>
+            </w:tcMar>
+          </w:tcPr>
+          <w:p>
+            <w:pPr>
+              <w:spacing w:after="0"/>
+            </w:pPr>
+            <w:r>
+              <w:rPr>
+                <w:sz w:val="18"/>
+                <w:szCs w:val="18"/>
+              </w:rPr>
+              <w:t xml:space="preserve">Dividends paid as new shares instead of cash. Each reinvestment creates a new parcel.</w:t>
+            </w:r>
+          </w:p>
+        </w:tc>
+      </w:tr>
+      <w:tr>
+        <w:trPr>
+          <w:cantSplit/>
+        </w:trPr>
+        <w:tc>
+          <w:tcPr>
+            <w:tcW w:type="dxa" w:w="1156"/>
+            <w:tcBorders>
+              <w:top w:val="single" w:color="BFC9D9" w:sz="4"/>
+              <w:left w:val="single" w:color="BFC9D9" w:sz="4"/>
+              <w:bottom w:val="single" w:color="BFC9D9" w:sz="4"/>
+              <w:right w:val="single" w:color="BFC9D9" w:sz="4"/>
+            </w:tcBorders>
+            <w:tcMar>
+              <w:top w:type="dxa" w:w="60"/>
+              <w:left w:type="dxa" w:w="100"/>
+              <w:bottom w:type="dxa" w:w="60"/>
+              <w:right w:type="dxa" w:w="100"/>
+            </w:tcMar>
+          </w:tcPr>
+          <w:p>
+            <w:pPr>
+              <w:spacing w:after="0"/>
+            </w:pPr>
+            <w:r>
+              <w:rPr>
+                <w:sz w:val="18"/>
+                <w:szCs w:val="18"/>
+              </w:rPr>
+              <w:t xml:space="preserve">EBIT</w:t>
+            </w:r>
+          </w:p>
+        </w:tc>
+        <w:tc>
+          <w:tcPr>
+            <w:tcW w:type="dxa" w:w="2891"/>
+            <w:tcBorders>
+              <w:top w:val="single" w:color="BFC9D9" w:sz="4"/>
+              <w:left w:val="single" w:color="BFC9D9" w:sz="4"/>
+              <w:bottom w:val="single" w:color="BFC9D9" w:sz="4"/>
+              <w:right w:val="single" w:color="BFC9D9" w:sz="4"/>
+            </w:tcBorders>
+            <w:tcMar>
+              <w:top w:type="dxa" w:w="60"/>
+              <w:left w:type="dxa" w:w="100"/>
+              <w:bottom w:type="dxa" w:w="60"/>
+              <w:right w:type="dxa" w:w="100"/>
+            </w:tcMar>
+          </w:tcPr>
+          <w:p>
+            <w:pPr>
+              <w:spacing w:after="0"/>
+            </w:pPr>
+            <w:r>
+              <w:rPr>
+                <w:sz w:val="18"/>
+                <w:szCs w:val="18"/>
+              </w:rPr>
+              <w:t xml:space="preserve">Earnings before interest and tax</w:t>
+            </w:r>
+          </w:p>
+        </w:tc>
+        <w:tc>
+          <w:tcPr>
+            <w:tcW w:type="dxa" w:w="5591"/>
+            <w:tcBorders>
+              <w:top w:val="single" w:color="BFC9D9" w:sz="4"/>
+              <w:left w:val="single" w:color="BFC9D9" w:sz="4"/>
+              <w:bottom w:val="single" w:color="BFC9D9" w:sz="4"/>
+              <w:right w:val="single" w:color="BFC9D9" w:sz="4"/>
+            </w:tcBorders>
+            <w:tcMar>
+              <w:top w:type="dxa" w:w="60"/>
+              <w:left w:type="dxa" w:w="100"/>
+              <w:bottom w:type="dxa" w:w="60"/>
+              <w:right w:type="dxa" w:w="100"/>
+            </w:tcMar>
+          </w:tcPr>
+          <w:p>
+            <w:pPr>
+              <w:spacing w:after="0"/>
+            </w:pPr>
+            <w:r>
+              <w:rPr>
+                <w:sz w:val="18"/>
+                <w:szCs w:val="18"/>
+              </w:rPr>
+              <w:t xml:space="preserve">Operating profit before financing costs and tax.</w:t>
+            </w:r>
+          </w:p>
+        </w:tc>
+      </w:tr>
+      <w:tr>
+        <w:trPr>
+          <w:cantSplit/>
+        </w:trPr>
+        <w:tc>
+          <w:tcPr>
+            <w:tcW w:type="dxa" w:w="1156"/>
+            <w:tcBorders>
+              <w:top w:val="single" w:color="BFC9D9" w:sz="4"/>
+              <w:left w:val="single" w:color="BFC9D9" w:sz="4"/>
+              <w:bottom w:val="single" w:color="BFC9D9" w:sz="4"/>
+              <w:right w:val="single" w:color="BFC9D9" w:sz="4"/>
+            </w:tcBorders>
+            <w:shd w:fill="F2F5FA" w:color="auto" w:val="clear"/>
+            <w:tcMar>
+              <w:top w:type="dxa" w:w="60"/>
+              <w:left w:type="dxa" w:w="100"/>
+              <w:bottom w:type="dxa" w:w="60"/>
+              <w:right w:type="dxa" w:w="100"/>
+            </w:tcMar>
+          </w:tcPr>
+          <w:p>
+            <w:pPr>
+              <w:spacing w:after="0"/>
+            </w:pPr>
+            <w:r>
+              <w:rPr>
+                <w:sz w:val="18"/>
+                <w:szCs w:val="18"/>
+              </w:rPr>
+              <w:t xml:space="preserve">EPS</w:t>
+            </w:r>
+          </w:p>
+        </w:tc>
+        <w:tc>
+          <w:tcPr>
+            <w:tcW w:type="dxa" w:w="2891"/>
+            <w:tcBorders>
+              <w:top w:val="single" w:color="BFC9D9" w:sz="4"/>
+              <w:left w:val="single" w:color="BFC9D9" w:sz="4"/>
+              <w:bottom w:val="single" w:color="BFC9D9" w:sz="4"/>
+              <w:right w:val="single" w:color="BFC9D9" w:sz="4"/>
+            </w:tcBorders>
+            <w:shd w:fill="F2F5FA" w:color="auto" w:val="clear"/>
+            <w:tcMar>
+              <w:top w:type="dxa" w:w="60"/>
+              <w:left w:type="dxa" w:w="100"/>
+              <w:bottom w:type="dxa" w:w="60"/>
+              <w:right w:type="dxa" w:w="100"/>
+            </w:tcMar>
+          </w:tcPr>
+          <w:p>
+            <w:pPr>
+              <w:spacing w:after="0"/>
+            </w:pPr>
+            <w:r>
+              <w:rPr>
+                <w:sz w:val="18"/>
+                <w:szCs w:val="18"/>
+              </w:rPr>
+              <w:t xml:space="preserve">Earnings per share</w:t>
+            </w:r>
+          </w:p>
+        </w:tc>
+        <w:tc>
+          <w:tcPr>
+            <w:tcW w:type="dxa" w:w="5591"/>
+            <w:tcBorders>
+              <w:top w:val="single" w:color="BFC9D9" w:sz="4"/>
+              <w:left w:val="single" w:color="BFC9D9" w:sz="4"/>
+              <w:bottom w:val="single" w:color="BFC9D9" w:sz="4"/>
+              <w:right w:val="single" w:color="BFC9D9" w:sz="4"/>
+            </w:tcBorders>
+            <w:shd w:fill="F2F5FA" w:color="auto" w:val="clear"/>
+            <w:tcMar>
+              <w:top w:type="dxa" w:w="60"/>
+              <w:left w:type="dxa" w:w="100"/>
+              <w:bottom w:type="dxa" w:w="60"/>
+              <w:right w:type="dxa" w:w="100"/>
+            </w:tcMar>
+          </w:tcPr>
+          <w:p>
+            <w:pPr>
+              <w:spacing w:after="0"/>
+            </w:pPr>
+            <w:r>
+              <w:rPr>
+                <w:sz w:val="18"/>
+                <w:szCs w:val="18"/>
+              </w:rPr>
+              <w:t xml:space="preserve">Net profit after tax divided by shares on issue.</w:t>
+            </w:r>
+          </w:p>
+        </w:tc>
+      </w:tr>
+      <w:tr>
+        <w:trPr>
+          <w:cantSplit/>
+        </w:trPr>
+        <w:tc>
+          <w:tcPr>
+            <w:tcW w:type="dxa" w:w="1156"/>
+            <w:tcBorders>
+              <w:top w:val="single" w:color="BFC9D9" w:sz="4"/>
+              <w:left w:val="single" w:color="BFC9D9" w:sz="4"/>
+              <w:bottom w:val="single" w:color="BFC9D9" w:sz="4"/>
+              <w:right w:val="single" w:color="BFC9D9" w:sz="4"/>
+            </w:tcBorders>
+            <w:tcMar>
+              <w:top w:type="dxa" w:w="60"/>
+              <w:left w:type="dxa" w:w="100"/>
+              <w:bottom w:type="dxa" w:w="60"/>
+              <w:right w:type="dxa" w:w="100"/>
+            </w:tcMar>
+          </w:tcPr>
+          <w:p>
+            <w:pPr>
+              <w:spacing w:after="0"/>
+            </w:pPr>
+            <w:r>
+              <w:rPr>
+                <w:sz w:val="18"/>
+                <w:szCs w:val="18"/>
+              </w:rPr>
+              <w:t xml:space="preserve">EV</w:t>
+            </w:r>
+          </w:p>
+        </w:tc>
+        <w:tc>
+          <w:tcPr>
+            <w:tcW w:type="dxa" w:w="2891"/>
+            <w:tcBorders>
+              <w:top w:val="single" w:color="BFC9D9" w:sz="4"/>
+              <w:left w:val="single" w:color="BFC9D9" w:sz="4"/>
+              <w:bottom w:val="single" w:color="BFC9D9" w:sz="4"/>
+              <w:right w:val="single" w:color="BFC9D9" w:sz="4"/>
+            </w:tcBorders>
+            <w:tcMar>
+              <w:top w:type="dxa" w:w="60"/>
+              <w:left w:type="dxa" w:w="100"/>
+              <w:bottom w:type="dxa" w:w="60"/>
+              <w:right w:type="dxa" w:w="100"/>
+            </w:tcMar>
+          </w:tcPr>
+          <w:p>
+            <w:pPr>
+              <w:spacing w:after="0"/>
+            </w:pPr>
+            <w:r>
+              <w:rPr>
+                <w:sz w:val="18"/>
+                <w:szCs w:val="18"/>
+              </w:rPr>
+              <w:t xml:space="preserve">Enterprise value</w:t>
+            </w:r>
+          </w:p>
+        </w:tc>
+        <w:tc>
+          <w:tcPr>
+            <w:tcW w:type="dxa" w:w="5591"/>
+            <w:tcBorders>
+              <w:top w:val="single" w:color="BFC9D9" w:sz="4"/>
+              <w:left w:val="single" w:color="BFC9D9" w:sz="4"/>
+              <w:bottom w:val="single" w:color="BFC9D9" w:sz="4"/>
+              <w:right w:val="single" w:color="BFC9D9" w:sz="4"/>
+            </w:tcBorders>
+            <w:tcMar>
+              <w:top w:type="dxa" w:w="60"/>
+              <w:left w:type="dxa" w:w="100"/>
+              <w:bottom w:type="dxa" w:w="60"/>
+              <w:right w:type="dxa" w:w="100"/>
+            </w:tcMar>
+          </w:tcPr>
+          <w:p>
+            <w:pPr>
+              <w:spacing w:after="0"/>
+            </w:pPr>
+            <w:r>
+              <w:rPr>
+                <w:sz w:val="18"/>
+                <w:szCs w:val="18"/>
+              </w:rPr>
+              <w:t xml:space="preserve">Market capitalisation plus debt minus cash: the value of the whole business.</w:t>
+            </w:r>
+          </w:p>
+        </w:tc>
+      </w:tr>
+      <w:tr>
+        <w:trPr>
+          <w:cantSplit/>
+        </w:trPr>
+        <w:tc>
+          <w:tcPr>
+            <w:tcW w:type="dxa" w:w="1156"/>
+            <w:tcBorders>
+              <w:top w:val="single" w:color="BFC9D9" w:sz="4"/>
+              <w:left w:val="single" w:color="BFC9D9" w:sz="4"/>
+              <w:bottom w:val="single" w:color="BFC9D9" w:sz="4"/>
+              <w:right w:val="single" w:color="BFC9D9" w:sz="4"/>
+            </w:tcBorders>
+            <w:shd w:fill="F2F5FA" w:color="auto" w:val="clear"/>
+            <w:tcMar>
+              <w:top w:type="dxa" w:w="60"/>
+              <w:left w:type="dxa" w:w="100"/>
+              <w:bottom w:type="dxa" w:w="60"/>
+              <w:right w:type="dxa" w:w="100"/>
+            </w:tcMar>
+          </w:tcPr>
+          <w:p>
+            <w:pPr>
+              <w:spacing w:after="0"/>
+            </w:pPr>
+            <w:r>
+              <w:rPr>
+                <w:sz w:val="18"/>
+                <w:szCs w:val="18"/>
+              </w:rPr>
+              <w:t xml:space="preserve">FCF</w:t>
+            </w:r>
+          </w:p>
+        </w:tc>
+        <w:tc>
+          <w:tcPr>
+            <w:tcW w:type="dxa" w:w="2891"/>
+            <w:tcBorders>
+              <w:top w:val="single" w:color="BFC9D9" w:sz="4"/>
+              <w:left w:val="single" w:color="BFC9D9" w:sz="4"/>
+              <w:bottom w:val="single" w:color="BFC9D9" w:sz="4"/>
+              <w:right w:val="single" w:color="BFC9D9" w:sz="4"/>
+            </w:tcBorders>
+            <w:shd w:fill="F2F5FA" w:color="auto" w:val="clear"/>
+            <w:tcMar>
+              <w:top w:type="dxa" w:w="60"/>
+              <w:left w:type="dxa" w:w="100"/>
+              <w:bottom w:type="dxa" w:w="60"/>
+              <w:right w:type="dxa" w:w="100"/>
+            </w:tcMar>
+          </w:tcPr>
+          <w:p>
+            <w:pPr>
+              <w:spacing w:after="0"/>
+            </w:pPr>
+            <w:r>
+              <w:rPr>
+                <w:sz w:val="18"/>
+                <w:szCs w:val="18"/>
+              </w:rPr>
+              <w:t xml:space="preserve">Free cash flow</w:t>
+            </w:r>
+          </w:p>
+        </w:tc>
+        <w:tc>
+          <w:tcPr>
+            <w:tcW w:type="dxa" w:w="5591"/>
+            <w:tcBorders>
+              <w:top w:val="single" w:color="BFC9D9" w:sz="4"/>
+              <w:left w:val="single" w:color="BFC9D9" w:sz="4"/>
+              <w:bottom w:val="single" w:color="BFC9D9" w:sz="4"/>
+              <w:right w:val="single" w:color="BFC9D9" w:sz="4"/>
+            </w:tcBorders>
+            <w:shd w:fill="F2F5FA" w:color="auto" w:val="clear"/>
+            <w:tcMar>
+              <w:top w:type="dxa" w:w="60"/>
+              <w:left w:type="dxa" w:w="100"/>
+              <w:bottom w:type="dxa" w:w="60"/>
+              <w:right w:type="dxa" w:w="100"/>
+            </w:tcMar>
+          </w:tcPr>
+          <w:p>
+            <w:pPr>
+              <w:spacing w:after="0"/>
+            </w:pPr>
+            <w:r>
+              <w:rPr>
+                <w:sz w:val="18"/>
+                <w:szCs w:val="18"/>
+              </w:rPr>
+              <w:t xml:space="preserve">Operating cash flow less capital expenditure: the cash available to shareholders.</w:t>
+            </w:r>
+          </w:p>
+        </w:tc>
+      </w:tr>
+      <w:tr>
+        <w:trPr>
+          <w:cantSplit/>
+        </w:trPr>
+        <w:tc>
+          <w:tcPr>
+            <w:tcW w:type="dxa" w:w="1156"/>
+            <w:tcBorders>
+              <w:top w:val="single" w:color="BFC9D9" w:sz="4"/>
+              <w:left w:val="single" w:color="BFC9D9" w:sz="4"/>
+              <w:bottom w:val="single" w:color="BFC9D9" w:sz="4"/>
+              <w:right w:val="single" w:color="BFC9D9" w:sz="4"/>
+            </w:tcBorders>
+            <w:tcMar>
+              <w:top w:type="dxa" w:w="60"/>
+              <w:left w:type="dxa" w:w="100"/>
+              <w:bottom w:type="dxa" w:w="60"/>
+              <w:right w:type="dxa" w:w="100"/>
+            </w:tcMar>
+          </w:tcPr>
+          <w:p>
+            <w:pPr>
+              <w:spacing w:after="0"/>
+            </w:pPr>
+            <w:r>
+              <w:rPr>
+                <w:sz w:val="18"/>
+                <w:szCs w:val="18"/>
+              </w:rPr>
+              <w:t xml:space="preserve">FIFO</w:t>
+            </w:r>
+          </w:p>
+        </w:tc>
+        <w:tc>
+          <w:tcPr>
+            <w:tcW w:type="dxa" w:w="2891"/>
+            <w:tcBorders>
+              <w:top w:val="single" w:color="BFC9D9" w:sz="4"/>
+              <w:left w:val="single" w:color="BFC9D9" w:sz="4"/>
+              <w:bottom w:val="single" w:color="BFC9D9" w:sz="4"/>
+              <w:right w:val="single" w:color="BFC9D9" w:sz="4"/>
+            </w:tcBorders>
+            <w:tcMar>
+              <w:top w:type="dxa" w:w="60"/>
+              <w:left w:type="dxa" w:w="100"/>
+              <w:bottom w:type="dxa" w:w="60"/>
+              <w:right w:type="dxa" w:w="100"/>
+            </w:tcMar>
+          </w:tcPr>
+          <w:p>
+            <w:pPr>
+              <w:spacing w:after="0"/>
+            </w:pPr>
+            <w:r>
+              <w:rPr>
+                <w:sz w:val="18"/>
+                <w:szCs w:val="18"/>
+              </w:rPr>
+              <w:t xml:space="preserve">First in, first out</w:t>
+            </w:r>
+          </w:p>
+        </w:tc>
+        <w:tc>
+          <w:tcPr>
+            <w:tcW w:type="dxa" w:w="5591"/>
+            <w:tcBorders>
+              <w:top w:val="single" w:color="BFC9D9" w:sz="4"/>
+              <w:left w:val="single" w:color="BFC9D9" w:sz="4"/>
+              <w:bottom w:val="single" w:color="BFC9D9" w:sz="4"/>
+              <w:right w:val="single" w:color="BFC9D9" w:sz="4"/>
+            </w:tcBorders>
+            <w:tcMar>
+              <w:top w:type="dxa" w:w="60"/>
+              <w:left w:type="dxa" w:w="100"/>
+              <w:bottom w:type="dxa" w:w="60"/>
+              <w:right w:type="dxa" w:w="100"/>
+            </w:tcMar>
+          </w:tcPr>
+          <w:p>
+            <w:pPr>
+              <w:spacing w:after="0"/>
+            </w:pPr>
+            <w:r>
+              <w:rPr>
+                <w:sz w:val="18"/>
+                <w:szCs w:val="18"/>
+              </w:rPr>
+              <w:t xml:space="preserve">Sell order that disposes of the oldest parcel first.</w:t>
+            </w:r>
+          </w:p>
+        </w:tc>
+      </w:tr>
+      <w:tr>
+        <w:trPr>
+          <w:cantSplit/>
+        </w:trPr>
+        <w:tc>
+          <w:tcPr>
+            <w:tcW w:type="dxa" w:w="1156"/>
+            <w:tcBorders>
+              <w:top w:val="single" w:color="BFC9D9" w:sz="4"/>
+              <w:left w:val="single" w:color="BFC9D9" w:sz="4"/>
+              <w:bottom w:val="single" w:color="BFC9D9" w:sz="4"/>
+              <w:right w:val="single" w:color="BFC9D9" w:sz="4"/>
+            </w:tcBorders>
+            <w:shd w:fill="F2F5FA" w:color="auto" w:val="clear"/>
+            <w:tcMar>
+              <w:top w:type="dxa" w:w="60"/>
+              <w:left w:type="dxa" w:w="100"/>
+              <w:bottom w:type="dxa" w:w="60"/>
+              <w:right w:type="dxa" w:w="100"/>
+            </w:tcMar>
+          </w:tcPr>
+          <w:p>
+            <w:pPr>
+              <w:spacing w:after="0"/>
+            </w:pPr>
+            <w:r>
+              <w:rPr>
+                <w:sz w:val="18"/>
+                <w:szCs w:val="18"/>
+              </w:rPr>
+              <w:t xml:space="preserve">FY</w:t>
+            </w:r>
+          </w:p>
+        </w:tc>
+        <w:tc>
+          <w:tcPr>
+            <w:tcW w:type="dxa" w:w="2891"/>
+            <w:tcBorders>
+              <w:top w:val="single" w:color="BFC9D9" w:sz="4"/>
+              <w:left w:val="single" w:color="BFC9D9" w:sz="4"/>
+              <w:bottom w:val="single" w:color="BFC9D9" w:sz="4"/>
+              <w:right w:val="single" w:color="BFC9D9" w:sz="4"/>
+            </w:tcBorders>
+            <w:shd w:fill="F2F5FA" w:color="auto" w:val="clear"/>
+            <w:tcMar>
+              <w:top w:type="dxa" w:w="60"/>
+              <w:left w:type="dxa" w:w="100"/>
+              <w:bottom w:type="dxa" w:w="60"/>
+              <w:right w:type="dxa" w:w="100"/>
+            </w:tcMar>
+          </w:tcPr>
+          <w:p>
+            <w:pPr>
+              <w:spacing w:after="0"/>
+            </w:pPr>
+            <w:r>
+              <w:rPr>
+                <w:sz w:val="18"/>
+                <w:szCs w:val="18"/>
+              </w:rPr>
+              <w:t xml:space="preserve">Financial year</w:t>
+            </w:r>
+          </w:p>
+        </w:tc>
+        <w:tc>
+          <w:tcPr>
+            <w:tcW w:type="dxa" w:w="5591"/>
+            <w:tcBorders>
+              <w:top w:val="single" w:color="BFC9D9" w:sz="4"/>
+              <w:left w:val="single" w:color="BFC9D9" w:sz="4"/>
+              <w:bottom w:val="single" w:color="BFC9D9" w:sz="4"/>
+              <w:right w:val="single" w:color="BFC9D9" w:sz="4"/>
+            </w:tcBorders>
+            <w:shd w:fill="F2F5FA" w:color="auto" w:val="clear"/>
+            <w:tcMar>
+              <w:top w:type="dxa" w:w="60"/>
+              <w:left w:type="dxa" w:w="100"/>
+              <w:bottom w:type="dxa" w:w="60"/>
+              <w:right w:type="dxa" w:w="100"/>
+            </w:tcMar>
+          </w:tcPr>
+          <w:p>
+            <w:pPr>
+              <w:spacing w:after="0"/>
+            </w:pPr>
+            <w:r>
+              <w:rPr>
+                <w:sz w:val="18"/>
+                <w:szCs w:val="18"/>
+              </w:rPr>
+              <w:t xml:space="preserve">A company's annual reporting period. For tax purposes, 1 July to 30 June.</w:t>
+            </w:r>
+          </w:p>
+        </w:tc>
+      </w:tr>
+      <w:tr>
+        <w:trPr>
+          <w:cantSplit/>
+        </w:trPr>
+        <w:tc>
+          <w:tcPr>
+            <w:tcW w:type="dxa" w:w="1156"/>
+            <w:tcBorders>
+              <w:top w:val="single" w:color="BFC9D9" w:sz="4"/>
+              <w:left w:val="single" w:color="BFC9D9" w:sz="4"/>
+              <w:bottom w:val="single" w:color="BFC9D9" w:sz="4"/>
+              <w:right w:val="single" w:color="BFC9D9" w:sz="4"/>
+            </w:tcBorders>
+            <w:tcMar>
+              <w:top w:type="dxa" w:w="60"/>
+              <w:left w:type="dxa" w:w="100"/>
+              <w:bottom w:type="dxa" w:w="60"/>
+              <w:right w:type="dxa" w:w="100"/>
+            </w:tcMar>
+          </w:tcPr>
+          <w:p>
+            <w:pPr>
+              <w:spacing w:after="0"/>
+            </w:pPr>
+            <w:r>
+              <w:rPr>
+                <w:sz w:val="18"/>
+                <w:szCs w:val="18"/>
+              </w:rPr>
+              <w:t xml:space="preserve">LIC</w:t>
+            </w:r>
+          </w:p>
+        </w:tc>
+        <w:tc>
+          <w:tcPr>
+            <w:tcW w:type="dxa" w:w="2891"/>
+            <w:tcBorders>
+              <w:top w:val="single" w:color="BFC9D9" w:sz="4"/>
+              <w:left w:val="single" w:color="BFC9D9" w:sz="4"/>
+              <w:bottom w:val="single" w:color="BFC9D9" w:sz="4"/>
+              <w:right w:val="single" w:color="BFC9D9" w:sz="4"/>
+            </w:tcBorders>
+            <w:tcMar>
+              <w:top w:type="dxa" w:w="60"/>
+              <w:left w:type="dxa" w:w="100"/>
+              <w:bottom w:type="dxa" w:w="60"/>
+              <w:right w:type="dxa" w:w="100"/>
+            </w:tcMar>
+          </w:tcPr>
+          <w:p>
+            <w:pPr>
+              <w:spacing w:after="0"/>
+            </w:pPr>
+            <w:r>
+              <w:rPr>
+                <w:sz w:val="18"/>
+                <w:szCs w:val="18"/>
+              </w:rPr>
+              <w:t xml:space="preserve">Listed investment company</w:t>
+            </w:r>
+          </w:p>
+        </w:tc>
+        <w:tc>
+          <w:tcPr>
+            <w:tcW w:type="dxa" w:w="5591"/>
+            <w:tcBorders>
+              <w:top w:val="single" w:color="BFC9D9" w:sz="4"/>
+              <w:left w:val="single" w:color="BFC9D9" w:sz="4"/>
+              <w:bottom w:val="single" w:color="BFC9D9" w:sz="4"/>
+              <w:right w:val="single" w:color="BFC9D9" w:sz="4"/>
+            </w:tcBorders>
+            <w:tcMar>
+              <w:top w:type="dxa" w:w="60"/>
+              <w:left w:type="dxa" w:w="100"/>
+              <w:bottom w:type="dxa" w:w="60"/>
+              <w:right w:type="dxa" w:w="100"/>
+            </w:tcMar>
+          </w:tcPr>
+          <w:p>
+            <w:pPr>
+              <w:spacing w:after="0"/>
+            </w:pPr>
+            <w:r>
+              <w:rPr>
+                <w:sz w:val="18"/>
+                <w:szCs w:val="18"/>
+              </w:rPr>
+              <w:t xml:space="preserve">An ASX-listed company whose business is investing in other shares.</w:t>
+            </w:r>
+          </w:p>
+        </w:tc>
+      </w:tr>
+      <w:tr>
+        <w:trPr>
+          <w:cantSplit/>
+        </w:trPr>
+        <w:tc>
+          <w:tcPr>
+            <w:tcW w:type="dxa" w:w="1156"/>
+            <w:tcBorders>
+              <w:top w:val="single" w:color="BFC9D9" w:sz="4"/>
+              <w:left w:val="single" w:color="BFC9D9" w:sz="4"/>
+              <w:bottom w:val="single" w:color="BFC9D9" w:sz="4"/>
+              <w:right w:val="single" w:color="BFC9D9" w:sz="4"/>
+            </w:tcBorders>
+            <w:shd w:fill="F2F5FA" w:color="auto" w:val="clear"/>
+            <w:tcMar>
+              <w:top w:type="dxa" w:w="60"/>
+              <w:left w:type="dxa" w:w="100"/>
+              <w:bottom w:type="dxa" w:w="60"/>
+              <w:right w:type="dxa" w:w="100"/>
+            </w:tcMar>
+          </w:tcPr>
+          <w:p>
+            <w:pPr>
+              <w:spacing w:after="0"/>
+            </w:pPr>
+            <w:r>
+              <w:rPr>
+                <w:sz w:val="18"/>
+                <w:szCs w:val="18"/>
+              </w:rPr>
+              <w:t xml:space="preserve">N</w:t>
+            </w:r>
+          </w:p>
+        </w:tc>
+        <w:tc>
+          <w:tcPr>
+            <w:tcW w:type="dxa" w:w="2891"/>
+            <w:tcBorders>
+              <w:top w:val="single" w:color="BFC9D9" w:sz="4"/>
+              <w:left w:val="single" w:color="BFC9D9" w:sz="4"/>
+              <w:bottom w:val="single" w:color="BFC9D9" w:sz="4"/>
+              <w:right w:val="single" w:color="BFC9D9" w:sz="4"/>
+            </w:tcBorders>
+            <w:shd w:fill="F2F5FA" w:color="auto" w:val="clear"/>
+            <w:tcMar>
+              <w:top w:type="dxa" w:w="60"/>
+              <w:left w:type="dxa" w:w="100"/>
+              <w:bottom w:type="dxa" w:w="60"/>
+              <w:right w:type="dxa" w:w="100"/>
+            </w:tcMar>
+          </w:tcPr>
+          <w:p>
+            <w:pPr>
+              <w:spacing w:after="0"/>
+            </w:pPr>
+            <w:r>
+              <w:rPr>
+                <w:sz w:val="18"/>
+                <w:szCs w:val="18"/>
+              </w:rPr>
+              <w:t xml:space="preserve">No</w:t>
+            </w:r>
+          </w:p>
+        </w:tc>
+        <w:tc>
+          <w:tcPr>
+            <w:tcW w:type="dxa" w:w="5591"/>
+            <w:tcBorders>
+              <w:top w:val="single" w:color="BFC9D9" w:sz="4"/>
+              <w:left w:val="single" w:color="BFC9D9" w:sz="4"/>
+              <w:bottom w:val="single" w:color="BFC9D9" w:sz="4"/>
+              <w:right w:val="single" w:color="BFC9D9" w:sz="4"/>
+            </w:tcBorders>
+            <w:shd w:fill="F2F5FA" w:color="auto" w:val="clear"/>
+            <w:tcMar>
+              <w:top w:type="dxa" w:w="60"/>
+              <w:left w:type="dxa" w:w="100"/>
+              <w:bottom w:type="dxa" w:w="60"/>
+              <w:right w:type="dxa" w:w="100"/>
+            </w:tcMar>
+          </w:tcPr>
+          <w:p>
+            <w:pPr>
+              <w:spacing w:after="0"/>
+            </w:pPr>
+            <w:r>
+              <w:rPr>
+                <w:sz w:val="18"/>
+                <w:szCs w:val="18"/>
+              </w:rPr>
+              <w:t xml:space="preserve">The company fails the test.</w:t>
+            </w:r>
+          </w:p>
+        </w:tc>
+      </w:tr>
+      <w:tr>
+        <w:trPr>
+          <w:cantSplit/>
+        </w:trPr>
+        <w:tc>
+          <w:tcPr>
+            <w:tcW w:type="dxa" w:w="1156"/>
+            <w:tcBorders>
+              <w:top w:val="single" w:color="BFC9D9" w:sz="4"/>
+              <w:left w:val="single" w:color="BFC9D9" w:sz="4"/>
+              <w:bottom w:val="single" w:color="BFC9D9" w:sz="4"/>
+              <w:right w:val="single" w:color="BFC9D9" w:sz="4"/>
+            </w:tcBorders>
+            <w:tcMar>
+              <w:top w:type="dxa" w:w="60"/>
+              <w:left w:type="dxa" w:w="100"/>
+              <w:bottom w:type="dxa" w:w="60"/>
+              <w:right w:type="dxa" w:w="100"/>
+            </w:tcMar>
+          </w:tcPr>
+          <w:p>
+            <w:pPr>
+              <w:spacing w:after="0"/>
+            </w:pPr>
+            <w:r>
+              <w:rPr>
+                <w:sz w:val="18"/>
+                <w:szCs w:val="18"/>
+              </w:rPr>
+              <w:t xml:space="preserve">P/B</w:t>
+            </w:r>
+          </w:p>
+        </w:tc>
+        <w:tc>
+          <w:tcPr>
+            <w:tcW w:type="dxa" w:w="2891"/>
+            <w:tcBorders>
+              <w:top w:val="single" w:color="BFC9D9" w:sz="4"/>
+              <w:left w:val="single" w:color="BFC9D9" w:sz="4"/>
+              <w:bottom w:val="single" w:color="BFC9D9" w:sz="4"/>
+              <w:right w:val="single" w:color="BFC9D9" w:sz="4"/>
+            </w:tcBorders>
+            <w:tcMar>
+              <w:top w:type="dxa" w:w="60"/>
+              <w:left w:type="dxa" w:w="100"/>
+              <w:bottom w:type="dxa" w:w="60"/>
+              <w:right w:type="dxa" w:w="100"/>
+            </w:tcMar>
+          </w:tcPr>
+          <w:p>
+            <w:pPr>
+              <w:spacing w:after="0"/>
+            </w:pPr>
+            <w:r>
+              <w:rPr>
+                <w:sz w:val="18"/>
+                <w:szCs w:val="18"/>
+              </w:rPr>
+              <w:t xml:space="preserve">Price-to-book ratio</w:t>
+            </w:r>
+          </w:p>
+        </w:tc>
+        <w:tc>
+          <w:tcPr>
+            <w:tcW w:type="dxa" w:w="5591"/>
+            <w:tcBorders>
+              <w:top w:val="single" w:color="BFC9D9" w:sz="4"/>
+              <w:left w:val="single" w:color="BFC9D9" w:sz="4"/>
+              <w:bottom w:val="single" w:color="BFC9D9" w:sz="4"/>
+              <w:right w:val="single" w:color="BFC9D9" w:sz="4"/>
+            </w:tcBorders>
+            <w:tcMar>
+              <w:top w:type="dxa" w:w="60"/>
+              <w:left w:type="dxa" w:w="100"/>
+              <w:bottom w:type="dxa" w:w="60"/>
+              <w:right w:type="dxa" w:w="100"/>
+            </w:tcMar>
+          </w:tcPr>
+          <w:p>
+            <w:pPr>
+              <w:spacing w:after="0"/>
+            </w:pPr>
+            <w:r>
+              <w:rPr>
+                <w:sz w:val="18"/>
+                <w:szCs w:val="18"/>
+              </w:rPr>
+              <w:t xml:space="preserve">Share price divided by book value per share.</w:t>
+            </w:r>
+          </w:p>
+        </w:tc>
+      </w:tr>
+      <w:tr>
+        <w:trPr>
+          <w:cantSplit/>
+        </w:trPr>
+        <w:tc>
+          <w:tcPr>
+            <w:tcW w:type="dxa" w:w="1156"/>
+            <w:tcBorders>
+              <w:top w:val="single" w:color="BFC9D9" w:sz="4"/>
+              <w:left w:val="single" w:color="BFC9D9" w:sz="4"/>
+              <w:bottom w:val="single" w:color="BFC9D9" w:sz="4"/>
+              <w:right w:val="single" w:color="BFC9D9" w:sz="4"/>
+            </w:tcBorders>
+            <w:shd w:fill="F2F5FA" w:color="auto" w:val="clear"/>
+            <w:tcMar>
+              <w:top w:type="dxa" w:w="60"/>
+              <w:left w:type="dxa" w:w="100"/>
+              <w:bottom w:type="dxa" w:w="60"/>
+              <w:right w:type="dxa" w:w="100"/>
+            </w:tcMar>
+          </w:tcPr>
+          <w:p>
+            <w:pPr>
+              <w:spacing w:after="0"/>
+            </w:pPr>
+            <w:r>
+              <w:rPr>
+                <w:sz w:val="18"/>
+                <w:szCs w:val="18"/>
+              </w:rPr>
+              <w:t xml:space="preserve">P/E</w:t>
+            </w:r>
+          </w:p>
+        </w:tc>
+        <w:tc>
+          <w:tcPr>
+            <w:tcW w:type="dxa" w:w="2891"/>
+            <w:tcBorders>
+              <w:top w:val="single" w:color="BFC9D9" w:sz="4"/>
+              <w:left w:val="single" w:color="BFC9D9" w:sz="4"/>
+              <w:bottom w:val="single" w:color="BFC9D9" w:sz="4"/>
+              <w:right w:val="single" w:color="BFC9D9" w:sz="4"/>
+            </w:tcBorders>
+            <w:shd w:fill="F2F5FA" w:color="auto" w:val="clear"/>
+            <w:tcMar>
+              <w:top w:type="dxa" w:w="60"/>
+              <w:left w:type="dxa" w:w="100"/>
+              <w:bottom w:type="dxa" w:w="60"/>
+              <w:right w:type="dxa" w:w="100"/>
+            </w:tcMar>
+          </w:tcPr>
+          <w:p>
+            <w:pPr>
+              <w:spacing w:after="0"/>
+            </w:pPr>
+            <w:r>
+              <w:rPr>
+                <w:sz w:val="18"/>
+                <w:szCs w:val="18"/>
+              </w:rPr>
+              <w:t xml:space="preserve">Price-to-earnings ratio</w:t>
+            </w:r>
+          </w:p>
+        </w:tc>
+        <w:tc>
+          <w:tcPr>
+            <w:tcW w:type="dxa" w:w="5591"/>
+            <w:tcBorders>
+              <w:top w:val="single" w:color="BFC9D9" w:sz="4"/>
+              <w:left w:val="single" w:color="BFC9D9" w:sz="4"/>
+              <w:bottom w:val="single" w:color="BFC9D9" w:sz="4"/>
+              <w:right w:val="single" w:color="BFC9D9" w:sz="4"/>
+            </w:tcBorders>
+            <w:shd w:fill="F2F5FA" w:color="auto" w:val="clear"/>
+            <w:tcMar>
+              <w:top w:type="dxa" w:w="60"/>
+              <w:left w:type="dxa" w:w="100"/>
+              <w:bottom w:type="dxa" w:w="60"/>
+              <w:right w:type="dxa" w:w="100"/>
+            </w:tcMar>
+          </w:tcPr>
+          <w:p>
+            <w:pPr>
+              <w:spacing w:after="0"/>
+            </w:pPr>
+            <w:r>
+              <w:rPr>
+                <w:sz w:val="18"/>
+                <w:szCs w:val="18"/>
+              </w:rPr>
+              <w:t xml:space="preserve">Share price divided by EPS.</w:t>
+            </w:r>
+          </w:p>
+        </w:tc>
+      </w:tr>
+      <w:tr>
+        <w:trPr>
+          <w:cantSplit/>
+        </w:trPr>
+        <w:tc>
+          <w:tcPr>
+            <w:tcW w:type="dxa" w:w="1156"/>
+            <w:tcBorders>
+              <w:top w:val="single" w:color="BFC9D9" w:sz="4"/>
+              <w:left w:val="single" w:color="BFC9D9" w:sz="4"/>
+              <w:bottom w:val="single" w:color="BFC9D9" w:sz="4"/>
+              <w:right w:val="single" w:color="BFC9D9" w:sz="4"/>
+            </w:tcBorders>
+            <w:tcMar>
+              <w:top w:type="dxa" w:w="60"/>
+              <w:left w:type="dxa" w:w="100"/>
+              <w:bottom w:type="dxa" w:w="60"/>
+              <w:right w:type="dxa" w:w="100"/>
+            </w:tcMar>
+          </w:tcPr>
+          <w:p>
+            <w:pPr>
+              <w:spacing w:after="0"/>
+            </w:pPr>
+            <w:r>
+              <w:rPr>
+                <w:sz w:val="18"/>
+                <w:szCs w:val="18"/>
+              </w:rPr>
+              <w:t xml:space="preserve">REIT</w:t>
+            </w:r>
+          </w:p>
+        </w:tc>
+        <w:tc>
+          <w:tcPr>
+            <w:tcW w:type="dxa" w:w="2891"/>
+            <w:tcBorders>
+              <w:top w:val="single" w:color="BFC9D9" w:sz="4"/>
+              <w:left w:val="single" w:color="BFC9D9" w:sz="4"/>
+              <w:bottom w:val="single" w:color="BFC9D9" w:sz="4"/>
+              <w:right w:val="single" w:color="BFC9D9" w:sz="4"/>
+            </w:tcBorders>
+            <w:tcMar>
+              <w:top w:type="dxa" w:w="60"/>
+              <w:left w:type="dxa" w:w="100"/>
+              <w:bottom w:type="dxa" w:w="60"/>
+              <w:right w:type="dxa" w:w="100"/>
+            </w:tcMar>
+          </w:tcPr>
+          <w:p>
+            <w:pPr>
+              <w:spacing w:after="0"/>
+            </w:pPr>
+            <w:r>
+              <w:rPr>
+                <w:sz w:val="18"/>
+                <w:szCs w:val="18"/>
+              </w:rPr>
+              <w:t xml:space="preserve">Real estate investment trust</w:t>
+            </w:r>
+          </w:p>
+        </w:tc>
+        <w:tc>
+          <w:tcPr>
+            <w:tcW w:type="dxa" w:w="5591"/>
+            <w:tcBorders>
+              <w:top w:val="single" w:color="BFC9D9" w:sz="4"/>
+              <w:left w:val="single" w:color="BFC9D9" w:sz="4"/>
+              <w:bottom w:val="single" w:color="BFC9D9" w:sz="4"/>
+              <w:right w:val="single" w:color="BFC9D9" w:sz="4"/>
+            </w:tcBorders>
+            <w:tcMar>
+              <w:top w:type="dxa" w:w="60"/>
+              <w:left w:type="dxa" w:w="100"/>
+              <w:bottom w:type="dxa" w:w="60"/>
+              <w:right w:type="dxa" w:w="100"/>
+            </w:tcMar>
+          </w:tcPr>
+          <w:p>
+            <w:pPr>
+              <w:spacing w:after="0"/>
+            </w:pPr>
+            <w:r>
+              <w:rPr>
+                <w:sz w:val="18"/>
+                <w:szCs w:val="18"/>
+              </w:rPr>
+              <w:t xml:space="preserve">A listed trust that owns income-producing property.</w:t>
+            </w:r>
+          </w:p>
+        </w:tc>
+      </w:tr>
+      <w:tr>
+        <w:trPr>
+          <w:cantSplit/>
+        </w:trPr>
+        <w:tc>
+          <w:tcPr>
+            <w:tcW w:type="dxa" w:w="1156"/>
+            <w:tcBorders>
+              <w:top w:val="single" w:color="BFC9D9" w:sz="4"/>
+              <w:left w:val="single" w:color="BFC9D9" w:sz="4"/>
+              <w:bottom w:val="single" w:color="BFC9D9" w:sz="4"/>
+              <w:right w:val="single" w:color="BFC9D9" w:sz="4"/>
+            </w:tcBorders>
+            <w:shd w:fill="F2F5FA" w:color="auto" w:val="clear"/>
+            <w:tcMar>
+              <w:top w:type="dxa" w:w="60"/>
+              <w:left w:type="dxa" w:w="100"/>
+              <w:bottom w:type="dxa" w:w="60"/>
+              <w:right w:type="dxa" w:w="100"/>
+            </w:tcMar>
+          </w:tcPr>
+          <w:p>
+            <w:pPr>
+              <w:spacing w:after="0"/>
+            </w:pPr>
+            <w:r>
+              <w:rPr>
+                <w:sz w:val="18"/>
+                <w:szCs w:val="18"/>
+              </w:rPr>
+              <w:t xml:space="preserve">ROE</w:t>
+            </w:r>
+          </w:p>
+        </w:tc>
+        <w:tc>
+          <w:tcPr>
+            <w:tcW w:type="dxa" w:w="2891"/>
+            <w:tcBorders>
+              <w:top w:val="single" w:color="BFC9D9" w:sz="4"/>
+              <w:left w:val="single" w:color="BFC9D9" w:sz="4"/>
+              <w:bottom w:val="single" w:color="BFC9D9" w:sz="4"/>
+              <w:right w:val="single" w:color="BFC9D9" w:sz="4"/>
+            </w:tcBorders>
+            <w:shd w:fill="F2F5FA" w:color="auto" w:val="clear"/>
+            <w:tcMar>
+              <w:top w:type="dxa" w:w="60"/>
+              <w:left w:type="dxa" w:w="100"/>
+              <w:bottom w:type="dxa" w:w="60"/>
+              <w:right w:type="dxa" w:w="100"/>
+            </w:tcMar>
+          </w:tcPr>
+          <w:p>
+            <w:pPr>
+              <w:spacing w:after="0"/>
+            </w:pPr>
+            <w:r>
+              <w:rPr>
+                <w:sz w:val="18"/>
+                <w:szCs w:val="18"/>
+              </w:rPr>
+              <w:t xml:space="preserve">Return on equity</w:t>
+            </w:r>
+          </w:p>
+        </w:tc>
+        <w:tc>
+          <w:tcPr>
+            <w:tcW w:type="dxa" w:w="5591"/>
+            <w:tcBorders>
+              <w:top w:val="single" w:color="BFC9D9" w:sz="4"/>
+              <w:left w:val="single" w:color="BFC9D9" w:sz="4"/>
+              <w:bottom w:val="single" w:color="BFC9D9" w:sz="4"/>
+              <w:right w:val="single" w:color="BFC9D9" w:sz="4"/>
+            </w:tcBorders>
+            <w:shd w:fill="F2F5FA" w:color="auto" w:val="clear"/>
+            <w:tcMar>
+              <w:top w:type="dxa" w:w="60"/>
+              <w:left w:type="dxa" w:w="100"/>
+              <w:bottom w:type="dxa" w:w="60"/>
+              <w:right w:type="dxa" w:w="100"/>
+            </w:tcMar>
+          </w:tcPr>
+          <w:p>
+            <w:pPr>
+              <w:spacing w:after="0"/>
+            </w:pPr>
+            <w:r>
+              <w:rPr>
+                <w:sz w:val="18"/>
+                <w:szCs w:val="18"/>
+              </w:rPr>
+              <w:t xml:space="preserve">Net profit as a percentage of shareholders' equity.</w:t>
+            </w:r>
+          </w:p>
+        </w:tc>
+      </w:tr>
+      <w:tr>
+        <w:trPr>
+          <w:cantSplit/>
+        </w:trPr>
+        <w:tc>
+          <w:tcPr>
+            <w:tcW w:type="dxa" w:w="1156"/>
+            <w:tcBorders>
+              <w:top w:val="single" w:color="BFC9D9" w:sz="4"/>
+              <w:left w:val="single" w:color="BFC9D9" w:sz="4"/>
+              <w:bottom w:val="single" w:color="BFC9D9" w:sz="4"/>
+              <w:right w:val="single" w:color="BFC9D9" w:sz="4"/>
+            </w:tcBorders>
+            <w:tcMar>
+              <w:top w:type="dxa" w:w="60"/>
+              <w:left w:type="dxa" w:w="100"/>
+              <w:bottom w:type="dxa" w:w="60"/>
+              <w:right w:type="dxa" w:w="100"/>
+            </w:tcMar>
+          </w:tcPr>
+          <w:p>
+            <w:pPr>
+              <w:spacing w:after="0"/>
+            </w:pPr>
+            <w:r>
+              <w:rPr>
+                <w:sz w:val="18"/>
+                <w:szCs w:val="18"/>
+              </w:rPr>
+              <w:t xml:space="preserve">ROIC</w:t>
+            </w:r>
+          </w:p>
+        </w:tc>
+        <w:tc>
+          <w:tcPr>
+            <w:tcW w:type="dxa" w:w="2891"/>
+            <w:tcBorders>
+              <w:top w:val="single" w:color="BFC9D9" w:sz="4"/>
+              <w:left w:val="single" w:color="BFC9D9" w:sz="4"/>
+              <w:bottom w:val="single" w:color="BFC9D9" w:sz="4"/>
+              <w:right w:val="single" w:color="BFC9D9" w:sz="4"/>
+            </w:tcBorders>
+            <w:tcMar>
+              <w:top w:type="dxa" w:w="60"/>
+              <w:left w:type="dxa" w:w="100"/>
+              <w:bottom w:type="dxa" w:w="60"/>
+              <w:right w:type="dxa" w:w="100"/>
+            </w:tcMar>
+          </w:tcPr>
+          <w:p>
+            <w:pPr>
+              <w:spacing w:after="0"/>
+            </w:pPr>
+            <w:r>
+              <w:rPr>
+                <w:sz w:val="18"/>
+                <w:szCs w:val="18"/>
+              </w:rPr>
+              <w:t xml:space="preserve">Return on invested capital</w:t>
+            </w:r>
+          </w:p>
+        </w:tc>
+        <w:tc>
+          <w:tcPr>
+            <w:tcW w:type="dxa" w:w="5591"/>
+            <w:tcBorders>
+              <w:top w:val="single" w:color="BFC9D9" w:sz="4"/>
+              <w:left w:val="single" w:color="BFC9D9" w:sz="4"/>
+              <w:bottom w:val="single" w:color="BFC9D9" w:sz="4"/>
+              <w:right w:val="single" w:color="BFC9D9" w:sz="4"/>
+            </w:tcBorders>
+            <w:tcMar>
+              <w:top w:type="dxa" w:w="60"/>
+              <w:left w:type="dxa" w:w="100"/>
+              <w:bottom w:type="dxa" w:w="60"/>
+              <w:right w:type="dxa" w:w="100"/>
+            </w:tcMar>
+          </w:tcPr>
+          <w:p>
+            <w:pPr>
+              <w:spacing w:after="0"/>
+            </w:pPr>
+            <w:r>
+              <w:rPr>
+                <w:sz w:val="18"/>
+                <w:szCs w:val="18"/>
+              </w:rPr>
+              <w:t xml:space="preserve">Net profit as a percentage of debt plus equity, less cash.</w:t>
+            </w:r>
+          </w:p>
+        </w:tc>
+      </w:tr>
+      <w:tr>
+        <w:trPr>
+          <w:cantSplit/>
+        </w:trPr>
+        <w:tc>
+          <w:tcPr>
+            <w:tcW w:type="dxa" w:w="1156"/>
+            <w:tcBorders>
+              <w:top w:val="single" w:color="BFC9D9" w:sz="4"/>
+              <w:left w:val="single" w:color="BFC9D9" w:sz="4"/>
+              <w:bottom w:val="single" w:color="BFC9D9" w:sz="4"/>
+              <w:right w:val="single" w:color="BFC9D9" w:sz="4"/>
+            </w:tcBorders>
+            <w:shd w:fill="F2F5FA" w:color="auto" w:val="clear"/>
+            <w:tcMar>
+              <w:top w:type="dxa" w:w="60"/>
+              <w:left w:type="dxa" w:w="100"/>
+              <w:bottom w:type="dxa" w:w="60"/>
+              <w:right w:type="dxa" w:w="100"/>
+            </w:tcMar>
+          </w:tcPr>
+          <w:p>
+            <w:pPr>
+              <w:spacing w:after="0"/>
+            </w:pPr>
+            <w:r>
+              <w:rPr>
+                <w:sz w:val="18"/>
+                <w:szCs w:val="18"/>
+              </w:rPr>
+              <w:t xml:space="preserve">Y</w:t>
+            </w:r>
+          </w:p>
+        </w:tc>
+        <w:tc>
+          <w:tcPr>
+            <w:tcW w:type="dxa" w:w="2891"/>
+            <w:tcBorders>
+              <w:top w:val="single" w:color="BFC9D9" w:sz="4"/>
+              <w:left w:val="single" w:color="BFC9D9" w:sz="4"/>
+              <w:bottom w:val="single" w:color="BFC9D9" w:sz="4"/>
+              <w:right w:val="single" w:color="BFC9D9" w:sz="4"/>
+            </w:tcBorders>
+            <w:shd w:fill="F2F5FA" w:color="auto" w:val="clear"/>
+            <w:tcMar>
+              <w:top w:type="dxa" w:w="60"/>
+              <w:left w:type="dxa" w:w="100"/>
+              <w:bottom w:type="dxa" w:w="60"/>
+              <w:right w:type="dxa" w:w="100"/>
+            </w:tcMar>
+          </w:tcPr>
+          <w:p>
+            <w:pPr>
+              <w:spacing w:after="0"/>
+            </w:pPr>
+            <w:r>
+              <w:rPr>
+                <w:sz w:val="18"/>
+                <w:szCs w:val="18"/>
+              </w:rPr>
+              <w:t xml:space="preserve">Yes</w:t>
+            </w:r>
+          </w:p>
+        </w:tc>
+        <w:tc>
+          <w:tcPr>
+            <w:tcW w:type="dxa" w:w="5591"/>
+            <w:tcBorders>
+              <w:top w:val="single" w:color="BFC9D9" w:sz="4"/>
+              <w:left w:val="single" w:color="BFC9D9" w:sz="4"/>
+              <w:bottom w:val="single" w:color="BFC9D9" w:sz="4"/>
+              <w:right w:val="single" w:color="BFC9D9" w:sz="4"/>
+            </w:tcBorders>
+            <w:shd w:fill="F2F5FA" w:color="auto" w:val="clear"/>
+            <w:tcMar>
+              <w:top w:type="dxa" w:w="60"/>
+              <w:left w:type="dxa" w:w="100"/>
+              <w:bottom w:type="dxa" w:w="60"/>
+              <w:right w:type="dxa" w:w="100"/>
+            </w:tcMar>
+          </w:tcPr>
+          <w:p>
+            <w:pPr>
+              <w:spacing w:after="0"/>
+            </w:pPr>
+            <w:r>
+              <w:rPr>
+                <w:sz w:val="18"/>
+                <w:szCs w:val="18"/>
+              </w:rPr>
+              <w:t xml:space="preserve">The company passes the test.</w:t>
+            </w:r>
+          </w:p>
+        </w:tc>
+      </w:tr>
+    </w:tbl>
+    <w:p>
+      <w:pPr>
+        <w:spacing w:after="120"/>
+      </w:pPr>
+    </w:p>
+    <w:p>
+      <w:pPr>
+        <w:pStyle w:val="Heading2"/>
+      </w:pPr>
+      <w:r>
+        <w:t xml:space="preserve">A.2 Key terms</w:t>
+      </w:r>
+    </w:p>
+    <w:tbl>
+      <w:tblPr>
+        <w:tblW w:type="dxa" w:w="9638"/>
+        <w:tblBorders>
+          <w:top w:val="single" w:color="auto" w:sz="4"/>
+          <w:left w:val="single" w:color="auto" w:sz="4"/>
+          <w:bottom w:val="single" w:color="auto" w:sz="4"/>
+          <w:right w:val="single" w:color="auto" w:sz="4"/>
+          <w:insideH w:val="single" w:color="auto" w:sz="4"/>
+          <w:insideV w:val="single" w:color="auto" w:sz="4"/>
+        </w:tblBorders>
+      </w:tblPr>
+      <w:tblGrid>
+        <w:gridCol w:w="2505"/>
+        <w:gridCol w:w="7133"/>
+      </w:tblGrid>
+      <w:tr>
+        <w:trPr>
+          <w:tblHeader/>
+        </w:trPr>
+        <w:tc>
+          <w:tcPr>
+            <w:tcW w:type="dxa" w:w="2505"/>
+            <w:tcBorders>
+              <w:top w:val="single" w:color="BFC9D9" w:sz="4"/>
+              <w:left w:val="single" w:color="BFC9D9" w:sz="4"/>
+              <w:bottom w:val="single" w:color="BFC9D9" w:sz="4"/>
+              <w:right w:val="single" w:color="BFC9D9" w:sz="4"/>
+            </w:tcBorders>
+            <w:shd w:fill="D9E2F3" w:color="auto" w:val="clear"/>
+            <w:tcMar>
+              <w:top w:type="dxa" w:w="60"/>
+              <w:left w:type="dxa" w:w="100"/>
+              <w:bottom w:type="dxa" w:w="60"/>
+              <w:right w:type="dxa" w:w="100"/>
+            </w:tcMar>
+          </w:tcPr>
+          <w:p>
+            <w:pPr>
+              <w:spacing w:after="0"/>
+            </w:pPr>
+            <w:r>
+              <w:rPr>
+                <w:b/>
+                <w:bCs/>
+                <w:color w:val="1F3864"/>
+                <w:sz w:val="18"/>
+                <w:szCs w:val="18"/>
+              </w:rPr>
+              <w:t xml:space="preserve">Term</w:t>
+            </w:r>
+          </w:p>
+        </w:tc>
+        <w:tc>
+          <w:tcPr>
+            <w:tcW w:type="dxa" w:w="7133"/>
+            <w:tcBorders>
+              <w:top w:val="single" w:color="BFC9D9" w:sz="4"/>
+              <w:left w:val="single" w:color="BFC9D9" w:sz="4"/>
+              <w:bottom w:val="single" w:color="BFC9D9" w:sz="4"/>
+              <w:right w:val="single" w:color="BFC9D9" w:sz="4"/>
+            </w:tcBorders>
+            <w:shd w:fill="D9E2F3" w:color="auto" w:val="clear"/>
+            <w:tcMar>
+              <w:top w:type="dxa" w:w="60"/>
+              <w:left w:type="dxa" w:w="100"/>
+              <w:bottom w:type="dxa" w:w="60"/>
+              <w:right w:type="dxa" w:w="100"/>
+            </w:tcMar>
+          </w:tcPr>
+          <w:p>
+            <w:pPr>
+              <w:spacing w:after="0"/>
+            </w:pPr>
+            <w:r>
+              <w:rPr>
+                <w:b/>
+                <w:bCs/>
+                <w:color w:val="1F3864"/>
+                <w:sz w:val="18"/>
+                <w:szCs w:val="18"/>
+              </w:rPr>
+              <w:t xml:space="preserve">Definition</w:t>
+            </w:r>
+          </w:p>
+        </w:tc>
+      </w:tr>
+      <w:tr>
+        <w:trPr>
+          <w:cantSplit/>
+        </w:trPr>
+        <w:tc>
+          <w:tcPr>
+            <w:tcW w:type="dxa" w:w="2505"/>
+            <w:tcBorders>
+              <w:top w:val="single" w:color="BFC9D9" w:sz="4"/>
+              <w:left w:val="single" w:color="BFC9D9" w:sz="4"/>
+              <w:bottom w:val="single" w:color="BFC9D9" w:sz="4"/>
+              <w:right w:val="single" w:color="BFC9D9" w:sz="4"/>
+            </w:tcBorders>
+            <w:tcMar>
+              <w:top w:type="dxa" w:w="60"/>
+              <w:left w:type="dxa" w:w="100"/>
+              <w:bottom w:type="dxa" w:w="60"/>
+              <w:right w:type="dxa" w:w="100"/>
+            </w:tcMar>
+          </w:tcPr>
+          <w:p>
+            <w:pPr>
+              <w:spacing w:after="0"/>
+            </w:pPr>
+            <w:r>
+              <w:rPr>
+                <w:sz w:val="18"/>
+                <w:szCs w:val="18"/>
+              </w:rPr>
+              <w:t xml:space="preserve">52-week range</w:t>
+            </w:r>
+          </w:p>
+        </w:tc>
+        <w:tc>
+          <w:tcPr>
+            <w:tcW w:type="dxa" w:w="7133"/>
+            <w:tcBorders>
+              <w:top w:val="single" w:color="BFC9D9" w:sz="4"/>
+              <w:left w:val="single" w:color="BFC9D9" w:sz="4"/>
+              <w:bottom w:val="single" w:color="BFC9D9" w:sz="4"/>
+              <w:right w:val="single" w:color="BFC9D9" w:sz="4"/>
+            </w:tcBorders>
+            <w:tcMar>
+              <w:top w:type="dxa" w:w="60"/>
+              <w:left w:type="dxa" w:w="100"/>
+              <w:bottom w:type="dxa" w:w="60"/>
+              <w:right w:type="dxa" w:w="100"/>
+            </w:tcMar>
+          </w:tcPr>
+          <w:p>
+            <w:pPr>
+              <w:spacing w:after="0"/>
+            </w:pPr>
+            <w:r>
+              <w:rPr>
+                <w:sz w:val="18"/>
+                <w:szCs w:val="18"/>
+              </w:rPr>
+              <w:t xml:space="preserve">The lowest to highest closing price over the past year.</w:t>
+            </w:r>
+          </w:p>
+        </w:tc>
+      </w:tr>
+      <w:tr>
+        <w:trPr>
+          <w:cantSplit/>
+        </w:trPr>
+        <w:tc>
+          <w:tcPr>
+            <w:tcW w:type="dxa" w:w="2505"/>
+            <w:tcBorders>
+              <w:top w:val="single" w:color="BFC9D9" w:sz="4"/>
+              <w:left w:val="single" w:color="BFC9D9" w:sz="4"/>
+              <w:bottom w:val="single" w:color="BFC9D9" w:sz="4"/>
+              <w:right w:val="single" w:color="BFC9D9" w:sz="4"/>
+            </w:tcBorders>
+            <w:shd w:fill="F2F5FA" w:color="auto" w:val="clear"/>
+            <w:tcMar>
+              <w:top w:type="dxa" w:w="60"/>
+              <w:left w:type="dxa" w:w="100"/>
+              <w:bottom w:type="dxa" w:w="60"/>
+              <w:right w:type="dxa" w:w="100"/>
+            </w:tcMar>
+          </w:tcPr>
+          <w:p>
+            <w:pPr>
+              <w:spacing w:after="0"/>
+            </w:pPr>
+            <w:r>
+              <w:rPr>
+                <w:sz w:val="18"/>
+                <w:szCs w:val="18"/>
+              </w:rPr>
+              <w:t xml:space="preserve">200-day moving average</w:t>
+            </w:r>
+          </w:p>
+        </w:tc>
+        <w:tc>
+          <w:tcPr>
+            <w:tcW w:type="dxa" w:w="7133"/>
+            <w:tcBorders>
+              <w:top w:val="single" w:color="BFC9D9" w:sz="4"/>
+              <w:left w:val="single" w:color="BFC9D9" w:sz="4"/>
+              <w:bottom w:val="single" w:color="BFC9D9" w:sz="4"/>
+              <w:right w:val="single" w:color="BFC9D9" w:sz="4"/>
+            </w:tcBorders>
+            <w:shd w:fill="F2F5FA" w:color="auto" w:val="clear"/>
+            <w:tcMar>
+              <w:top w:type="dxa" w:w="60"/>
+              <w:left w:type="dxa" w:w="100"/>
+              <w:bottom w:type="dxa" w:w="60"/>
+              <w:right w:type="dxa" w:w="100"/>
+            </w:tcMar>
+          </w:tcPr>
+          <w:p>
+            <w:pPr>
+              <w:spacing w:after="0"/>
+            </w:pPr>
+            <w:r>
+              <w:rPr>
+                <w:sz w:val="18"/>
+                <w:szCs w:val="18"/>
+              </w:rPr>
+              <w:t xml:space="preserve">The average of the last 200 daily closing prices. A common gauge of the longer-term price trend.</w:t>
+            </w:r>
+          </w:p>
+        </w:tc>
+      </w:tr>
+      <w:tr>
+        <w:trPr>
+          <w:cantSplit/>
+        </w:trPr>
+        <w:tc>
+          <w:tcPr>
+            <w:tcW w:type="dxa" w:w="2505"/>
+            <w:tcBorders>
+              <w:top w:val="single" w:color="BFC9D9" w:sz="4"/>
+              <w:left w:val="single" w:color="BFC9D9" w:sz="4"/>
+              <w:bottom w:val="single" w:color="BFC9D9" w:sz="4"/>
+              <w:right w:val="single" w:color="BFC9D9" w:sz="4"/>
+            </w:tcBorders>
+            <w:tcMar>
+              <w:top w:type="dxa" w:w="60"/>
+              <w:left w:type="dxa" w:w="100"/>
+              <w:bottom w:type="dxa" w:w="60"/>
+              <w:right w:type="dxa" w:w="100"/>
+            </w:tcMar>
+          </w:tcPr>
+          <w:p>
+            <w:pPr>
+              <w:spacing w:after="0"/>
+            </w:pPr>
+            <w:r>
+              <w:rPr>
+                <w:sz w:val="18"/>
+                <w:szCs w:val="18"/>
+              </w:rPr>
+              <w:t xml:space="preserve">Book value</w:t>
+            </w:r>
+          </w:p>
+        </w:tc>
+        <w:tc>
+          <w:tcPr>
+            <w:tcW w:type="dxa" w:w="7133"/>
+            <w:tcBorders>
+              <w:top w:val="single" w:color="BFC9D9" w:sz="4"/>
+              <w:left w:val="single" w:color="BFC9D9" w:sz="4"/>
+              <w:bottom w:val="single" w:color="BFC9D9" w:sz="4"/>
+              <w:right w:val="single" w:color="BFC9D9" w:sz="4"/>
+            </w:tcBorders>
+            <w:tcMar>
+              <w:top w:type="dxa" w:w="60"/>
+              <w:left w:type="dxa" w:w="100"/>
+              <w:bottom w:type="dxa" w:w="60"/>
+              <w:right w:type="dxa" w:w="100"/>
+            </w:tcMar>
+          </w:tcPr>
+          <w:p>
+            <w:pPr>
+              <w:spacing w:after="0"/>
+            </w:pPr>
+            <w:r>
+              <w:rPr>
+                <w:sz w:val="18"/>
+                <w:szCs w:val="18"/>
+              </w:rPr>
+              <w:t xml:space="preserve">Total shareholders' equity from the balance sheet. Per share: equity divided by shares on issue.</w:t>
+            </w:r>
+          </w:p>
+        </w:tc>
+      </w:tr>
+      <w:tr>
+        <w:trPr>
+          <w:cantSplit/>
+        </w:trPr>
+        <w:tc>
+          <w:tcPr>
+            <w:tcW w:type="dxa" w:w="2505"/>
+            <w:tcBorders>
+              <w:top w:val="single" w:color="BFC9D9" w:sz="4"/>
+              <w:left w:val="single" w:color="BFC9D9" w:sz="4"/>
+              <w:bottom w:val="single" w:color="BFC9D9" w:sz="4"/>
+              <w:right w:val="single" w:color="BFC9D9" w:sz="4"/>
+            </w:tcBorders>
+            <w:shd w:fill="F2F5FA" w:color="auto" w:val="clear"/>
+            <w:tcMar>
+              <w:top w:type="dxa" w:w="60"/>
+              <w:left w:type="dxa" w:w="100"/>
+              <w:bottom w:type="dxa" w:w="60"/>
+              <w:right w:type="dxa" w:w="100"/>
+            </w:tcMar>
+          </w:tcPr>
+          <w:p>
+            <w:pPr>
+              <w:spacing w:after="0"/>
+            </w:pPr>
+            <w:r>
+              <w:rPr>
+                <w:sz w:val="18"/>
+                <w:szCs w:val="18"/>
+              </w:rPr>
+              <w:t xml:space="preserve">Capital proceeds</w:t>
+            </w:r>
+          </w:p>
+        </w:tc>
+        <w:tc>
+          <w:tcPr>
+            <w:tcW w:type="dxa" w:w="7133"/>
+            <w:tcBorders>
+              <w:top w:val="single" w:color="BFC9D9" w:sz="4"/>
+              <w:left w:val="single" w:color="BFC9D9" w:sz="4"/>
+              <w:bottom w:val="single" w:color="BFC9D9" w:sz="4"/>
+              <w:right w:val="single" w:color="BFC9D9" w:sz="4"/>
+            </w:tcBorders>
+            <w:shd w:fill="F2F5FA" w:color="auto" w:val="clear"/>
+            <w:tcMar>
+              <w:top w:type="dxa" w:w="60"/>
+              <w:left w:type="dxa" w:w="100"/>
+              <w:bottom w:type="dxa" w:w="60"/>
+              <w:right w:type="dxa" w:w="100"/>
+            </w:tcMar>
+          </w:tcPr>
+          <w:p>
+            <w:pPr>
+              <w:spacing w:after="0"/>
+            </w:pPr>
+            <w:r>
+              <w:rPr>
+                <w:sz w:val="18"/>
+                <w:szCs w:val="18"/>
+              </w:rPr>
+              <w:t xml:space="preserve">The sale value of a parcel less selling brokerage.</w:t>
+            </w:r>
+          </w:p>
+        </w:tc>
+      </w:tr>
+      <w:tr>
+        <w:trPr>
+          <w:cantSplit/>
+        </w:trPr>
+        <w:tc>
+          <w:tcPr>
+            <w:tcW w:type="dxa" w:w="2505"/>
+            <w:tcBorders>
+              <w:top w:val="single" w:color="BFC9D9" w:sz="4"/>
+              <w:left w:val="single" w:color="BFC9D9" w:sz="4"/>
+              <w:bottom w:val="single" w:color="BFC9D9" w:sz="4"/>
+              <w:right w:val="single" w:color="BFC9D9" w:sz="4"/>
+            </w:tcBorders>
+            <w:tcMar>
+              <w:top w:type="dxa" w:w="60"/>
+              <w:left w:type="dxa" w:w="100"/>
+              <w:bottom w:type="dxa" w:w="60"/>
+              <w:right w:type="dxa" w:w="100"/>
+            </w:tcMar>
+          </w:tcPr>
+          <w:p>
+            <w:pPr>
+              <w:spacing w:after="0"/>
+            </w:pPr>
+            <w:r>
+              <w:rPr>
+                <w:sz w:val="18"/>
+                <w:szCs w:val="18"/>
+              </w:rPr>
+              <w:t xml:space="preserve">CGT discount</w:t>
+            </w:r>
+          </w:p>
+        </w:tc>
+        <w:tc>
+          <w:tcPr>
+            <w:tcW w:type="dxa" w:w="7133"/>
+            <w:tcBorders>
+              <w:top w:val="single" w:color="BFC9D9" w:sz="4"/>
+              <w:left w:val="single" w:color="BFC9D9" w:sz="4"/>
+              <w:bottom w:val="single" w:color="BFC9D9" w:sz="4"/>
+              <w:right w:val="single" w:color="BFC9D9" w:sz="4"/>
+            </w:tcBorders>
+            <w:tcMar>
+              <w:top w:type="dxa" w:w="60"/>
+              <w:left w:type="dxa" w:w="100"/>
+              <w:bottom w:type="dxa" w:w="60"/>
+              <w:right w:type="dxa" w:w="100"/>
+            </w:tcMar>
+          </w:tcPr>
+          <w:p>
+            <w:pPr>
+              <w:spacing w:after="0"/>
+            </w:pPr>
+            <w:r>
+              <w:rPr>
+                <w:sz w:val="18"/>
+                <w:szCs w:val="18"/>
+              </w:rPr>
+              <w:t xml:space="preserve">The 50% reduction in a capital gain for individuals and trusts on shares held for more than 12 months.</w:t>
+            </w:r>
+          </w:p>
+        </w:tc>
+      </w:tr>
+      <w:tr>
+        <w:trPr>
+          <w:cantSplit/>
+        </w:trPr>
+        <w:tc>
+          <w:tcPr>
+            <w:tcW w:type="dxa" w:w="2505"/>
+            <w:tcBorders>
+              <w:top w:val="single" w:color="BFC9D9" w:sz="4"/>
+              <w:left w:val="single" w:color="BFC9D9" w:sz="4"/>
+              <w:bottom w:val="single" w:color="BFC9D9" w:sz="4"/>
+              <w:right w:val="single" w:color="BFC9D9" w:sz="4"/>
+            </w:tcBorders>
+            <w:shd w:fill="F2F5FA" w:color="auto" w:val="clear"/>
+            <w:tcMar>
+              <w:top w:type="dxa" w:w="60"/>
+              <w:left w:type="dxa" w:w="100"/>
+              <w:bottom w:type="dxa" w:w="60"/>
+              <w:right w:type="dxa" w:w="100"/>
+            </w:tcMar>
+          </w:tcPr>
+          <w:p>
+            <w:pPr>
+              <w:spacing w:after="0"/>
+            </w:pPr>
+            <w:r>
+              <w:rPr>
+                <w:sz w:val="18"/>
+                <w:szCs w:val="18"/>
+              </w:rPr>
+              <w:t xml:space="preserve">Cost base</w:t>
+            </w:r>
+          </w:p>
+        </w:tc>
+        <w:tc>
+          <w:tcPr>
+            <w:tcW w:type="dxa" w:w="7133"/>
+            <w:tcBorders>
+              <w:top w:val="single" w:color="BFC9D9" w:sz="4"/>
+              <w:left w:val="single" w:color="BFC9D9" w:sz="4"/>
+              <w:bottom w:val="single" w:color="BFC9D9" w:sz="4"/>
+              <w:right w:val="single" w:color="BFC9D9" w:sz="4"/>
+            </w:tcBorders>
+            <w:shd w:fill="F2F5FA" w:color="auto" w:val="clear"/>
+            <w:tcMar>
+              <w:top w:type="dxa" w:w="60"/>
+              <w:left w:type="dxa" w:w="100"/>
+              <w:bottom w:type="dxa" w:w="60"/>
+              <w:right w:type="dxa" w:w="100"/>
+            </w:tcMar>
+          </w:tcPr>
+          <w:p>
+            <w:pPr>
+              <w:spacing w:after="0"/>
+            </w:pPr>
+            <w:r>
+              <w:rPr>
+                <w:sz w:val="18"/>
+                <w:szCs w:val="18"/>
+              </w:rPr>
+              <w:t xml:space="preserve">The purchase value of a parcel plus buying brokerage.</w:t>
+            </w:r>
+          </w:p>
+        </w:tc>
+      </w:tr>
+      <w:tr>
+        <w:trPr>
+          <w:cantSplit/>
+        </w:trPr>
+        <w:tc>
+          <w:tcPr>
+            <w:tcW w:type="dxa" w:w="2505"/>
+            <w:tcBorders>
+              <w:top w:val="single" w:color="BFC9D9" w:sz="4"/>
+              <w:left w:val="single" w:color="BFC9D9" w:sz="4"/>
+              <w:bottom w:val="single" w:color="BFC9D9" w:sz="4"/>
+              <w:right w:val="single" w:color="BFC9D9" w:sz="4"/>
+            </w:tcBorders>
+            <w:tcMar>
+              <w:top w:type="dxa" w:w="60"/>
+              <w:left w:type="dxa" w:w="100"/>
+              <w:bottom w:type="dxa" w:w="60"/>
+              <w:right w:type="dxa" w:w="100"/>
+            </w:tcMar>
+          </w:tcPr>
+          <w:p>
+            <w:pPr>
+              <w:spacing w:after="0"/>
+            </w:pPr>
+            <w:r>
+              <w:rPr>
+                <w:sz w:val="18"/>
+                <w:szCs w:val="18"/>
+              </w:rPr>
+              <w:t xml:space="preserve">Discount rate</w:t>
+            </w:r>
+          </w:p>
+        </w:tc>
+        <w:tc>
+          <w:tcPr>
+            <w:tcW w:type="dxa" w:w="7133"/>
+            <w:tcBorders>
+              <w:top w:val="single" w:color="BFC9D9" w:sz="4"/>
+              <w:left w:val="single" w:color="BFC9D9" w:sz="4"/>
+              <w:bottom w:val="single" w:color="BFC9D9" w:sz="4"/>
+              <w:right w:val="single" w:color="BFC9D9" w:sz="4"/>
+            </w:tcBorders>
+            <w:tcMar>
+              <w:top w:type="dxa" w:w="60"/>
+              <w:left w:type="dxa" w:w="100"/>
+              <w:bottom w:type="dxa" w:w="60"/>
+              <w:right w:type="dxa" w:w="100"/>
+            </w:tcMar>
+          </w:tcPr>
+          <w:p>
+            <w:pPr>
+              <w:spacing w:after="0"/>
+            </w:pPr>
+            <w:r>
+              <w:rPr>
+                <w:sz w:val="18"/>
+                <w:szCs w:val="18"/>
+              </w:rPr>
+              <w:t xml:space="preserve">The annual return required to justify the investment, used to convert future cash into today's dollars. 9% in this tool.</w:t>
+            </w:r>
+          </w:p>
+        </w:tc>
+      </w:tr>
+      <w:tr>
+        <w:trPr>
+          <w:cantSplit/>
+        </w:trPr>
+        <w:tc>
+          <w:tcPr>
+            <w:tcW w:type="dxa" w:w="2505"/>
+            <w:tcBorders>
+              <w:top w:val="single" w:color="BFC9D9" w:sz="4"/>
+              <w:left w:val="single" w:color="BFC9D9" w:sz="4"/>
+              <w:bottom w:val="single" w:color="BFC9D9" w:sz="4"/>
+              <w:right w:val="single" w:color="BFC9D9" w:sz="4"/>
+            </w:tcBorders>
+            <w:shd w:fill="F2F5FA" w:color="auto" w:val="clear"/>
+            <w:tcMar>
+              <w:top w:type="dxa" w:w="60"/>
+              <w:left w:type="dxa" w:w="100"/>
+              <w:bottom w:type="dxa" w:w="60"/>
+              <w:right w:type="dxa" w:w="100"/>
+            </w:tcMar>
+          </w:tcPr>
+          <w:p>
+            <w:pPr>
+              <w:spacing w:after="0"/>
+            </w:pPr>
+            <w:r>
+              <w:rPr>
+                <w:sz w:val="18"/>
+                <w:szCs w:val="18"/>
+              </w:rPr>
+              <w:t xml:space="preserve">Franking credit</w:t>
+            </w:r>
+          </w:p>
+        </w:tc>
+        <w:tc>
+          <w:tcPr>
+            <w:tcW w:type="dxa" w:w="7133"/>
+            <w:tcBorders>
+              <w:top w:val="single" w:color="BFC9D9" w:sz="4"/>
+              <w:left w:val="single" w:color="BFC9D9" w:sz="4"/>
+              <w:bottom w:val="single" w:color="BFC9D9" w:sz="4"/>
+              <w:right w:val="single" w:color="BFC9D9" w:sz="4"/>
+            </w:tcBorders>
+            <w:shd w:fill="F2F5FA" w:color="auto" w:val="clear"/>
+            <w:tcMar>
+              <w:top w:type="dxa" w:w="60"/>
+              <w:left w:type="dxa" w:w="100"/>
+              <w:bottom w:type="dxa" w:w="60"/>
+              <w:right w:type="dxa" w:w="100"/>
+            </w:tcMar>
+          </w:tcPr>
+          <w:p>
+            <w:pPr>
+              <w:spacing w:after="0"/>
+            </w:pPr>
+            <w:r>
+              <w:rPr>
+                <w:sz w:val="18"/>
+                <w:szCs w:val="18"/>
+              </w:rPr>
+              <w:t xml:space="preserve">A credit for company tax already paid on a dividend, which Australian resident shareholders can offset against their own tax.</w:t>
+            </w:r>
+          </w:p>
+        </w:tc>
+      </w:tr>
+      <w:tr>
+        <w:trPr>
+          <w:cantSplit/>
+        </w:trPr>
+        <w:tc>
+          <w:tcPr>
+            <w:tcW w:type="dxa" w:w="2505"/>
+            <w:tcBorders>
+              <w:top w:val="single" w:color="BFC9D9" w:sz="4"/>
+              <w:left w:val="single" w:color="BFC9D9" w:sz="4"/>
+              <w:bottom w:val="single" w:color="BFC9D9" w:sz="4"/>
+              <w:right w:val="single" w:color="BFC9D9" w:sz="4"/>
+            </w:tcBorders>
+            <w:tcMar>
+              <w:top w:type="dxa" w:w="60"/>
+              <w:left w:type="dxa" w:w="100"/>
+              <w:bottom w:type="dxa" w:w="60"/>
+              <w:right w:type="dxa" w:w="100"/>
+            </w:tcMar>
+          </w:tcPr>
+          <w:p>
+            <w:pPr>
+              <w:spacing w:after="0"/>
+            </w:pPr>
+            <w:r>
+              <w:rPr>
+                <w:sz w:val="18"/>
+                <w:szCs w:val="18"/>
+              </w:rPr>
+              <w:t xml:space="preserve">Grossed-up yield</w:t>
+            </w:r>
+          </w:p>
+        </w:tc>
+        <w:tc>
+          <w:tcPr>
+            <w:tcW w:type="dxa" w:w="7133"/>
+            <w:tcBorders>
+              <w:top w:val="single" w:color="BFC9D9" w:sz="4"/>
+              <w:left w:val="single" w:color="BFC9D9" w:sz="4"/>
+              <w:bottom w:val="single" w:color="BFC9D9" w:sz="4"/>
+              <w:right w:val="single" w:color="BFC9D9" w:sz="4"/>
+            </w:tcBorders>
+            <w:tcMar>
+              <w:top w:type="dxa" w:w="60"/>
+              <w:left w:type="dxa" w:w="100"/>
+              <w:bottom w:type="dxa" w:w="60"/>
+              <w:right w:type="dxa" w:w="100"/>
+            </w:tcMar>
+          </w:tcPr>
+          <w:p>
+            <w:pPr>
+              <w:spacing w:after="0"/>
+            </w:pPr>
+            <w:r>
+              <w:rPr>
+                <w:sz w:val="18"/>
+                <w:szCs w:val="18"/>
+              </w:rPr>
+              <w:t xml:space="preserve">Dividend yield including the value of franking credits.</w:t>
+            </w:r>
+          </w:p>
+        </w:tc>
+      </w:tr>
+      <w:tr>
+        <w:trPr>
+          <w:cantSplit/>
+        </w:trPr>
+        <w:tc>
+          <w:tcPr>
+            <w:tcW w:type="dxa" w:w="2505"/>
+            <w:tcBorders>
+              <w:top w:val="single" w:color="BFC9D9" w:sz="4"/>
+              <w:left w:val="single" w:color="BFC9D9" w:sz="4"/>
+              <w:bottom w:val="single" w:color="BFC9D9" w:sz="4"/>
+              <w:right w:val="single" w:color="BFC9D9" w:sz="4"/>
+            </w:tcBorders>
+            <w:shd w:fill="F2F5FA" w:color="auto" w:val="clear"/>
+            <w:tcMar>
+              <w:top w:type="dxa" w:w="60"/>
+              <w:left w:type="dxa" w:w="100"/>
+              <w:bottom w:type="dxa" w:w="60"/>
+              <w:right w:type="dxa" w:w="100"/>
+            </w:tcMar>
+          </w:tcPr>
+          <w:p>
+            <w:pPr>
+              <w:spacing w:after="0"/>
+            </w:pPr>
+            <w:r>
+              <w:rPr>
+                <w:sz w:val="18"/>
+                <w:szCs w:val="18"/>
+              </w:rPr>
+              <w:t xml:space="preserve">Intrinsic value</w:t>
+            </w:r>
+          </w:p>
+        </w:tc>
+        <w:tc>
+          <w:tcPr>
+            <w:tcW w:type="dxa" w:w="7133"/>
+            <w:tcBorders>
+              <w:top w:val="single" w:color="BFC9D9" w:sz="4"/>
+              <w:left w:val="single" w:color="BFC9D9" w:sz="4"/>
+              <w:bottom w:val="single" w:color="BFC9D9" w:sz="4"/>
+              <w:right w:val="single" w:color="BFC9D9" w:sz="4"/>
+            </w:tcBorders>
+            <w:shd w:fill="F2F5FA" w:color="auto" w:val="clear"/>
+            <w:tcMar>
+              <w:top w:type="dxa" w:w="60"/>
+              <w:left w:type="dxa" w:w="100"/>
+              <w:bottom w:type="dxa" w:w="60"/>
+              <w:right w:type="dxa" w:w="100"/>
+            </w:tcMar>
+          </w:tcPr>
+          <w:p>
+            <w:pPr>
+              <w:spacing w:after="0"/>
+            </w:pPr>
+            <w:r>
+              <w:rPr>
+                <w:sz w:val="18"/>
+                <w:szCs w:val="18"/>
+              </w:rPr>
+              <w:t xml:space="preserve">The estimated value of a share based on the cash it is expected to generate, independent of the market price.</w:t>
+            </w:r>
+          </w:p>
+        </w:tc>
+      </w:tr>
+      <w:tr>
+        <w:trPr>
+          <w:cantSplit/>
+        </w:trPr>
+        <w:tc>
+          <w:tcPr>
+            <w:tcW w:type="dxa" w:w="2505"/>
+            <w:tcBorders>
+              <w:top w:val="single" w:color="BFC9D9" w:sz="4"/>
+              <w:left w:val="single" w:color="BFC9D9" w:sz="4"/>
+              <w:bottom w:val="single" w:color="BFC9D9" w:sz="4"/>
+              <w:right w:val="single" w:color="BFC9D9" w:sz="4"/>
+            </w:tcBorders>
+            <w:tcMar>
+              <w:top w:type="dxa" w:w="60"/>
+              <w:left w:type="dxa" w:w="100"/>
+              <w:bottom w:type="dxa" w:w="60"/>
+              <w:right w:type="dxa" w:w="100"/>
+            </w:tcMar>
+          </w:tcPr>
+          <w:p>
+            <w:pPr>
+              <w:spacing w:after="0"/>
+            </w:pPr>
+            <w:r>
+              <w:rPr>
+                <w:sz w:val="18"/>
+                <w:szCs w:val="18"/>
+              </w:rPr>
+              <w:t xml:space="preserve">Margin of safety</w:t>
+            </w:r>
+          </w:p>
+        </w:tc>
+        <w:tc>
+          <w:tcPr>
+            <w:tcW w:type="dxa" w:w="7133"/>
+            <w:tcBorders>
+              <w:top w:val="single" w:color="BFC9D9" w:sz="4"/>
+              <w:left w:val="single" w:color="BFC9D9" w:sz="4"/>
+              <w:bottom w:val="single" w:color="BFC9D9" w:sz="4"/>
+              <w:right w:val="single" w:color="BFC9D9" w:sz="4"/>
+            </w:tcBorders>
+            <w:tcMar>
+              <w:top w:type="dxa" w:w="60"/>
+              <w:left w:type="dxa" w:w="100"/>
+              <w:bottom w:type="dxa" w:w="60"/>
+              <w:right w:type="dxa" w:w="100"/>
+            </w:tcMar>
+          </w:tcPr>
+          <w:p>
+            <w:pPr>
+              <w:spacing w:after="0"/>
+            </w:pPr>
+            <w:r>
+              <w:rPr>
+                <w:sz w:val="18"/>
+                <w:szCs w:val="18"/>
+              </w:rPr>
+              <w:t xml:space="preserve">How far the share price sits below intrinsic value. A buffer against errors in the estimate.</w:t>
+            </w:r>
+          </w:p>
+        </w:tc>
+      </w:tr>
+      <w:tr>
+        <w:trPr>
+          <w:cantSplit/>
+        </w:trPr>
+        <w:tc>
+          <w:tcPr>
+            <w:tcW w:type="dxa" w:w="2505"/>
+            <w:tcBorders>
+              <w:top w:val="single" w:color="BFC9D9" w:sz="4"/>
+              <w:left w:val="single" w:color="BFC9D9" w:sz="4"/>
+              <w:bottom w:val="single" w:color="BFC9D9" w:sz="4"/>
+              <w:right w:val="single" w:color="BFC9D9" w:sz="4"/>
+            </w:tcBorders>
+            <w:shd w:fill="F2F5FA" w:color="auto" w:val="clear"/>
+            <w:tcMar>
+              <w:top w:type="dxa" w:w="60"/>
+              <w:left w:type="dxa" w:w="100"/>
+              <w:bottom w:type="dxa" w:w="60"/>
+              <w:right w:type="dxa" w:w="100"/>
+            </w:tcMar>
+          </w:tcPr>
+          <w:p>
+            <w:pPr>
+              <w:spacing w:after="0"/>
+            </w:pPr>
+            <w:r>
+              <w:rPr>
+                <w:sz w:val="18"/>
+                <w:szCs w:val="18"/>
+              </w:rPr>
+              <w:t xml:space="preserve">Momentum (into value)</w:t>
+            </w:r>
+          </w:p>
+        </w:tc>
+        <w:tc>
+          <w:tcPr>
+            <w:tcW w:type="dxa" w:w="7133"/>
+            <w:tcBorders>
+              <w:top w:val="single" w:color="BFC9D9" w:sz="4"/>
+              <w:left w:val="single" w:color="BFC9D9" w:sz="4"/>
+              <w:bottom w:val="single" w:color="BFC9D9" w:sz="4"/>
+              <w:right w:val="single" w:color="BFC9D9" w:sz="4"/>
+            </w:tcBorders>
+            <w:shd w:fill="F2F5FA" w:color="auto" w:val="clear"/>
+            <w:tcMar>
+              <w:top w:type="dxa" w:w="60"/>
+              <w:left w:type="dxa" w:w="100"/>
+              <w:bottom w:type="dxa" w:w="60"/>
+              <w:right w:type="dxa" w:w="100"/>
+            </w:tcMar>
+          </w:tcPr>
+          <w:p>
+            <w:pPr>
+              <w:spacing w:after="0"/>
+            </w:pPr>
+            <w:r>
+              <w:rPr>
+                <w:sz w:val="18"/>
+                <w:szCs w:val="18"/>
+              </w:rPr>
+              <w:t xml:space="preserve">A widening margin of safety: the share is getting cheaper relative to its estimated value.</w:t>
+            </w:r>
+          </w:p>
+        </w:tc>
+      </w:tr>
+      <w:tr>
+        <w:trPr>
+          <w:cantSplit/>
+        </w:trPr>
+        <w:tc>
+          <w:tcPr>
+            <w:tcW w:type="dxa" w:w="2505"/>
+            <w:tcBorders>
+              <w:top w:val="single" w:color="BFC9D9" w:sz="4"/>
+              <w:left w:val="single" w:color="BFC9D9" w:sz="4"/>
+              <w:bottom w:val="single" w:color="BFC9D9" w:sz="4"/>
+              <w:right w:val="single" w:color="BFC9D9" w:sz="4"/>
+            </w:tcBorders>
+            <w:tcMar>
+              <w:top w:type="dxa" w:w="60"/>
+              <w:left w:type="dxa" w:w="100"/>
+              <w:bottom w:type="dxa" w:w="60"/>
+              <w:right w:type="dxa" w:w="100"/>
+            </w:tcMar>
+          </w:tcPr>
+          <w:p>
+            <w:pPr>
+              <w:spacing w:after="0"/>
+            </w:pPr>
+            <w:r>
+              <w:rPr>
+                <w:sz w:val="18"/>
+                <w:szCs w:val="18"/>
+              </w:rPr>
+              <w:t xml:space="preserve">Parcel</w:t>
+            </w:r>
+          </w:p>
+        </w:tc>
+        <w:tc>
+          <w:tcPr>
+            <w:tcW w:type="dxa" w:w="7133"/>
+            <w:tcBorders>
+              <w:top w:val="single" w:color="BFC9D9" w:sz="4"/>
+              <w:left w:val="single" w:color="BFC9D9" w:sz="4"/>
+              <w:bottom w:val="single" w:color="BFC9D9" w:sz="4"/>
+              <w:right w:val="single" w:color="BFC9D9" w:sz="4"/>
+            </w:tcBorders>
+            <w:tcMar>
+              <w:top w:type="dxa" w:w="60"/>
+              <w:left w:type="dxa" w:w="100"/>
+              <w:bottom w:type="dxa" w:w="60"/>
+              <w:right w:type="dxa" w:w="100"/>
+            </w:tcMar>
+          </w:tcPr>
+          <w:p>
+            <w:pPr>
+              <w:spacing w:after="0"/>
+            </w:pPr>
+            <w:r>
+              <w:rPr>
+                <w:sz w:val="18"/>
+                <w:szCs w:val="18"/>
+              </w:rPr>
+              <w:t xml:space="preserve">A single acquisition of shares, tracked separately for tax.</w:t>
+            </w:r>
+          </w:p>
+        </w:tc>
+      </w:tr>
+      <w:tr>
+        <w:trPr>
+          <w:cantSplit/>
+        </w:trPr>
+        <w:tc>
+          <w:tcPr>
+            <w:tcW w:type="dxa" w:w="2505"/>
+            <w:tcBorders>
+              <w:top w:val="single" w:color="BFC9D9" w:sz="4"/>
+              <w:left w:val="single" w:color="BFC9D9" w:sz="4"/>
+              <w:bottom w:val="single" w:color="BFC9D9" w:sz="4"/>
+              <w:right w:val="single" w:color="BFC9D9" w:sz="4"/>
+            </w:tcBorders>
+            <w:shd w:fill="F2F5FA" w:color="auto" w:val="clear"/>
+            <w:tcMar>
+              <w:top w:type="dxa" w:w="60"/>
+              <w:left w:type="dxa" w:w="100"/>
+              <w:bottom w:type="dxa" w:w="60"/>
+              <w:right w:type="dxa" w:w="100"/>
+            </w:tcMar>
+          </w:tcPr>
+          <w:p>
+            <w:pPr>
+              <w:spacing w:after="0"/>
+            </w:pPr>
+            <w:r>
+              <w:rPr>
+                <w:sz w:val="18"/>
+                <w:szCs w:val="18"/>
+              </w:rPr>
+              <w:t xml:space="preserve">Payout ratio</w:t>
+            </w:r>
+          </w:p>
+        </w:tc>
+        <w:tc>
+          <w:tcPr>
+            <w:tcW w:type="dxa" w:w="7133"/>
+            <w:tcBorders>
+              <w:top w:val="single" w:color="BFC9D9" w:sz="4"/>
+              <w:left w:val="single" w:color="BFC9D9" w:sz="4"/>
+              <w:bottom w:val="single" w:color="BFC9D9" w:sz="4"/>
+              <w:right w:val="single" w:color="BFC9D9" w:sz="4"/>
+            </w:tcBorders>
+            <w:shd w:fill="F2F5FA" w:color="auto" w:val="clear"/>
+            <w:tcMar>
+              <w:top w:type="dxa" w:w="60"/>
+              <w:left w:type="dxa" w:w="100"/>
+              <w:bottom w:type="dxa" w:w="60"/>
+              <w:right w:type="dxa" w:w="100"/>
+            </w:tcMar>
+          </w:tcPr>
+          <w:p>
+            <w:pPr>
+              <w:spacing w:after="0"/>
+            </w:pPr>
+            <w:r>
+              <w:rPr>
+                <w:sz w:val="18"/>
+                <w:szCs w:val="18"/>
+              </w:rPr>
+              <w:t xml:space="preserve">The share of earnings paid out as dividends.</w:t>
+            </w:r>
+          </w:p>
+        </w:tc>
+      </w:tr>
+      <w:tr>
+        <w:trPr>
+          <w:cantSplit/>
+        </w:trPr>
+        <w:tc>
+          <w:tcPr>
+            <w:tcW w:type="dxa" w:w="2505"/>
+            <w:tcBorders>
+              <w:top w:val="single" w:color="BFC9D9" w:sz="4"/>
+              <w:left w:val="single" w:color="BFC9D9" w:sz="4"/>
+              <w:bottom w:val="single" w:color="BFC9D9" w:sz="4"/>
+              <w:right w:val="single" w:color="BFC9D9" w:sz="4"/>
+            </w:tcBorders>
+            <w:tcMar>
+              <w:top w:type="dxa" w:w="60"/>
+              <w:left w:type="dxa" w:w="100"/>
+              <w:bottom w:type="dxa" w:w="60"/>
+              <w:right w:type="dxa" w:w="100"/>
+            </w:tcMar>
+          </w:tcPr>
+          <w:p>
+            <w:pPr>
+              <w:spacing w:after="0"/>
+            </w:pPr>
+            <w:r>
+              <w:rPr>
+                <w:sz w:val="18"/>
+                <w:szCs w:val="18"/>
+              </w:rPr>
+              <w:t xml:space="preserve">Percentage point</w:t>
+            </w:r>
+          </w:p>
+        </w:tc>
+        <w:tc>
+          <w:tcPr>
+            <w:tcW w:type="dxa" w:w="7133"/>
+            <w:tcBorders>
+              <w:top w:val="single" w:color="BFC9D9" w:sz="4"/>
+              <w:left w:val="single" w:color="BFC9D9" w:sz="4"/>
+              <w:bottom w:val="single" w:color="BFC9D9" w:sz="4"/>
+              <w:right w:val="single" w:color="BFC9D9" w:sz="4"/>
+            </w:tcBorders>
+            <w:tcMar>
+              <w:top w:type="dxa" w:w="60"/>
+              <w:left w:type="dxa" w:w="100"/>
+              <w:bottom w:type="dxa" w:w="60"/>
+              <w:right w:type="dxa" w:w="100"/>
+            </w:tcMar>
+          </w:tcPr>
+          <w:p>
+            <w:pPr>
+              <w:spacing w:after="0"/>
+            </w:pPr>
+            <w:r>
+              <w:rPr>
+                <w:sz w:val="18"/>
+                <w:szCs w:val="18"/>
+              </w:rPr>
+              <w:t xml:space="preserve">The simple difference between two percentages. Moving from 20% to 25% is a rise of 5 percentage points.</w:t>
+            </w:r>
+          </w:p>
+        </w:tc>
+      </w:tr>
+      <w:tr>
+        <w:trPr>
+          <w:cantSplit/>
+        </w:trPr>
+        <w:tc>
+          <w:tcPr>
+            <w:tcW w:type="dxa" w:w="2505"/>
+            <w:tcBorders>
+              <w:top w:val="single" w:color="BFC9D9" w:sz="4"/>
+              <w:left w:val="single" w:color="BFC9D9" w:sz="4"/>
+              <w:bottom w:val="single" w:color="BFC9D9" w:sz="4"/>
+              <w:right w:val="single" w:color="BFC9D9" w:sz="4"/>
+            </w:tcBorders>
+            <w:shd w:fill="F2F5FA" w:color="auto" w:val="clear"/>
+            <w:tcMar>
+              <w:top w:type="dxa" w:w="60"/>
+              <w:left w:type="dxa" w:w="100"/>
+              <w:bottom w:type="dxa" w:w="60"/>
+              <w:right w:type="dxa" w:w="100"/>
+            </w:tcMar>
+          </w:tcPr>
+          <w:p>
+            <w:pPr>
+              <w:spacing w:after="0"/>
+            </w:pPr>
+            <w:r>
+              <w:rPr>
+                <w:sz w:val="18"/>
+                <w:szCs w:val="18"/>
+              </w:rPr>
+              <w:t xml:space="preserve">Red flag</w:t>
+            </w:r>
+          </w:p>
+        </w:tc>
+        <w:tc>
+          <w:tcPr>
+            <w:tcW w:type="dxa" w:w="7133"/>
+            <w:tcBorders>
+              <w:top w:val="single" w:color="BFC9D9" w:sz="4"/>
+              <w:left w:val="single" w:color="BFC9D9" w:sz="4"/>
+              <w:bottom w:val="single" w:color="BFC9D9" w:sz="4"/>
+              <w:right w:val="single" w:color="BFC9D9" w:sz="4"/>
+            </w:tcBorders>
+            <w:shd w:fill="F2F5FA" w:color="auto" w:val="clear"/>
+            <w:tcMar>
+              <w:top w:type="dxa" w:w="60"/>
+              <w:left w:type="dxa" w:w="100"/>
+              <w:bottom w:type="dxa" w:w="60"/>
+              <w:right w:type="dxa" w:w="100"/>
+            </w:tcMar>
+          </w:tcPr>
+          <w:p>
+            <w:pPr>
+              <w:spacing w:after="0"/>
+            </w:pPr>
+            <w:r>
+              <w:rPr>
+                <w:sz w:val="18"/>
+                <w:szCs w:val="18"/>
+              </w:rPr>
+              <w:t xml:space="preserve">A condition that downgrades an otherwise attractive result (see section 9).</w:t>
+            </w:r>
+          </w:p>
+        </w:tc>
+      </w:tr>
+      <w:tr>
+        <w:trPr>
+          <w:cantSplit/>
+        </w:trPr>
+        <w:tc>
+          <w:tcPr>
+            <w:tcW w:type="dxa" w:w="2505"/>
+            <w:tcBorders>
+              <w:top w:val="single" w:color="BFC9D9" w:sz="4"/>
+              <w:left w:val="single" w:color="BFC9D9" w:sz="4"/>
+              <w:bottom w:val="single" w:color="BFC9D9" w:sz="4"/>
+              <w:right w:val="single" w:color="BFC9D9" w:sz="4"/>
+            </w:tcBorders>
+            <w:tcMar>
+              <w:top w:type="dxa" w:w="60"/>
+              <w:left w:type="dxa" w:w="100"/>
+              <w:bottom w:type="dxa" w:w="60"/>
+              <w:right w:type="dxa" w:w="100"/>
+            </w:tcMar>
+          </w:tcPr>
+          <w:p>
+            <w:pPr>
+              <w:spacing w:after="0"/>
+            </w:pPr>
+            <w:r>
+              <w:rPr>
+                <w:sz w:val="18"/>
+                <w:szCs w:val="18"/>
+              </w:rPr>
+              <w:t xml:space="preserve">Shares on issue</w:t>
+            </w:r>
+          </w:p>
+        </w:tc>
+        <w:tc>
+          <w:tcPr>
+            <w:tcW w:type="dxa" w:w="7133"/>
+            <w:tcBorders>
+              <w:top w:val="single" w:color="BFC9D9" w:sz="4"/>
+              <w:left w:val="single" w:color="BFC9D9" w:sz="4"/>
+              <w:bottom w:val="single" w:color="BFC9D9" w:sz="4"/>
+              <w:right w:val="single" w:color="BFC9D9" w:sz="4"/>
+            </w:tcBorders>
+            <w:tcMar>
+              <w:top w:type="dxa" w:w="60"/>
+              <w:left w:type="dxa" w:w="100"/>
+              <w:bottom w:type="dxa" w:w="60"/>
+              <w:right w:type="dxa" w:w="100"/>
+            </w:tcMar>
+          </w:tcPr>
+          <w:p>
+            <w:pPr>
+              <w:spacing w:after="0"/>
+            </w:pPr>
+            <w:r>
+              <w:rPr>
+                <w:sz w:val="18"/>
+                <w:szCs w:val="18"/>
+              </w:rPr>
+              <w:t xml:space="preserve">The total number of a company's shares held by investors.</w:t>
+            </w:r>
+          </w:p>
+        </w:tc>
+      </w:tr>
+      <w:tr>
+        <w:trPr>
+          <w:cantSplit/>
+        </w:trPr>
+        <w:tc>
+          <w:tcPr>
+            <w:tcW w:type="dxa" w:w="2505"/>
+            <w:tcBorders>
+              <w:top w:val="single" w:color="BFC9D9" w:sz="4"/>
+              <w:left w:val="single" w:color="BFC9D9" w:sz="4"/>
+              <w:bottom w:val="single" w:color="BFC9D9" w:sz="4"/>
+              <w:right w:val="single" w:color="BFC9D9" w:sz="4"/>
+            </w:tcBorders>
+            <w:shd w:fill="F2F5FA" w:color="auto" w:val="clear"/>
+            <w:tcMar>
+              <w:top w:type="dxa" w:w="60"/>
+              <w:left w:type="dxa" w:w="100"/>
+              <w:bottom w:type="dxa" w:w="60"/>
+              <w:right w:type="dxa" w:w="100"/>
+            </w:tcMar>
+          </w:tcPr>
+          <w:p>
+            <w:pPr>
+              <w:spacing w:after="0"/>
+            </w:pPr>
+            <w:r>
+              <w:rPr>
+                <w:sz w:val="18"/>
+                <w:szCs w:val="18"/>
+              </w:rPr>
+              <w:t xml:space="preserve">Terminal value</w:t>
+            </w:r>
+          </w:p>
+        </w:tc>
+        <w:tc>
+          <w:tcPr>
+            <w:tcW w:type="dxa" w:w="7133"/>
+            <w:tcBorders>
+              <w:top w:val="single" w:color="BFC9D9" w:sz="4"/>
+              <w:left w:val="single" w:color="BFC9D9" w:sz="4"/>
+              <w:bottom w:val="single" w:color="BFC9D9" w:sz="4"/>
+              <w:right w:val="single" w:color="BFC9D9" w:sz="4"/>
+            </w:tcBorders>
+            <w:shd w:fill="F2F5FA" w:color="auto" w:val="clear"/>
+            <w:tcMar>
+              <w:top w:type="dxa" w:w="60"/>
+              <w:left w:type="dxa" w:w="100"/>
+              <w:bottom w:type="dxa" w:w="60"/>
+              <w:right w:type="dxa" w:w="100"/>
+            </w:tcMar>
+          </w:tcPr>
+          <w:p>
+            <w:pPr>
+              <w:spacing w:after="0"/>
+            </w:pPr>
+            <w:r>
+              <w:rPr>
+                <w:sz w:val="18"/>
+                <w:szCs w:val="18"/>
+              </w:rPr>
+              <w:t xml:space="preserve">The value of all cash flows beyond the explicit forecast period, assuming steady growth thereafter.</w:t>
+            </w:r>
+          </w:p>
+        </w:tc>
+      </w:tr>
+      <w:tr>
+        <w:trPr>
+          <w:cantSplit/>
+        </w:trPr>
+        <w:tc>
+          <w:tcPr>
+            <w:tcW w:type="dxa" w:w="2505"/>
+            <w:tcBorders>
+              <w:top w:val="single" w:color="BFC9D9" w:sz="4"/>
+              <w:left w:val="single" w:color="BFC9D9" w:sz="4"/>
+              <w:bottom w:val="single" w:color="BFC9D9" w:sz="4"/>
+              <w:right w:val="single" w:color="BFC9D9" w:sz="4"/>
+            </w:tcBorders>
+            <w:tcMar>
+              <w:top w:type="dxa" w:w="60"/>
+              <w:left w:type="dxa" w:w="100"/>
+              <w:bottom w:type="dxa" w:w="60"/>
+              <w:right w:type="dxa" w:w="100"/>
+            </w:tcMar>
+          </w:tcPr>
+          <w:p>
+            <w:pPr>
+              <w:spacing w:after="0"/>
+            </w:pPr>
+            <w:r>
+              <w:rPr>
+                <w:sz w:val="18"/>
+                <w:szCs w:val="18"/>
+              </w:rPr>
+              <w:t xml:space="preserve">Value trap</w:t>
+            </w:r>
+          </w:p>
+        </w:tc>
+        <w:tc>
+          <w:tcPr>
+            <w:tcW w:type="dxa" w:w="7133"/>
+            <w:tcBorders>
+              <w:top w:val="single" w:color="BFC9D9" w:sz="4"/>
+              <w:left w:val="single" w:color="BFC9D9" w:sz="4"/>
+              <w:bottom w:val="single" w:color="BFC9D9" w:sz="4"/>
+              <w:right w:val="single" w:color="BFC9D9" w:sz="4"/>
+            </w:tcBorders>
+            <w:tcMar>
+              <w:top w:type="dxa" w:w="60"/>
+              <w:left w:type="dxa" w:w="100"/>
+              <w:bottom w:type="dxa" w:w="60"/>
+              <w:right w:type="dxa" w:w="100"/>
+            </w:tcMar>
+          </w:tcPr>
+          <w:p>
+            <w:pPr>
+              <w:spacing w:after="0"/>
+            </w:pPr>
+            <w:r>
+              <w:rPr>
+                <w:sz w:val="18"/>
+                <w:szCs w:val="18"/>
+              </w:rPr>
+              <w:t xml:space="preserve">A share that looks cheap because its business is deteriorating, not because the market has mispriced it.</w:t>
+            </w:r>
+          </w:p>
+        </w:tc>
+      </w:tr>
+    </w:tbl>
     <w:sectPr>
       <w:footerReference w:type="default" r:id="rId6"/>
       <w:pgSz w:w="11906" w:h="16838" w:orient="portrait"/>

</xml_diff>

<commit_message>
Add ACCUMULATE action for held shares that still pass every test
A held share that passes all four value tests with no red flags (the same
bar as BUY for a share you don't own) now reads ACCUMULATE, consider
adding, instead of HOLD "could add". HOLD now means no red flags but
failing a test, and names the failed tests. Report order is SELL, REVIEW,
ACCUMULATE, HOLD. The CGT timing note stays on SELL/REVIEW only.

README, AS_BUILT, OVERVIEW and the rules and methodology document updated.
3 new tests (180 total).

Co-Authored-By: Claude Opus 5.5 <noreply@anthropic.com>
Claude-Session: https://claude.ai/code/session_013woDwy1Jw8XbwbT1HUNgCF
</commit_message>
<xml_diff>
--- a/docs/ASX_Value_Screener_Rules_and_Methodology.docx
+++ b/docs/ASX_Value_Screener_Rules_and_Methodology.docx
@@ -43,7 +43,7 @@
           <w:sz w:val="18"/>
           <w:szCs w:val="18"/>
         </w:rPr>
-        <w:t xml:space="preserve">As at 5 October 2026  |  Code version 4723a0a  |  Research tool, not financial advice</w:t>
+        <w:t xml:space="preserve">As at 5 October 2026  |  Research tool, not financial advice</w:t>
       </w:r>
     </w:p>
     <w:p>
@@ -8429,6 +8429,100 @@
                 <w:sz w:val="18"/>
                 <w:szCs w:val="18"/>
               </w:rPr>
+              <w:t xml:space="preserve">ACCUMULATE</w:t>
+            </w:r>
+          </w:p>
+        </w:tc>
+        <w:tc>
+          <w:tcPr>
+            <w:tcW w:type="dxa" w:w="7037"/>
+            <w:tcBorders>
+              <w:top w:val="single" w:color="BFC9D9" w:sz="4"/>
+              <w:left w:val="single" w:color="BFC9D9" w:sz="4"/>
+              <w:bottom w:val="single" w:color="BFC9D9" w:sz="4"/>
+              <w:right w:val="single" w:color="BFC9D9" w:sz="4"/>
+            </w:tcBorders>
+            <w:tcMar>
+              <w:top w:type="dxa" w:w="60"/>
+              <w:left w:type="dxa" w:w="100"/>
+              <w:bottom w:type="dxa" w:w="60"/>
+              <w:right w:type="dxa" w:w="100"/>
+            </w:tcMar>
+          </w:tcPr>
+          <w:p>
+            <w:pPr>
+              <w:spacing w:after="0"/>
+            </w:pPr>
+            <w:r>
+              <w:rPr>
+                <w:sz w:val="18"/>
+                <w:szCs w:val="18"/>
+              </w:rPr>
+              <w:t xml:space="preserve">Passes all four value tests with no red flags: the same bar as BUY for a share you do not own, so consider adding. The reason notes "getting cheaper" when momentum_ok = Y.</w:t>
+            </w:r>
+          </w:p>
+        </w:tc>
+      </w:tr>
+      <w:tr>
+        <w:trPr>
+          <w:cantSplit/>
+        </w:trPr>
+        <w:tc>
+          <w:tcPr>
+            <w:tcW w:type="dxa" w:w="963"/>
+            <w:tcBorders>
+              <w:top w:val="single" w:color="BFC9D9" w:sz="4"/>
+              <w:left w:val="single" w:color="BFC9D9" w:sz="4"/>
+              <w:bottom w:val="single" w:color="BFC9D9" w:sz="4"/>
+              <w:right w:val="single" w:color="BFC9D9" w:sz="4"/>
+            </w:tcBorders>
+            <w:shd w:fill="F2F5FA" w:color="auto" w:val="clear"/>
+            <w:tcMar>
+              <w:top w:type="dxa" w:w="60"/>
+              <w:left w:type="dxa" w:w="100"/>
+              <w:bottom w:type="dxa" w:w="60"/>
+              <w:right w:type="dxa" w:w="100"/>
+            </w:tcMar>
+          </w:tcPr>
+          <w:p>
+            <w:pPr>
+              <w:spacing w:after="0"/>
+            </w:pPr>
+            <w:r>
+              <w:rPr>
+                <w:sz w:val="18"/>
+                <w:szCs w:val="18"/>
+              </w:rPr>
+              <w:t xml:space="preserve">4</w:t>
+            </w:r>
+          </w:p>
+        </w:tc>
+        <w:tc>
+          <w:tcPr>
+            <w:tcW w:type="dxa" w:w="1638"/>
+            <w:tcBorders>
+              <w:top w:val="single" w:color="BFC9D9" w:sz="4"/>
+              <w:left w:val="single" w:color="BFC9D9" w:sz="4"/>
+              <w:bottom w:val="single" w:color="BFC9D9" w:sz="4"/>
+              <w:right w:val="single" w:color="BFC9D9" w:sz="4"/>
+            </w:tcBorders>
+            <w:shd w:fill="F2F5FA" w:color="auto" w:val="clear"/>
+            <w:tcMar>
+              <w:top w:type="dxa" w:w="60"/>
+              <w:left w:type="dxa" w:w="100"/>
+              <w:bottom w:type="dxa" w:w="60"/>
+              <w:right w:type="dxa" w:w="100"/>
+            </w:tcMar>
+          </w:tcPr>
+          <w:p>
+            <w:pPr>
+              <w:spacing w:after="0"/>
+            </w:pPr>
+            <w:r>
+              <w:rPr>
+                <w:sz w:val="18"/>
+                <w:szCs w:val="18"/>
+              </w:rPr>
               <w:t xml:space="preserve">HOLD</w:t>
             </w:r>
           </w:p>
@@ -8442,23 +8536,24 @@
               <w:bottom w:val="single" w:color="BFC9D9" w:sz="4"/>
               <w:right w:val="single" w:color="BFC9D9" w:sz="4"/>
             </w:tcBorders>
-            <w:tcMar>
-              <w:top w:type="dxa" w:w="60"/>
-              <w:left w:type="dxa" w:w="100"/>
-              <w:bottom w:type="dxa" w:w="60"/>
-              <w:right w:type="dxa" w:w="100"/>
-            </w:tcMar>
-          </w:tcPr>
-          <w:p>
-            <w:pPr>
-              <w:spacing w:after="0"/>
-            </w:pPr>
-            <w:r>
-              <w:rPr>
-                <w:sz w:val="18"/>
-                <w:szCs w:val="18"/>
-              </w:rPr>
-              <w:t xml:space="preserve">Otherwise. The reason adds "could add" when all four value tests still pass.</w:t>
+            <w:shd w:fill="F2F5FA" w:color="auto" w:val="clear"/>
+            <w:tcMar>
+              <w:top w:type="dxa" w:w="60"/>
+              <w:left w:type="dxa" w:w="100"/>
+              <w:bottom w:type="dxa" w:w="60"/>
+              <w:right w:type="dxa" w:w="100"/>
+            </w:tcMar>
+          </w:tcPr>
+          <w:p>
+            <w:pPr>
+              <w:spacing w:after="0"/>
+            </w:pPr>
+            <w:r>
+              <w:rPr>
+                <w:sz w:val="18"/>
+                <w:szCs w:val="18"/>
+              </w:rPr>
+              <w:t xml:space="preserve">Otherwise: no red flags, but fails one or more value tests (named in the reason), so not a candidate to add to.</w:t>
             </w:r>
           </w:p>
         </w:tc>
@@ -8481,7 +8576,7 @@
         <w:t xml:space="preserve">CGT timing note.</w:t>
       </w:r>
       <w:r>
-        <w:t xml:space="preserve"> On a SELL or REVIEW, if any open parcel becomes eligible for the 50% CGT discount within the next 90 days, the reason states how many units and from what date, so the timing of a sale can be considered.</w:t>
+        <w:t xml:space="preserve"> On a SELL or REVIEW, if any open parcel becomes eligible for the 50% CGT discount within the next 90 days, the reason states how many units and from what date, so the timing of a sale can be considered. The note never appears on ACCUMULATE or HOLD, since neither suggests selling.</w:t>
       </w:r>
     </w:p>
     <w:p>
@@ -8497,7 +8592,7 @@
         <w:spacing w:after="120"/>
       </w:pPr>
       <w:r>
-        <w:t xml:space="preserve">The action report groups companies as SELL, REVIEW, HOLD, BUY, INVESTIGATE, WATCH and AVOID, sorted by margin of safety within each group. IGNORE is counted only.</w:t>
+        <w:t xml:space="preserve">The action report groups companies as SELL, REVIEW, ACCUMULATE, HOLD, BUY, INVESTIGATE, WATCH and AVOID, sorted by margin of safety within each group. IGNORE is counted only.</w:t>
       </w:r>
     </w:p>
     <w:p>
@@ -11652,7 +11747,7 @@
                 <w:sz w:val="18"/>
                 <w:szCs w:val="18"/>
               </w:rPr>
-              <w:t xml:space="preserve">200-day moving average</w:t>
+              <w:t xml:space="preserve">Accumulate</w:t>
             </w:r>
           </w:p>
         </w:tc>
@@ -11682,7 +11777,7 @@
                 <w:sz w:val="18"/>
                 <w:szCs w:val="18"/>
               </w:rPr>
-              <w:t xml:space="preserve">The average of the last 200 daily closing prices. A common gauge of the longer-term price trend.</w:t>
+              <w:t xml:space="preserve">Add to a share you already hold. Suggested only when the share still meets the same standard as a new BUY.</w:t>
             </w:r>
           </w:p>
         </w:tc>
@@ -11716,7 +11811,7 @@
                 <w:sz w:val="18"/>
                 <w:szCs w:val="18"/>
               </w:rPr>
-              <w:t xml:space="preserve">Book value</w:t>
+              <w:t xml:space="preserve">200-day moving average</w:t>
             </w:r>
           </w:p>
         </w:tc>
@@ -11745,7 +11840,7 @@
                 <w:sz w:val="18"/>
                 <w:szCs w:val="18"/>
               </w:rPr>
-              <w:t xml:space="preserve">Total shareholders' equity from the balance sheet. Per share: equity divided by shares on issue.</w:t>
+              <w:t xml:space="preserve">The average of the last 200 daily closing prices. A common gauge of the longer-term price trend.</w:t>
             </w:r>
           </w:p>
         </w:tc>
@@ -11780,7 +11875,7 @@
                 <w:sz w:val="18"/>
                 <w:szCs w:val="18"/>
               </w:rPr>
-              <w:t xml:space="preserve">Capital proceeds</w:t>
+              <w:t xml:space="preserve">Book value</w:t>
             </w:r>
           </w:p>
         </w:tc>
@@ -11810,7 +11905,7 @@
                 <w:sz w:val="18"/>
                 <w:szCs w:val="18"/>
               </w:rPr>
-              <w:t xml:space="preserve">The sale value of a parcel less selling brokerage.</w:t>
+              <w:t xml:space="preserve">Total shareholders' equity from the balance sheet. Per share: equity divided by shares on issue.</w:t>
             </w:r>
           </w:p>
         </w:tc>
@@ -11844,7 +11939,7 @@
                 <w:sz w:val="18"/>
                 <w:szCs w:val="18"/>
               </w:rPr>
-              <w:t xml:space="preserve">CGT discount</w:t>
+              <w:t xml:space="preserve">Capital proceeds</w:t>
             </w:r>
           </w:p>
         </w:tc>
@@ -11873,7 +11968,7 @@
                 <w:sz w:val="18"/>
                 <w:szCs w:val="18"/>
               </w:rPr>
-              <w:t xml:space="preserve">The 50% reduction in a capital gain for individuals and trusts on shares held for more than 12 months.</w:t>
+              <w:t xml:space="preserve">The sale value of a parcel less selling brokerage.</w:t>
             </w:r>
           </w:p>
         </w:tc>
@@ -11908,7 +12003,7 @@
                 <w:sz w:val="18"/>
                 <w:szCs w:val="18"/>
               </w:rPr>
-              <w:t xml:space="preserve">Cost base</w:t>
+              <w:t xml:space="preserve">CGT discount</w:t>
             </w:r>
           </w:p>
         </w:tc>
@@ -11938,7 +12033,7 @@
                 <w:sz w:val="18"/>
                 <w:szCs w:val="18"/>
               </w:rPr>
-              <w:t xml:space="preserve">The purchase value of a parcel plus buying brokerage.</w:t>
+              <w:t xml:space="preserve">The 50% reduction in a capital gain for individuals and trusts on shares held for more than 12 months.</w:t>
             </w:r>
           </w:p>
         </w:tc>
@@ -11972,7 +12067,7 @@
                 <w:sz w:val="18"/>
                 <w:szCs w:val="18"/>
               </w:rPr>
-              <w:t xml:space="preserve">Discount rate</w:t>
+              <w:t xml:space="preserve">Cost base</w:t>
             </w:r>
           </w:p>
         </w:tc>
@@ -12001,7 +12096,7 @@
                 <w:sz w:val="18"/>
                 <w:szCs w:val="18"/>
               </w:rPr>
-              <w:t xml:space="preserve">The annual return required to justify the investment, used to convert future cash into today's dollars. 9% in this tool.</w:t>
+              <w:t xml:space="preserve">The purchase value of a parcel plus buying brokerage.</w:t>
             </w:r>
           </w:p>
         </w:tc>
@@ -12036,7 +12131,7 @@
                 <w:sz w:val="18"/>
                 <w:szCs w:val="18"/>
               </w:rPr>
-              <w:t xml:space="preserve">Franking credit</w:t>
+              <w:t xml:space="preserve">Discount rate</w:t>
             </w:r>
           </w:p>
         </w:tc>
@@ -12066,7 +12161,7 @@
                 <w:sz w:val="18"/>
                 <w:szCs w:val="18"/>
               </w:rPr>
-              <w:t xml:space="preserve">A credit for company tax already paid on a dividend, which Australian resident shareholders can offset against their own tax.</w:t>
+              <w:t xml:space="preserve">The annual return required to justify the investment, used to convert future cash into today's dollars. 9% in this tool.</w:t>
             </w:r>
           </w:p>
         </w:tc>
@@ -12100,7 +12195,7 @@
                 <w:sz w:val="18"/>
                 <w:szCs w:val="18"/>
               </w:rPr>
-              <w:t xml:space="preserve">Grossed-up yield</w:t>
+              <w:t xml:space="preserve">Franking credit</w:t>
             </w:r>
           </w:p>
         </w:tc>
@@ -12129,7 +12224,7 @@
                 <w:sz w:val="18"/>
                 <w:szCs w:val="18"/>
               </w:rPr>
-              <w:t xml:space="preserve">Dividend yield including the value of franking credits.</w:t>
+              <w:t xml:space="preserve">A credit for company tax already paid on a dividend, which Australian resident shareholders can offset against their own tax.</w:t>
             </w:r>
           </w:p>
         </w:tc>
@@ -12164,7 +12259,7 @@
                 <w:sz w:val="18"/>
                 <w:szCs w:val="18"/>
               </w:rPr>
-              <w:t xml:space="preserve">Intrinsic value</w:t>
+              <w:t xml:space="preserve">Grossed-up yield</w:t>
             </w:r>
           </w:p>
         </w:tc>
@@ -12194,7 +12289,7 @@
                 <w:sz w:val="18"/>
                 <w:szCs w:val="18"/>
               </w:rPr>
-              <w:t xml:space="preserve">The estimated value of a share based on the cash it is expected to generate, independent of the market price.</w:t>
+              <w:t xml:space="preserve">Dividend yield including the value of franking credits.</w:t>
             </w:r>
           </w:p>
         </w:tc>
@@ -12228,7 +12323,7 @@
                 <w:sz w:val="18"/>
                 <w:szCs w:val="18"/>
               </w:rPr>
-              <w:t xml:space="preserve">Margin of safety</w:t>
+              <w:t xml:space="preserve">Intrinsic value</w:t>
             </w:r>
           </w:p>
         </w:tc>
@@ -12257,7 +12352,7 @@
                 <w:sz w:val="18"/>
                 <w:szCs w:val="18"/>
               </w:rPr>
-              <w:t xml:space="preserve">How far the share price sits below intrinsic value. A buffer against errors in the estimate.</w:t>
+              <w:t xml:space="preserve">The estimated value of a share based on the cash it is expected to generate, independent of the market price.</w:t>
             </w:r>
           </w:p>
         </w:tc>
@@ -12292,7 +12387,7 @@
                 <w:sz w:val="18"/>
                 <w:szCs w:val="18"/>
               </w:rPr>
-              <w:t xml:space="preserve">Momentum (into value)</w:t>
+              <w:t xml:space="preserve">Margin of safety</w:t>
             </w:r>
           </w:p>
         </w:tc>
@@ -12322,7 +12417,7 @@
                 <w:sz w:val="18"/>
                 <w:szCs w:val="18"/>
               </w:rPr>
-              <w:t xml:space="preserve">A widening margin of safety: the share is getting cheaper relative to its estimated value.</w:t>
+              <w:t xml:space="preserve">How far the share price sits below intrinsic value. A buffer against errors in the estimate.</w:t>
             </w:r>
           </w:p>
         </w:tc>
@@ -12356,7 +12451,7 @@
                 <w:sz w:val="18"/>
                 <w:szCs w:val="18"/>
               </w:rPr>
-              <w:t xml:space="preserve">Parcel</w:t>
+              <w:t xml:space="preserve">Momentum (into value)</w:t>
             </w:r>
           </w:p>
         </w:tc>
@@ -12385,7 +12480,7 @@
                 <w:sz w:val="18"/>
                 <w:szCs w:val="18"/>
               </w:rPr>
-              <w:t xml:space="preserve">A single acquisition of shares, tracked separately for tax.</w:t>
+              <w:t xml:space="preserve">A widening margin of safety: the share is getting cheaper relative to its estimated value.</w:t>
             </w:r>
           </w:p>
         </w:tc>
@@ -12420,7 +12515,7 @@
                 <w:sz w:val="18"/>
                 <w:szCs w:val="18"/>
               </w:rPr>
-              <w:t xml:space="preserve">Payout ratio</w:t>
+              <w:t xml:space="preserve">Parcel</w:t>
             </w:r>
           </w:p>
         </w:tc>
@@ -12450,7 +12545,7 @@
                 <w:sz w:val="18"/>
                 <w:szCs w:val="18"/>
               </w:rPr>
-              <w:t xml:space="preserve">The share of earnings paid out as dividends.</w:t>
+              <w:t xml:space="preserve">A single acquisition of shares, tracked separately for tax.</w:t>
             </w:r>
           </w:p>
         </w:tc>
@@ -12484,7 +12579,7 @@
                 <w:sz w:val="18"/>
                 <w:szCs w:val="18"/>
               </w:rPr>
-              <w:t xml:space="preserve">Percentage point</w:t>
+              <w:t xml:space="preserve">Payout ratio</w:t>
             </w:r>
           </w:p>
         </w:tc>
@@ -12513,7 +12608,7 @@
                 <w:sz w:val="18"/>
                 <w:szCs w:val="18"/>
               </w:rPr>
-              <w:t xml:space="preserve">The simple difference between two percentages. Moving from 20% to 25% is a rise of 5 percentage points.</w:t>
+              <w:t xml:space="preserve">The share of earnings paid out as dividends.</w:t>
             </w:r>
           </w:p>
         </w:tc>
@@ -12548,7 +12643,7 @@
                 <w:sz w:val="18"/>
                 <w:szCs w:val="18"/>
               </w:rPr>
-              <w:t xml:space="preserve">Red flag</w:t>
+              <w:t xml:space="preserve">Percentage point</w:t>
             </w:r>
           </w:p>
         </w:tc>
@@ -12578,7 +12673,7 @@
                 <w:sz w:val="18"/>
                 <w:szCs w:val="18"/>
               </w:rPr>
-              <w:t xml:space="preserve">A condition that downgrades an otherwise attractive result (see section 9).</w:t>
+              <w:t xml:space="preserve">The simple difference between two percentages. Moving from 20% to 25% is a rise of 5 percentage points.</w:t>
             </w:r>
           </w:p>
         </w:tc>
@@ -12612,7 +12707,7 @@
                 <w:sz w:val="18"/>
                 <w:szCs w:val="18"/>
               </w:rPr>
-              <w:t xml:space="preserve">Shares on issue</w:t>
+              <w:t xml:space="preserve">Red flag</w:t>
             </w:r>
           </w:p>
         </w:tc>
@@ -12641,7 +12736,7 @@
                 <w:sz w:val="18"/>
                 <w:szCs w:val="18"/>
               </w:rPr>
-              <w:t xml:space="preserve">The total number of a company's shares held by investors.</w:t>
+              <w:t xml:space="preserve">A condition that downgrades an otherwise attractive result (see section 9).</w:t>
             </w:r>
           </w:p>
         </w:tc>
@@ -12676,7 +12771,7 @@
                 <w:sz w:val="18"/>
                 <w:szCs w:val="18"/>
               </w:rPr>
-              <w:t xml:space="preserve">Terminal value</w:t>
+              <w:t xml:space="preserve">Shares on issue</w:t>
             </w:r>
           </w:p>
         </w:tc>
@@ -12706,7 +12801,7 @@
                 <w:sz w:val="18"/>
                 <w:szCs w:val="18"/>
               </w:rPr>
-              <w:t xml:space="preserve">The value of all cash flows beyond the explicit forecast period, assuming steady growth thereafter.</w:t>
+              <w:t xml:space="preserve">The total number of a company's shares held by investors.</w:t>
             </w:r>
           </w:p>
         </w:tc>
@@ -12740,6 +12835,70 @@
                 <w:sz w:val="18"/>
                 <w:szCs w:val="18"/>
               </w:rPr>
+              <w:t xml:space="preserve">Terminal value</w:t>
+            </w:r>
+          </w:p>
+        </w:tc>
+        <w:tc>
+          <w:tcPr>
+            <w:tcW w:type="dxa" w:w="7133"/>
+            <w:tcBorders>
+              <w:top w:val="single" w:color="BFC9D9" w:sz="4"/>
+              <w:left w:val="single" w:color="BFC9D9" w:sz="4"/>
+              <w:bottom w:val="single" w:color="BFC9D9" w:sz="4"/>
+              <w:right w:val="single" w:color="BFC9D9" w:sz="4"/>
+            </w:tcBorders>
+            <w:tcMar>
+              <w:top w:type="dxa" w:w="60"/>
+              <w:left w:type="dxa" w:w="100"/>
+              <w:bottom w:type="dxa" w:w="60"/>
+              <w:right w:type="dxa" w:w="100"/>
+            </w:tcMar>
+          </w:tcPr>
+          <w:p>
+            <w:pPr>
+              <w:spacing w:after="0"/>
+            </w:pPr>
+            <w:r>
+              <w:rPr>
+                <w:sz w:val="18"/>
+                <w:szCs w:val="18"/>
+              </w:rPr>
+              <w:t xml:space="preserve">The value of all cash flows beyond the explicit forecast period, assuming steady growth thereafter.</w:t>
+            </w:r>
+          </w:p>
+        </w:tc>
+      </w:tr>
+      <w:tr>
+        <w:trPr>
+          <w:cantSplit/>
+        </w:trPr>
+        <w:tc>
+          <w:tcPr>
+            <w:tcW w:type="dxa" w:w="2505"/>
+            <w:tcBorders>
+              <w:top w:val="single" w:color="BFC9D9" w:sz="4"/>
+              <w:left w:val="single" w:color="BFC9D9" w:sz="4"/>
+              <w:bottom w:val="single" w:color="BFC9D9" w:sz="4"/>
+              <w:right w:val="single" w:color="BFC9D9" w:sz="4"/>
+            </w:tcBorders>
+            <w:shd w:fill="F2F5FA" w:color="auto" w:val="clear"/>
+            <w:tcMar>
+              <w:top w:type="dxa" w:w="60"/>
+              <w:left w:type="dxa" w:w="100"/>
+              <w:bottom w:type="dxa" w:w="60"/>
+              <w:right w:type="dxa" w:w="100"/>
+            </w:tcMar>
+          </w:tcPr>
+          <w:p>
+            <w:pPr>
+              <w:spacing w:after="0"/>
+            </w:pPr>
+            <w:r>
+              <w:rPr>
+                <w:sz w:val="18"/>
+                <w:szCs w:val="18"/>
+              </w:rPr>
               <w:t xml:space="preserve">Value trap</w:t>
             </w:r>
           </w:p>
@@ -12753,6 +12912,7 @@
               <w:bottom w:val="single" w:color="BFC9D9" w:sz="4"/>
               <w:right w:val="single" w:color="BFC9D9" w:sz="4"/>
             </w:tcBorders>
+            <w:shd w:fill="F2F5FA" w:color="auto" w:val="clear"/>
             <w:tcMar>
               <w:top w:type="dxa" w:w="60"/>
               <w:left w:type="dxa" w:w="100"/>

</xml_diff>

<commit_message>
Add multiple watchlists with notes and triggers (stage 3)
- watchlists and watchlist_items tables: a note per company, and triggers
  for margin of safety above X% and price at or below $Y
- Watchlists overview and a page per list (add, edit, remove, rename,
  delete, each removal confirmed); Add to watchlist panel on company pages
- Screener: a pink star on watched companies and a watchlist filter
- Dashboard: met triggers under Needs attention; watched companies first
  in What changed; Watchlists menu lists each list
- Writes use the same password, same-page guard and one-transaction rule
  as portfolios
- Docs: README, OVERVIEW, AS_BUILT (section 22, known issue 28) and the
  rules document (11.5 Watchlists)

Co-Authored-By: Claude Opus 5.5 <noreply@anthropic.com>
Claude-Session: https://claude.ai/code/session_013woDwy1Jw8XbwbT1HUNgCF
</commit_message>
<xml_diff>
--- a/docs/ASX_Value_Screener_Rules_and_Methodology.docx
+++ b/docs/ASX_Value_Screener_Rules_and_Methodology.docx
@@ -9957,7 +9957,7 @@
                 <w:sz w:val="18"/>
                 <w:szCs w:val="18"/>
               </w:rPr>
-              <w:t xml:space="preserve">Held shares with a SELL or REVIEW action, parcels that reach the CGT discount within 90 days, and held shares missing from the watchlist file.</w:t>
+              <w:t xml:space="preserve">Held shares with a SELL or REVIEW action, parcels that reach the CGT discount within 90 days, held shares missing from the nightly ticker file, and watchlist entries whose trigger is met (section 11.5).</w:t>
             </w:r>
           </w:p>
         </w:tc>
@@ -10022,7 +10022,7 @@
                 <w:sz w:val="18"/>
                 <w:szCs w:val="18"/>
               </w:rPr>
-              <w:t xml:space="preserve">Companies whose suggested action moved between the latest two nights of recorded signals, ranked BUY and ACCUMULATE, then INVESTIGATE, then WATCH and HOLD, then REVIEW and IGNORE, then AVOID and SELL. A move within the same rank, or one caused by buying or selling the shares, is not listed. Better moves are listed first.</w:t>
+              <w:t xml:space="preserve">Companies whose suggested action moved between the latest two nights of recorded signals, ranked BUY and ACCUMULATE, then INVESTIGATE, then WATCH and HOLD, then REVIEW and IGNORE, then AVOID and SELL. A move within the same rank, or one caused by buying or selling the shares, is not listed. Companies on a watchlist are listed first, then better moves first.</w:t>
             </w:r>
           </w:p>
         </w:tc>
@@ -10228,6 +10228,277 @@
       </w:pPr>
       <w:r>
         <w:t xml:space="preserve">Each signal will be compared with the share's total return, including dividends, after 1, 3, 6 and 12 months, against the average of every screened company over the same period. A suggestion to buy that beats the average counts as right.</w:t>
+      </w:r>
+    </w:p>
+    <w:p>
+      <w:pPr>
+        <w:pStyle w:val="Heading2"/>
+      </w:pPr>
+      <w:r>
+        <w:t xml:space="preserve">11.5 Watchlists</w:t>
+      </w:r>
+    </w:p>
+    <w:p>
+      <w:pPr>
+        <w:spacing w:after="120"/>
+      </w:pPr>
+      <w:r>
+        <w:t xml:space="preserve">Watchlists are named lists of companies to follow without owning them. Only companies Sift values can be added. Each entry can carry a note and up to two triggers.</w:t>
+      </w:r>
+    </w:p>
+    <w:tbl>
+      <w:tblPr>
+        <w:tblW w:type="dxa" w:w="9638"/>
+        <w:tblBorders>
+          <w:top w:val="single" w:color="auto" w:sz="4"/>
+          <w:left w:val="single" w:color="auto" w:sz="4"/>
+          <w:bottom w:val="single" w:color="auto" w:sz="4"/>
+          <w:right w:val="single" w:color="auto" w:sz="4"/>
+          <w:insideH w:val="single" w:color="auto" w:sz="4"/>
+          <w:insideV w:val="single" w:color="auto" w:sz="4"/>
+        </w:tblBorders>
+      </w:tblPr>
+      <w:tblGrid>
+        <w:gridCol w:w="2891"/>
+        <w:gridCol w:w="6747"/>
+      </w:tblGrid>
+      <w:tr>
+        <w:trPr>
+          <w:tblHeader/>
+        </w:trPr>
+        <w:tc>
+          <w:tcPr>
+            <w:tcW w:type="dxa" w:w="2891"/>
+            <w:tcBorders>
+              <w:top w:val="single" w:color="BFC9D9" w:sz="4"/>
+              <w:left w:val="single" w:color="BFC9D9" w:sz="4"/>
+              <w:bottom w:val="single" w:color="BFC9D9" w:sz="4"/>
+              <w:right w:val="single" w:color="BFC9D9" w:sz="4"/>
+            </w:tcBorders>
+            <w:shd w:fill="D9E2F3" w:color="auto" w:val="clear"/>
+            <w:tcMar>
+              <w:top w:type="dxa" w:w="60"/>
+              <w:left w:type="dxa" w:w="100"/>
+              <w:bottom w:type="dxa" w:w="60"/>
+              <w:right w:type="dxa" w:w="100"/>
+            </w:tcMar>
+          </w:tcPr>
+          <w:p>
+            <w:pPr>
+              <w:spacing w:after="0"/>
+            </w:pPr>
+            <w:r>
+              <w:rPr>
+                <w:b/>
+                <w:bCs/>
+                <w:color w:val="1F3864"/>
+                <w:sz w:val="18"/>
+                <w:szCs w:val="18"/>
+              </w:rPr>
+              <w:t xml:space="preserve">Trigger</w:t>
+            </w:r>
+          </w:p>
+        </w:tc>
+        <w:tc>
+          <w:tcPr>
+            <w:tcW w:type="dxa" w:w="6747"/>
+            <w:tcBorders>
+              <w:top w:val="single" w:color="BFC9D9" w:sz="4"/>
+              <w:left w:val="single" w:color="BFC9D9" w:sz="4"/>
+              <w:bottom w:val="single" w:color="BFC9D9" w:sz="4"/>
+              <w:right w:val="single" w:color="BFC9D9" w:sz="4"/>
+            </w:tcBorders>
+            <w:shd w:fill="D9E2F3" w:color="auto" w:val="clear"/>
+            <w:tcMar>
+              <w:top w:type="dxa" w:w="60"/>
+              <w:left w:type="dxa" w:w="100"/>
+              <w:bottom w:type="dxa" w:w="60"/>
+              <w:right w:type="dxa" w:w="100"/>
+            </w:tcMar>
+          </w:tcPr>
+          <w:p>
+            <w:pPr>
+              <w:spacing w:after="0"/>
+            </w:pPr>
+            <w:r>
+              <w:rPr>
+                <w:b/>
+                <w:bCs/>
+                <w:color w:val="1F3864"/>
+                <w:sz w:val="18"/>
+                <w:szCs w:val="18"/>
+              </w:rPr>
+              <w:t xml:space="preserve">Met while</w:t>
+            </w:r>
+          </w:p>
+        </w:tc>
+      </w:tr>
+      <w:tr>
+        <w:trPr>
+          <w:cantSplit/>
+        </w:trPr>
+        <w:tc>
+          <w:tcPr>
+            <w:tcW w:type="dxa" w:w="2891"/>
+            <w:tcBorders>
+              <w:top w:val="single" w:color="BFC9D9" w:sz="4"/>
+              <w:left w:val="single" w:color="BFC9D9" w:sz="4"/>
+              <w:bottom w:val="single" w:color="BFC9D9" w:sz="4"/>
+              <w:right w:val="single" w:color="BFC9D9" w:sz="4"/>
+            </w:tcBorders>
+            <w:tcMar>
+              <w:top w:type="dxa" w:w="60"/>
+              <w:left w:type="dxa" w:w="100"/>
+              <w:bottom w:type="dxa" w:w="60"/>
+              <w:right w:type="dxa" w:w="100"/>
+            </w:tcMar>
+          </w:tcPr>
+          <w:p>
+            <w:pPr>
+              <w:spacing w:after="0"/>
+            </w:pPr>
+            <w:r>
+              <w:rPr>
+                <w:sz w:val="18"/>
+                <w:szCs w:val="18"/>
+              </w:rPr>
+              <w:t xml:space="preserve">Margin of safety above X%</w:t>
+            </w:r>
+          </w:p>
+        </w:tc>
+        <w:tc>
+          <w:tcPr>
+            <w:tcW w:type="dxa" w:w="6747"/>
+            <w:tcBorders>
+              <w:top w:val="single" w:color="BFC9D9" w:sz="4"/>
+              <w:left w:val="single" w:color="BFC9D9" w:sz="4"/>
+              <w:bottom w:val="single" w:color="BFC9D9" w:sz="4"/>
+              <w:right w:val="single" w:color="BFC9D9" w:sz="4"/>
+            </w:tcBorders>
+            <w:tcMar>
+              <w:top w:type="dxa" w:w="60"/>
+              <w:left w:type="dxa" w:w="100"/>
+              <w:bottom w:type="dxa" w:w="60"/>
+              <w:right w:type="dxa" w:w="100"/>
+            </w:tcMar>
+          </w:tcPr>
+          <w:p>
+            <w:pPr>
+              <w:spacing w:after="0"/>
+            </w:pPr>
+            <w:r>
+              <w:rPr>
+                <w:sz w:val="18"/>
+                <w:szCs w:val="18"/>
+              </w:rPr>
+              <w:t xml:space="preserve">The company's current margin of safety is strictly above X. X may be negative.</w:t>
+            </w:r>
+          </w:p>
+        </w:tc>
+      </w:tr>
+      <w:tr>
+        <w:trPr>
+          <w:cantSplit/>
+        </w:trPr>
+        <w:tc>
+          <w:tcPr>
+            <w:tcW w:type="dxa" w:w="2891"/>
+            <w:tcBorders>
+              <w:top w:val="single" w:color="BFC9D9" w:sz="4"/>
+              <w:left w:val="single" w:color="BFC9D9" w:sz="4"/>
+              <w:bottom w:val="single" w:color="BFC9D9" w:sz="4"/>
+              <w:right w:val="single" w:color="BFC9D9" w:sz="4"/>
+            </w:tcBorders>
+            <w:shd w:fill="F2F5FA" w:color="auto" w:val="clear"/>
+            <w:tcMar>
+              <w:top w:type="dxa" w:w="60"/>
+              <w:left w:type="dxa" w:w="100"/>
+              <w:bottom w:type="dxa" w:w="60"/>
+              <w:right w:type="dxa" w:w="100"/>
+            </w:tcMar>
+          </w:tcPr>
+          <w:p>
+            <w:pPr>
+              <w:spacing w:after="0"/>
+            </w:pPr>
+            <w:r>
+              <w:rPr>
+                <w:sz w:val="18"/>
+                <w:szCs w:val="18"/>
+              </w:rPr>
+              <w:t xml:space="preserve">Price at or below $Y</w:t>
+            </w:r>
+          </w:p>
+        </w:tc>
+        <w:tc>
+          <w:tcPr>
+            <w:tcW w:type="dxa" w:w="6747"/>
+            <w:tcBorders>
+              <w:top w:val="single" w:color="BFC9D9" w:sz="4"/>
+              <w:left w:val="single" w:color="BFC9D9" w:sz="4"/>
+              <w:bottom w:val="single" w:color="BFC9D9" w:sz="4"/>
+              <w:right w:val="single" w:color="BFC9D9" w:sz="4"/>
+            </w:tcBorders>
+            <w:shd w:fill="F2F5FA" w:color="auto" w:val="clear"/>
+            <w:tcMar>
+              <w:top w:type="dxa" w:w="60"/>
+              <w:left w:type="dxa" w:w="100"/>
+              <w:bottom w:type="dxa" w:w="60"/>
+              <w:right w:type="dxa" w:w="100"/>
+            </w:tcMar>
+          </w:tcPr>
+          <w:p>
+            <w:pPr>
+              <w:spacing w:after="0"/>
+            </w:pPr>
+            <w:r>
+              <w:rPr>
+                <w:sz w:val="18"/>
+                <w:szCs w:val="18"/>
+              </w:rPr>
+              <w:t xml:space="preserve">The latest closing price is at or below Y. Y must be above zero.</w:t>
+            </w:r>
+          </w:p>
+        </w:tc>
+      </w:tr>
+    </w:tbl>
+    <w:p>
+      <w:pPr>
+        <w:pStyle w:val="ListParagraph"/>
+        <w:numPr>
+          <w:ilvl w:val="0"/>
+          <w:numId w:val="2"/>
+        </w:numPr>
+        <w:spacing w:after="60"/>
+      </w:pPr>
+      <w:r>
+        <w:t xml:space="preserve">A trigger is a live condition, not an alert: it shows while it is true and disappears when it stops being true.</w:t>
+      </w:r>
+    </w:p>
+    <w:p>
+      <w:pPr>
+        <w:pStyle w:val="ListParagraph"/>
+        <w:numPr>
+          <w:ilvl w:val="0"/>
+          <w:numId w:val="2"/>
+        </w:numPr>
+        <w:spacing w:after="60"/>
+      </w:pPr>
+      <w:r>
+        <w:t xml:space="preserve">A company with no current valuation or price meets neither trigger.</w:t>
+      </w:r>
+    </w:p>
+    <w:p>
+      <w:pPr>
+        <w:pStyle w:val="ListParagraph"/>
+        <w:numPr>
+          <w:ilvl w:val="0"/>
+          <w:numId w:val="2"/>
+        </w:numPr>
+        <w:spacing w:after="60"/>
+      </w:pPr>
+      <w:r>
+        <w:t xml:space="preserve">Watchlists are separate from the nightly ticker file, which decides which companies are valued at all.</w:t>
       </w:r>
     </w:p>
     <w:p>

</xml_diff>

<commit_message>
Add a searchable Help page backed by a single knowledge base
- web/knowledge.json: 78 entries merging every hover explanation, acronym
  and glossary term (one per concept) plus guides to each part of Sift,
  with live-threshold placeholders, aliases, related terms and links
- Help page (#/help): search, topic filters, deep links; the menu search
  now finds terms as well as companies
- Hover explanations now load from the knowledge base
- scripts/build_rules_doc.js: the Word document's builder, now in the
  repo; its glossary comes from the knowledge base (output unchanged
  apart from one row now sorted correctly)
- Tests for the knowledge base's integrity; docs updated (README,
  OVERVIEW, AS_BUILT section 23)

Co-Authored-By: Claude Opus 5.5 <noreply@anthropic.com>
Claude-Session: https://claude.ai/code/session_013woDwy1Jw8XbwbT1HUNgCF
</commit_message>
<xml_diff>
--- a/docs/ASX_Value_Screener_Rules_and_Methodology.docx
+++ b/docs/ASX_Value_Screener_Rules_and_Methodology.docx
@@ -16469,6 +16469,70 @@
                 <w:sz w:val="18"/>
                 <w:szCs w:val="18"/>
               </w:rPr>
+              <w:t xml:space="preserve">Shares on issue</w:t>
+            </w:r>
+          </w:p>
+        </w:tc>
+        <w:tc>
+          <w:tcPr>
+            <w:tcW w:type="dxa" w:w="7133"/>
+            <w:tcBorders>
+              <w:top w:val="single" w:color="BFC9D9" w:sz="4"/>
+              <w:left w:val="single" w:color="BFC9D9" w:sz="4"/>
+              <w:bottom w:val="single" w:color="BFC9D9" w:sz="4"/>
+              <w:right w:val="single" w:color="BFC9D9" w:sz="4"/>
+            </w:tcBorders>
+            <w:shd w:fill="F2F5FA" w:color="auto" w:val="clear"/>
+            <w:tcMar>
+              <w:top w:type="dxa" w:w="60"/>
+              <w:left w:type="dxa" w:w="100"/>
+              <w:bottom w:type="dxa" w:w="60"/>
+              <w:right w:type="dxa" w:w="100"/>
+            </w:tcMar>
+          </w:tcPr>
+          <w:p>
+            <w:pPr>
+              <w:spacing w:after="0"/>
+            </w:pPr>
+            <w:r>
+              <w:rPr>
+                <w:sz w:val="18"/>
+                <w:szCs w:val="18"/>
+              </w:rPr>
+              <w:t xml:space="preserve">The total number of a company's shares held by investors.</w:t>
+            </w:r>
+          </w:p>
+        </w:tc>
+      </w:tr>
+      <w:tr>
+        <w:trPr>
+          <w:cantSplit/>
+        </w:trPr>
+        <w:tc>
+          <w:tcPr>
+            <w:tcW w:type="dxa" w:w="2505"/>
+            <w:tcBorders>
+              <w:top w:val="single" w:color="BFC9D9" w:sz="4"/>
+              <w:left w:val="single" w:color="BFC9D9" w:sz="4"/>
+              <w:bottom w:val="single" w:color="BFC9D9" w:sz="4"/>
+              <w:right w:val="single" w:color="BFC9D9" w:sz="4"/>
+            </w:tcBorders>
+            <w:tcMar>
+              <w:top w:type="dxa" w:w="60"/>
+              <w:left w:type="dxa" w:w="100"/>
+              <w:bottom w:type="dxa" w:w="60"/>
+              <w:right w:type="dxa" w:w="100"/>
+            </w:tcMar>
+          </w:tcPr>
+          <w:p>
+            <w:pPr>
+              <w:spacing w:after="0"/>
+            </w:pPr>
+            <w:r>
+              <w:rPr>
+                <w:sz w:val="18"/>
+                <w:szCs w:val="18"/>
+              </w:rPr>
               <w:t xml:space="preserve">Signal</w:t>
             </w:r>
           </w:p>
@@ -16482,7 +16546,6 @@
               <w:bottom w:val="single" w:color="BFC9D9" w:sz="4"/>
               <w:right w:val="single" w:color="BFC9D9" w:sz="4"/>
             </w:tcBorders>
-            <w:shd w:fill="F2F5FA" w:color="auto" w:val="clear"/>
             <w:tcMar>
               <w:top w:type="dxa" w:w="60"/>
               <w:left w:type="dxa" w:w="100"/>
@@ -16500,69 +16563,6 @@
                 <w:szCs w:val="18"/>
               </w:rPr>
               <w:t xml:space="preserve">What Sift said about a company on a given night: its suggested action, valuation status, estimated value and score, recorded for the track record (see section 11.4).</w:t>
-            </w:r>
-          </w:p>
-        </w:tc>
-      </w:tr>
-      <w:tr>
-        <w:trPr>
-          <w:cantSplit/>
-        </w:trPr>
-        <w:tc>
-          <w:tcPr>
-            <w:tcW w:type="dxa" w:w="2505"/>
-            <w:tcBorders>
-              <w:top w:val="single" w:color="BFC9D9" w:sz="4"/>
-              <w:left w:val="single" w:color="BFC9D9" w:sz="4"/>
-              <w:bottom w:val="single" w:color="BFC9D9" w:sz="4"/>
-              <w:right w:val="single" w:color="BFC9D9" w:sz="4"/>
-            </w:tcBorders>
-            <w:tcMar>
-              <w:top w:type="dxa" w:w="60"/>
-              <w:left w:type="dxa" w:w="100"/>
-              <w:bottom w:type="dxa" w:w="60"/>
-              <w:right w:type="dxa" w:w="100"/>
-            </w:tcMar>
-          </w:tcPr>
-          <w:p>
-            <w:pPr>
-              <w:spacing w:after="0"/>
-            </w:pPr>
-            <w:r>
-              <w:rPr>
-                <w:sz w:val="18"/>
-                <w:szCs w:val="18"/>
-              </w:rPr>
-              <w:t xml:space="preserve">Shares on issue</w:t>
-            </w:r>
-          </w:p>
-        </w:tc>
-        <w:tc>
-          <w:tcPr>
-            <w:tcW w:type="dxa" w:w="7133"/>
-            <w:tcBorders>
-              <w:top w:val="single" w:color="BFC9D9" w:sz="4"/>
-              <w:left w:val="single" w:color="BFC9D9" w:sz="4"/>
-              <w:bottom w:val="single" w:color="BFC9D9" w:sz="4"/>
-              <w:right w:val="single" w:color="BFC9D9" w:sz="4"/>
-            </w:tcBorders>
-            <w:tcMar>
-              <w:top w:type="dxa" w:w="60"/>
-              <w:left w:type="dxa" w:w="100"/>
-              <w:bottom w:type="dxa" w:w="60"/>
-              <w:right w:type="dxa" w:w="100"/>
-            </w:tcMar>
-          </w:tcPr>
-          <w:p>
-            <w:pPr>
-              <w:spacing w:after="0"/>
-            </w:pPr>
-            <w:r>
-              <w:rPr>
-                <w:sz w:val="18"/>
-                <w:szCs w:val="18"/>
-              </w:rPr>
-              <w:t xml:space="preserve">The total number of a company's shares held by investors.</w:t>
             </w:r>
           </w:p>
         </w:tc>

</xml_diff>

<commit_message>
Add analyst ratings, price targets and holders to company pages
From Yahoo Finance, for context only (never used in valuations, scores or
signals):
- company_insights, analyst_ratings and top_holders tables
- YahooClient.get_insights(): consensus and price targets, monthly rating
  counts, major holders, top 10 mutual fund and institutional holders
- insights_ingestion: weekly refresh, a seventh of the shares each night
  (never fetched first), run by run_ingestion; --insights-only,
  --insights-all and --skip-insights
- Company page cards: Analyst ratings (stacked monthly bars on a validated
  diverging scale), Analyst price targets (range strip with price, average
  target and Sift's estimated value), Holders (major holders, both top 10
  tables with value at today's price)
- Help topic "Analysts and holders", AS_BUILT §29, known issue #34

Co-Authored-By: Claude Opus 5.5 <noreply@anthropic.com>
Claude-Session: https://claude.ai/code/session_013woDwy1Jw8XbwbT1HUNgCF
</commit_message>
<xml_diff>
--- a/docs/ASX_Value_Screener_Rules_and_Methodology.docx
+++ b/docs/ASX_Value_Screener_Rules_and_Methodology.docx
@@ -16881,6 +16881,70 @@
                 <w:sz w:val="18"/>
                 <w:szCs w:val="18"/>
               </w:rPr>
+              <w:t xml:space="preserve">Analyst ratings</w:t>
+            </w:r>
+          </w:p>
+        </w:tc>
+        <w:tc>
+          <w:tcPr>
+            <w:tcW w:type="dxa" w:w="7133"/>
+            <w:tcBorders>
+              <w:top w:val="single" w:color="BFC9D9" w:sz="4"/>
+              <w:left w:val="single" w:color="BFC9D9" w:sz="4"/>
+              <w:bottom w:val="single" w:color="BFC9D9" w:sz="4"/>
+              <w:right w:val="single" w:color="BFC9D9" w:sz="4"/>
+            </w:tcBorders>
+            <w:tcMar>
+              <w:top w:type="dxa" w:w="60"/>
+              <w:left w:type="dxa" w:w="100"/>
+              <w:bottom w:type="dxa" w:w="60"/>
+              <w:right w:type="dxa" w:w="100"/>
+            </w:tcMar>
+          </w:tcPr>
+          <w:p>
+            <w:pPr>
+              <w:spacing w:after="0"/>
+            </w:pPr>
+            <w:r>
+              <w:rPr>
+                <w:sz w:val="18"/>
+                <w:szCs w:val="18"/>
+              </w:rPr>
+              <w:t xml:space="preserve">How many broker analysts rate a share strong buy, buy, hold, sell or strong sell, month by month, as collected by Yahoo Finance.</w:t>
+            </w:r>
+          </w:p>
+        </w:tc>
+      </w:tr>
+      <w:tr>
+        <w:trPr>
+          <w:cantSplit/>
+        </w:trPr>
+        <w:tc>
+          <w:tcPr>
+            <w:tcW w:type="dxa" w:w="2505"/>
+            <w:tcBorders>
+              <w:top w:val="single" w:color="BFC9D9" w:sz="4"/>
+              <w:left w:val="single" w:color="BFC9D9" w:sz="4"/>
+              <w:bottom w:val="single" w:color="BFC9D9" w:sz="4"/>
+              <w:right w:val="single" w:color="BFC9D9" w:sz="4"/>
+            </w:tcBorders>
+            <w:shd w:fill="F2F5FA" w:color="auto" w:val="clear"/>
+            <w:tcMar>
+              <w:top w:type="dxa" w:w="60"/>
+              <w:left w:type="dxa" w:w="100"/>
+              <w:bottom w:type="dxa" w:w="60"/>
+              <w:right w:type="dxa" w:w="100"/>
+            </w:tcMar>
+          </w:tcPr>
+          <w:p>
+            <w:pPr>
+              <w:spacing w:after="0"/>
+            </w:pPr>
+            <w:r>
+              <w:rPr>
+                <w:sz w:val="18"/>
+                <w:szCs w:val="18"/>
+              </w:rPr>
               <w:t xml:space="preserve">Book value</w:t>
             </w:r>
           </w:p>
@@ -16894,6 +16958,7 @@
               <w:bottom w:val="single" w:color="BFC9D9" w:sz="4"/>
               <w:right w:val="single" w:color="BFC9D9" w:sz="4"/>
             </w:tcBorders>
+            <w:shd w:fill="F2F5FA" w:color="auto" w:val="clear"/>
             <w:tcMar>
               <w:top w:type="dxa" w:w="60"/>
               <w:left w:type="dxa" w:w="100"/>
@@ -16928,7 +16993,6 @@
               <w:bottom w:val="single" w:color="BFC9D9" w:sz="4"/>
               <w:right w:val="single" w:color="BFC9D9" w:sz="4"/>
             </w:tcBorders>
-            <w:shd w:fill="F2F5FA" w:color="auto" w:val="clear"/>
             <w:tcMar>
               <w:top w:type="dxa" w:w="60"/>
               <w:left w:type="dxa" w:w="100"/>
@@ -16958,7 +17022,6 @@
               <w:bottom w:val="single" w:color="BFC9D9" w:sz="4"/>
               <w:right w:val="single" w:color="BFC9D9" w:sz="4"/>
             </w:tcBorders>
-            <w:shd w:fill="F2F5FA" w:color="auto" w:val="clear"/>
             <w:tcMar>
               <w:top w:type="dxa" w:w="60"/>
               <w:left w:type="dxa" w:w="100"/>
@@ -16993,6 +17056,7 @@
               <w:bottom w:val="single" w:color="BFC9D9" w:sz="4"/>
               <w:right w:val="single" w:color="BFC9D9" w:sz="4"/>
             </w:tcBorders>
+            <w:shd w:fill="F2F5FA" w:color="auto" w:val="clear"/>
             <w:tcMar>
               <w:top w:type="dxa" w:w="60"/>
               <w:left w:type="dxa" w:w="100"/>
@@ -17022,6 +17086,7 @@
               <w:bottom w:val="single" w:color="BFC9D9" w:sz="4"/>
               <w:right w:val="single" w:color="BFC9D9" w:sz="4"/>
             </w:tcBorders>
+            <w:shd w:fill="F2F5FA" w:color="auto" w:val="clear"/>
             <w:tcMar>
               <w:top w:type="dxa" w:w="60"/>
               <w:left w:type="dxa" w:w="100"/>
@@ -17056,7 +17121,6 @@
               <w:bottom w:val="single" w:color="BFC9D9" w:sz="4"/>
               <w:right w:val="single" w:color="BFC9D9" w:sz="4"/>
             </w:tcBorders>
-            <w:shd w:fill="F2F5FA" w:color="auto" w:val="clear"/>
             <w:tcMar>
               <w:top w:type="dxa" w:w="60"/>
               <w:left w:type="dxa" w:w="100"/>
@@ -17086,7 +17150,6 @@
               <w:bottom w:val="single" w:color="BFC9D9" w:sz="4"/>
               <w:right w:val="single" w:color="BFC9D9" w:sz="4"/>
             </w:tcBorders>
-            <w:shd w:fill="F2F5FA" w:color="auto" w:val="clear"/>
             <w:tcMar>
               <w:top w:type="dxa" w:w="60"/>
               <w:left w:type="dxa" w:w="100"/>
@@ -17121,6 +17184,7 @@
               <w:bottom w:val="single" w:color="BFC9D9" w:sz="4"/>
               <w:right w:val="single" w:color="BFC9D9" w:sz="4"/>
             </w:tcBorders>
+            <w:shd w:fill="F2F5FA" w:color="auto" w:val="clear"/>
             <w:tcMar>
               <w:top w:type="dxa" w:w="60"/>
               <w:left w:type="dxa" w:w="100"/>
@@ -17150,6 +17214,7 @@
               <w:bottom w:val="single" w:color="BFC9D9" w:sz="4"/>
               <w:right w:val="single" w:color="BFC9D9" w:sz="4"/>
             </w:tcBorders>
+            <w:shd w:fill="F2F5FA" w:color="auto" w:val="clear"/>
             <w:tcMar>
               <w:top w:type="dxa" w:w="60"/>
               <w:left w:type="dxa" w:w="100"/>
@@ -17184,7 +17249,6 @@
               <w:bottom w:val="single" w:color="BFC9D9" w:sz="4"/>
               <w:right w:val="single" w:color="BFC9D9" w:sz="4"/>
             </w:tcBorders>
-            <w:shd w:fill="F2F5FA" w:color="auto" w:val="clear"/>
             <w:tcMar>
               <w:top w:type="dxa" w:w="60"/>
               <w:left w:type="dxa" w:w="100"/>
@@ -17214,7 +17278,6 @@
               <w:bottom w:val="single" w:color="BFC9D9" w:sz="4"/>
               <w:right w:val="single" w:color="BFC9D9" w:sz="4"/>
             </w:tcBorders>
-            <w:shd w:fill="F2F5FA" w:color="auto" w:val="clear"/>
             <w:tcMar>
               <w:top w:type="dxa" w:w="60"/>
               <w:left w:type="dxa" w:w="100"/>
@@ -17249,6 +17312,7 @@
               <w:bottom w:val="single" w:color="BFC9D9" w:sz="4"/>
               <w:right w:val="single" w:color="BFC9D9" w:sz="4"/>
             </w:tcBorders>
+            <w:shd w:fill="F2F5FA" w:color="auto" w:val="clear"/>
             <w:tcMar>
               <w:top w:type="dxa" w:w="60"/>
               <w:left w:type="dxa" w:w="100"/>
@@ -17278,6 +17342,7 @@
               <w:bottom w:val="single" w:color="BFC9D9" w:sz="4"/>
               <w:right w:val="single" w:color="BFC9D9" w:sz="4"/>
             </w:tcBorders>
+            <w:shd w:fill="F2F5FA" w:color="auto" w:val="clear"/>
             <w:tcMar>
               <w:top w:type="dxa" w:w="60"/>
               <w:left w:type="dxa" w:w="100"/>
@@ -17312,7 +17377,6 @@
               <w:bottom w:val="single" w:color="BFC9D9" w:sz="4"/>
               <w:right w:val="single" w:color="BFC9D9" w:sz="4"/>
             </w:tcBorders>
-            <w:shd w:fill="F2F5FA" w:color="auto" w:val="clear"/>
             <w:tcMar>
               <w:top w:type="dxa" w:w="60"/>
               <w:left w:type="dxa" w:w="100"/>
@@ -17342,7 +17406,6 @@
               <w:bottom w:val="single" w:color="BFC9D9" w:sz="4"/>
               <w:right w:val="single" w:color="BFC9D9" w:sz="4"/>
             </w:tcBorders>
-            <w:shd w:fill="F2F5FA" w:color="auto" w:val="clear"/>
             <w:tcMar>
               <w:top w:type="dxa" w:w="60"/>
               <w:left w:type="dxa" w:w="100"/>
@@ -17377,6 +17440,7 @@
               <w:bottom w:val="single" w:color="BFC9D9" w:sz="4"/>
               <w:right w:val="single" w:color="BFC9D9" w:sz="4"/>
             </w:tcBorders>
+            <w:shd w:fill="F2F5FA" w:color="auto" w:val="clear"/>
             <w:tcMar>
               <w:top w:type="dxa" w:w="60"/>
               <w:left w:type="dxa" w:w="100"/>
@@ -17406,6 +17470,7 @@
               <w:bottom w:val="single" w:color="BFC9D9" w:sz="4"/>
               <w:right w:val="single" w:color="BFC9D9" w:sz="4"/>
             </w:tcBorders>
+            <w:shd w:fill="F2F5FA" w:color="auto" w:val="clear"/>
             <w:tcMar>
               <w:top w:type="dxa" w:w="60"/>
               <w:left w:type="dxa" w:w="100"/>
@@ -17440,7 +17505,6 @@
               <w:bottom w:val="single" w:color="BFC9D9" w:sz="4"/>
               <w:right w:val="single" w:color="BFC9D9" w:sz="4"/>
             </w:tcBorders>
-            <w:shd w:fill="F2F5FA" w:color="auto" w:val="clear"/>
             <w:tcMar>
               <w:top w:type="dxa" w:w="60"/>
               <w:left w:type="dxa" w:w="100"/>
@@ -17470,7 +17534,6 @@
               <w:bottom w:val="single" w:color="BFC9D9" w:sz="4"/>
               <w:right w:val="single" w:color="BFC9D9" w:sz="4"/>
             </w:tcBorders>
-            <w:shd w:fill="F2F5FA" w:color="auto" w:val="clear"/>
             <w:tcMar>
               <w:top w:type="dxa" w:w="60"/>
               <w:left w:type="dxa" w:w="100"/>
@@ -17505,6 +17568,7 @@
               <w:bottom w:val="single" w:color="BFC9D9" w:sz="4"/>
               <w:right w:val="single" w:color="BFC9D9" w:sz="4"/>
             </w:tcBorders>
+            <w:shd w:fill="F2F5FA" w:color="auto" w:val="clear"/>
             <w:tcMar>
               <w:top w:type="dxa" w:w="60"/>
               <w:left w:type="dxa" w:w="100"/>
@@ -17534,6 +17598,7 @@
               <w:bottom w:val="single" w:color="BFC9D9" w:sz="4"/>
               <w:right w:val="single" w:color="BFC9D9" w:sz="4"/>
             </w:tcBorders>
+            <w:shd w:fill="F2F5FA" w:color="auto" w:val="clear"/>
             <w:tcMar>
               <w:top w:type="dxa" w:w="60"/>
               <w:left w:type="dxa" w:w="100"/>
@@ -17568,7 +17633,6 @@
               <w:bottom w:val="single" w:color="BFC9D9" w:sz="4"/>
               <w:right w:val="single" w:color="BFC9D9" w:sz="4"/>
             </w:tcBorders>
-            <w:shd w:fill="F2F5FA" w:color="auto" w:val="clear"/>
             <w:tcMar>
               <w:top w:type="dxa" w:w="60"/>
               <w:left w:type="dxa" w:w="100"/>
@@ -17598,7 +17662,6 @@
               <w:bottom w:val="single" w:color="BFC9D9" w:sz="4"/>
               <w:right w:val="single" w:color="BFC9D9" w:sz="4"/>
             </w:tcBorders>
-            <w:shd w:fill="F2F5FA" w:color="auto" w:val="clear"/>
             <w:tcMar>
               <w:top w:type="dxa" w:w="60"/>
               <w:left w:type="dxa" w:w="100"/>
@@ -17633,6 +17696,7 @@
               <w:bottom w:val="single" w:color="BFC9D9" w:sz="4"/>
               <w:right w:val="single" w:color="BFC9D9" w:sz="4"/>
             </w:tcBorders>
+            <w:shd w:fill="F2F5FA" w:color="auto" w:val="clear"/>
             <w:tcMar>
               <w:top w:type="dxa" w:w="60"/>
               <w:left w:type="dxa" w:w="100"/>
@@ -17662,6 +17726,7 @@
               <w:bottom w:val="single" w:color="BFC9D9" w:sz="4"/>
               <w:right w:val="single" w:color="BFC9D9" w:sz="4"/>
             </w:tcBorders>
+            <w:shd w:fill="F2F5FA" w:color="auto" w:val="clear"/>
             <w:tcMar>
               <w:top w:type="dxa" w:w="60"/>
               <w:left w:type="dxa" w:w="100"/>
@@ -17696,7 +17761,6 @@
               <w:bottom w:val="single" w:color="BFC9D9" w:sz="4"/>
               <w:right w:val="single" w:color="BFC9D9" w:sz="4"/>
             </w:tcBorders>
-            <w:shd w:fill="F2F5FA" w:color="auto" w:val="clear"/>
             <w:tcMar>
               <w:top w:type="dxa" w:w="60"/>
               <w:left w:type="dxa" w:w="100"/>
@@ -17726,7 +17790,6 @@
               <w:bottom w:val="single" w:color="BFC9D9" w:sz="4"/>
               <w:right w:val="single" w:color="BFC9D9" w:sz="4"/>
             </w:tcBorders>
-            <w:shd w:fill="F2F5FA" w:color="auto" w:val="clear"/>
             <w:tcMar>
               <w:top w:type="dxa" w:w="60"/>
               <w:left w:type="dxa" w:w="100"/>
@@ -17761,6 +17824,7 @@
               <w:bottom w:val="single" w:color="BFC9D9" w:sz="4"/>
               <w:right w:val="single" w:color="BFC9D9" w:sz="4"/>
             </w:tcBorders>
+            <w:shd w:fill="F2F5FA" w:color="auto" w:val="clear"/>
             <w:tcMar>
               <w:top w:type="dxa" w:w="60"/>
               <w:left w:type="dxa" w:w="100"/>
@@ -17790,6 +17854,7 @@
               <w:bottom w:val="single" w:color="BFC9D9" w:sz="4"/>
               <w:right w:val="single" w:color="BFC9D9" w:sz="4"/>
             </w:tcBorders>
+            <w:shd w:fill="F2F5FA" w:color="auto" w:val="clear"/>
             <w:tcMar>
               <w:top w:type="dxa" w:w="60"/>
               <w:left w:type="dxa" w:w="100"/>
@@ -17824,7 +17889,6 @@
               <w:bottom w:val="single" w:color="BFC9D9" w:sz="4"/>
               <w:right w:val="single" w:color="BFC9D9" w:sz="4"/>
             </w:tcBorders>
-            <w:shd w:fill="F2F5FA" w:color="auto" w:val="clear"/>
             <w:tcMar>
               <w:top w:type="dxa" w:w="60"/>
               <w:left w:type="dxa" w:w="100"/>
@@ -17854,7 +17918,6 @@
               <w:bottom w:val="single" w:color="BFC9D9" w:sz="4"/>
               <w:right w:val="single" w:color="BFC9D9" w:sz="4"/>
             </w:tcBorders>
-            <w:shd w:fill="F2F5FA" w:color="auto" w:val="clear"/>
             <w:tcMar>
               <w:top w:type="dxa" w:w="60"/>
               <w:left w:type="dxa" w:w="100"/>
@@ -17889,6 +17952,7 @@
               <w:bottom w:val="single" w:color="BFC9D9" w:sz="4"/>
               <w:right w:val="single" w:color="BFC9D9" w:sz="4"/>
             </w:tcBorders>
+            <w:shd w:fill="F2F5FA" w:color="auto" w:val="clear"/>
             <w:tcMar>
               <w:top w:type="dxa" w:w="60"/>
               <w:left w:type="dxa" w:w="100"/>
@@ -17918,6 +17982,7 @@
               <w:bottom w:val="single" w:color="BFC9D9" w:sz="4"/>
               <w:right w:val="single" w:color="BFC9D9" w:sz="4"/>
             </w:tcBorders>
+            <w:shd w:fill="F2F5FA" w:color="auto" w:val="clear"/>
             <w:tcMar>
               <w:top w:type="dxa" w:w="60"/>
               <w:left w:type="dxa" w:w="100"/>
@@ -17952,7 +18017,6 @@
               <w:bottom w:val="single" w:color="BFC9D9" w:sz="4"/>
               <w:right w:val="single" w:color="BFC9D9" w:sz="4"/>
             </w:tcBorders>
-            <w:shd w:fill="F2F5FA" w:color="auto" w:val="clear"/>
             <w:tcMar>
               <w:top w:type="dxa" w:w="60"/>
               <w:left w:type="dxa" w:w="100"/>
@@ -17982,7 +18046,6 @@
               <w:bottom w:val="single" w:color="BFC9D9" w:sz="4"/>
               <w:right w:val="single" w:color="BFC9D9" w:sz="4"/>
             </w:tcBorders>
-            <w:shd w:fill="F2F5FA" w:color="auto" w:val="clear"/>
             <w:tcMar>
               <w:top w:type="dxa" w:w="60"/>
               <w:left w:type="dxa" w:w="100"/>
@@ -18000,6 +18063,71 @@
                 <w:szCs w:val="18"/>
               </w:rPr>
               <w:t xml:space="preserve">The simple difference between two percentages. Moving from 20% to 25% is a rise of 5 percentage points.</w:t>
+            </w:r>
+          </w:p>
+        </w:tc>
+      </w:tr>
+      <w:tr>
+        <w:trPr>
+          <w:cantSplit/>
+        </w:trPr>
+        <w:tc>
+          <w:tcPr>
+            <w:tcW w:type="dxa" w:w="2505"/>
+            <w:tcBorders>
+              <w:top w:val="single" w:color="BFC9D9" w:sz="4"/>
+              <w:left w:val="single" w:color="BFC9D9" w:sz="4"/>
+              <w:bottom w:val="single" w:color="BFC9D9" w:sz="4"/>
+              <w:right w:val="single" w:color="BFC9D9" w:sz="4"/>
+            </w:tcBorders>
+            <w:shd w:fill="F2F5FA" w:color="auto" w:val="clear"/>
+            <w:tcMar>
+              <w:top w:type="dxa" w:w="60"/>
+              <w:left w:type="dxa" w:w="100"/>
+              <w:bottom w:type="dxa" w:w="60"/>
+              <w:right w:type="dxa" w:w="100"/>
+            </w:tcMar>
+          </w:tcPr>
+          <w:p>
+            <w:pPr>
+              <w:spacing w:after="0"/>
+            </w:pPr>
+            <w:r>
+              <w:rPr>
+                <w:sz w:val="18"/>
+                <w:szCs w:val="18"/>
+              </w:rPr>
+              <w:t xml:space="preserve">Price target</w:t>
+            </w:r>
+          </w:p>
+        </w:tc>
+        <w:tc>
+          <w:tcPr>
+            <w:tcW w:type="dxa" w:w="7133"/>
+            <w:tcBorders>
+              <w:top w:val="single" w:color="BFC9D9" w:sz="4"/>
+              <w:left w:val="single" w:color="BFC9D9" w:sz="4"/>
+              <w:bottom w:val="single" w:color="BFC9D9" w:sz="4"/>
+              <w:right w:val="single" w:color="BFC9D9" w:sz="4"/>
+            </w:tcBorders>
+            <w:shd w:fill="F2F5FA" w:color="auto" w:val="clear"/>
+            <w:tcMar>
+              <w:top w:type="dxa" w:w="60"/>
+              <w:left w:type="dxa" w:w="100"/>
+              <w:bottom w:type="dxa" w:w="60"/>
+              <w:right w:type="dxa" w:w="100"/>
+            </w:tcMar>
+          </w:tcPr>
+          <w:p>
+            <w:pPr>
+              <w:spacing w:after="0"/>
+            </w:pPr>
+            <w:r>
+              <w:rPr>
+                <w:sz w:val="18"/>
+                <w:szCs w:val="18"/>
+              </w:rPr>
+              <w:t xml:space="preserve">The share price analysts expect in about 12 months: the lowest, average, median and highest of their targets, as collected by Yahoo Finance.</w:t>
             </w:r>
           </w:p>
         </w:tc>

</xml_diff>

<commit_message>
Add daily volume chart, ASIC short positions and a short-selling caution
Volume bars under each company's price chart (63-day average, heavy days
darker). ASIC's daily short position report loads nightly into
short_positions and shows as a company Short selling card, an optional
screener % short column, Coattail's Most shorted tab and a watchlist trigger.

Shorted shares get a caution, not a red flag: HIGH from 10% sold short (or
5% with 10+ days to cover), ELEVATED from 5% (or 2% with 5+ days to cover or
up 2+ points in a month). Days to cover = shares short / 20-day average
volume. The caution is added to the action's reason and shown as an amber
tag; the action and RULES_VERSION are unchanged (ADR-015).

Co-Authored-By: Claude Opus 5.5 <noreply@anthropic.com>
Claude-Session: https://claude.ai/code/session_013woDwy1Jw8XbwbT1HUNgCF
</commit_message>
<xml_diff>
--- a/docs/ASX_Value_Screener_Rules_and_Methodology.docx
+++ b/docs/ASX_Value_Screener_Rules_and_Methodology.docx
@@ -7354,6 +7354,331 @@
                 <w:szCs w:val="18"/>
               </w:rPr>
               <w:t xml:space="preserve">low data confidence, verify the inputs</w:t>
+            </w:r>
+          </w:p>
+        </w:tc>
+      </w:tr>
+    </w:tbl>
+    <w:p>
+      <w:pPr>
+        <w:pStyle w:val="Heading2"/>
+      </w:pPr>
+      <w:r>
+        <w:t xml:space="preserve">Short-selling caution (not a red flag)</w:t>
+      </w:r>
+    </w:p>
+    <w:p>
+      <w:pPr>
+        <w:spacing w:after="120"/>
+      </w:pPr>
+      <w:r>
+        <w:t xml:space="preserve">Heavily shorted shares are volatile, so Sift adds a caution to the reason but never changes the action: a BUY stays a BUY. It uses ASIC's daily short positions (about four business days behind) and the two measures professional short-interest services report: short interest (shares sold short / shares on issue) and days to cover (shares sold short / average daily volume over the 20 trading days to the report).</w:t>
+      </w:r>
+    </w:p>
+    <w:tbl>
+      <w:tblPr>
+        <w:tblW w:type="dxa" w:w="9638"/>
+        <w:tblBorders>
+          <w:top w:val="single" w:color="auto" w:sz="4"/>
+          <w:left w:val="single" w:color="auto" w:sz="4"/>
+          <w:bottom w:val="single" w:color="auto" w:sz="4"/>
+          <w:right w:val="single" w:color="auto" w:sz="4"/>
+          <w:insideH w:val="single" w:color="auto" w:sz="4"/>
+          <w:insideV w:val="single" w:color="auto" w:sz="4"/>
+        </w:tblBorders>
+      </w:tblPr>
+      <w:tblGrid>
+        <w:gridCol w:w="1349"/>
+        <w:gridCol w:w="4144"/>
+        <w:gridCol w:w="4145"/>
+      </w:tblGrid>
+      <w:tr>
+        <w:trPr>
+          <w:tblHeader/>
+        </w:trPr>
+        <w:tc>
+          <w:tcPr>
+            <w:tcW w:type="dxa" w:w="1349"/>
+            <w:tcBorders>
+              <w:top w:val="single" w:color="BFC9D9" w:sz="4"/>
+              <w:left w:val="single" w:color="BFC9D9" w:sz="4"/>
+              <w:bottom w:val="single" w:color="BFC9D9" w:sz="4"/>
+              <w:right w:val="single" w:color="BFC9D9" w:sz="4"/>
+            </w:tcBorders>
+            <w:shd w:fill="D9E2F3" w:color="auto" w:val="clear"/>
+            <w:tcMar>
+              <w:top w:type="dxa" w:w="60"/>
+              <w:left w:type="dxa" w:w="100"/>
+              <w:bottom w:type="dxa" w:w="60"/>
+              <w:right w:type="dxa" w:w="100"/>
+            </w:tcMar>
+          </w:tcPr>
+          <w:p>
+            <w:pPr>
+              <w:spacing w:after="0"/>
+            </w:pPr>
+            <w:r>
+              <w:rPr>
+                <w:b/>
+                <w:bCs/>
+                <w:color w:val="1F3864"/>
+                <w:sz w:val="18"/>
+                <w:szCs w:val="18"/>
+              </w:rPr>
+              <w:t xml:space="preserve">Level</w:t>
+            </w:r>
+          </w:p>
+        </w:tc>
+        <w:tc>
+          <w:tcPr>
+            <w:tcW w:type="dxa" w:w="4144"/>
+            <w:tcBorders>
+              <w:top w:val="single" w:color="BFC9D9" w:sz="4"/>
+              <w:left w:val="single" w:color="BFC9D9" w:sz="4"/>
+              <w:bottom w:val="single" w:color="BFC9D9" w:sz="4"/>
+              <w:right w:val="single" w:color="BFC9D9" w:sz="4"/>
+            </w:tcBorders>
+            <w:shd w:fill="D9E2F3" w:color="auto" w:val="clear"/>
+            <w:tcMar>
+              <w:top w:type="dxa" w:w="60"/>
+              <w:left w:type="dxa" w:w="100"/>
+              <w:bottom w:type="dxa" w:w="60"/>
+              <w:right w:type="dxa" w:w="100"/>
+            </w:tcMar>
+          </w:tcPr>
+          <w:p>
+            <w:pPr>
+              <w:spacing w:after="0"/>
+            </w:pPr>
+            <w:r>
+              <w:rPr>
+                <w:b/>
+                <w:bCs/>
+                <w:color w:val="1F3864"/>
+                <w:sz w:val="18"/>
+                <w:szCs w:val="18"/>
+              </w:rPr>
+              <w:t xml:space="preserve">Trigger</w:t>
+            </w:r>
+          </w:p>
+        </w:tc>
+        <w:tc>
+          <w:tcPr>
+            <w:tcW w:type="dxa" w:w="4145"/>
+            <w:tcBorders>
+              <w:top w:val="single" w:color="BFC9D9" w:sz="4"/>
+              <w:left w:val="single" w:color="BFC9D9" w:sz="4"/>
+              <w:bottom w:val="single" w:color="BFC9D9" w:sz="4"/>
+              <w:right w:val="single" w:color="BFC9D9" w:sz="4"/>
+            </w:tcBorders>
+            <w:shd w:fill="D9E2F3" w:color="auto" w:val="clear"/>
+            <w:tcMar>
+              <w:top w:type="dxa" w:w="60"/>
+              <w:left w:type="dxa" w:w="100"/>
+              <w:bottom w:type="dxa" w:w="60"/>
+              <w:right w:type="dxa" w:w="100"/>
+            </w:tcMar>
+          </w:tcPr>
+          <w:p>
+            <w:pPr>
+              <w:spacing w:after="0"/>
+            </w:pPr>
+            <w:r>
+              <w:rPr>
+                <w:b/>
+                <w:bCs/>
+                <w:color w:val="1F3864"/>
+                <w:sz w:val="18"/>
+                <w:szCs w:val="18"/>
+              </w:rPr>
+              <w:t xml:space="preserve">Wording in the reason</w:t>
+            </w:r>
+          </w:p>
+        </w:tc>
+      </w:tr>
+      <w:tr>
+        <w:trPr>
+          <w:cantSplit/>
+        </w:trPr>
+        <w:tc>
+          <w:tcPr>
+            <w:tcW w:type="dxa" w:w="1349"/>
+            <w:tcBorders>
+              <w:top w:val="single" w:color="BFC9D9" w:sz="4"/>
+              <w:left w:val="single" w:color="BFC9D9" w:sz="4"/>
+              <w:bottom w:val="single" w:color="BFC9D9" w:sz="4"/>
+              <w:right w:val="single" w:color="BFC9D9" w:sz="4"/>
+            </w:tcBorders>
+            <w:tcMar>
+              <w:top w:type="dxa" w:w="60"/>
+              <w:left w:type="dxa" w:w="100"/>
+              <w:bottom w:type="dxa" w:w="60"/>
+              <w:right w:type="dxa" w:w="100"/>
+            </w:tcMar>
+          </w:tcPr>
+          <w:p>
+            <w:pPr>
+              <w:spacing w:after="0"/>
+            </w:pPr>
+            <w:r>
+              <w:rPr>
+                <w:sz w:val="18"/>
+                <w:szCs w:val="18"/>
+              </w:rPr>
+              <w:t xml:space="preserve">HIGH</w:t>
+            </w:r>
+          </w:p>
+        </w:tc>
+        <w:tc>
+          <w:tcPr>
+            <w:tcW w:type="dxa" w:w="4144"/>
+            <w:tcBorders>
+              <w:top w:val="single" w:color="BFC9D9" w:sz="4"/>
+              <w:left w:val="single" w:color="BFC9D9" w:sz="4"/>
+              <w:bottom w:val="single" w:color="BFC9D9" w:sz="4"/>
+              <w:right w:val="single" w:color="BFC9D9" w:sz="4"/>
+            </w:tcBorders>
+            <w:tcMar>
+              <w:top w:type="dxa" w:w="60"/>
+              <w:left w:type="dxa" w:w="100"/>
+              <w:bottom w:type="dxa" w:w="60"/>
+              <w:right w:type="dxa" w:w="100"/>
+            </w:tcMar>
+          </w:tcPr>
+          <w:p>
+            <w:pPr>
+              <w:spacing w:after="0"/>
+            </w:pPr>
+            <w:r>
+              <w:rPr>
+                <w:sz w:val="18"/>
+                <w:szCs w:val="18"/>
+              </w:rPr>
+              <w:t xml:space="preserve">short_percent at or above 10%, or at or above 5% with days_to_cover at or above 10</w:t>
+            </w:r>
+          </w:p>
+        </w:tc>
+        <w:tc>
+          <w:tcPr>
+            <w:tcW w:type="dxa" w:w="4145"/>
+            <w:tcBorders>
+              <w:top w:val="single" w:color="BFC9D9" w:sz="4"/>
+              <w:left w:val="single" w:color="BFC9D9" w:sz="4"/>
+              <w:bottom w:val="single" w:color="BFC9D9" w:sz="4"/>
+              <w:right w:val="single" w:color="BFC9D9" w:sz="4"/>
+            </w:tcBorders>
+            <w:tcMar>
+              <w:top w:type="dxa" w:w="60"/>
+              <w:left w:type="dxa" w:w="100"/>
+              <w:bottom w:type="dxa" w:w="60"/>
+              <w:right w:type="dxa" w:w="100"/>
+            </w:tcMar>
+          </w:tcPr>
+          <w:p>
+            <w:pPr>
+              <w:spacing w:after="0"/>
+            </w:pPr>
+            <w:r>
+              <w:rPr>
+                <w:sz w:val="18"/>
+                <w:szCs w:val="18"/>
+              </w:rPr>
+              <w:t xml:space="preserve">caution: heavily shorted (X% of shares sold short, Y days to cover): expect sharp price swings; keep any position small</w:t>
+            </w:r>
+          </w:p>
+        </w:tc>
+      </w:tr>
+      <w:tr>
+        <w:trPr>
+          <w:cantSplit/>
+        </w:trPr>
+        <w:tc>
+          <w:tcPr>
+            <w:tcW w:type="dxa" w:w="1349"/>
+            <w:tcBorders>
+              <w:top w:val="single" w:color="BFC9D9" w:sz="4"/>
+              <w:left w:val="single" w:color="BFC9D9" w:sz="4"/>
+              <w:bottom w:val="single" w:color="BFC9D9" w:sz="4"/>
+              <w:right w:val="single" w:color="BFC9D9" w:sz="4"/>
+            </w:tcBorders>
+            <w:shd w:fill="F2F5FA" w:color="auto" w:val="clear"/>
+            <w:tcMar>
+              <w:top w:type="dxa" w:w="60"/>
+              <w:left w:type="dxa" w:w="100"/>
+              <w:bottom w:type="dxa" w:w="60"/>
+              <w:right w:type="dxa" w:w="100"/>
+            </w:tcMar>
+          </w:tcPr>
+          <w:p>
+            <w:pPr>
+              <w:spacing w:after="0"/>
+            </w:pPr>
+            <w:r>
+              <w:rPr>
+                <w:sz w:val="18"/>
+                <w:szCs w:val="18"/>
+              </w:rPr>
+              <w:t xml:space="preserve">ELEVATED</w:t>
+            </w:r>
+          </w:p>
+        </w:tc>
+        <w:tc>
+          <w:tcPr>
+            <w:tcW w:type="dxa" w:w="4144"/>
+            <w:tcBorders>
+              <w:top w:val="single" w:color="BFC9D9" w:sz="4"/>
+              <w:left w:val="single" w:color="BFC9D9" w:sz="4"/>
+              <w:bottom w:val="single" w:color="BFC9D9" w:sz="4"/>
+              <w:right w:val="single" w:color="BFC9D9" w:sz="4"/>
+            </w:tcBorders>
+            <w:shd w:fill="F2F5FA" w:color="auto" w:val="clear"/>
+            <w:tcMar>
+              <w:top w:type="dxa" w:w="60"/>
+              <w:left w:type="dxa" w:w="100"/>
+              <w:bottom w:type="dxa" w:w="60"/>
+              <w:right w:type="dxa" w:w="100"/>
+            </w:tcMar>
+          </w:tcPr>
+          <w:p>
+            <w:pPr>
+              <w:spacing w:after="0"/>
+            </w:pPr>
+            <w:r>
+              <w:rPr>
+                <w:sz w:val="18"/>
+                <w:szCs w:val="18"/>
+              </w:rPr>
+              <w:t xml:space="preserve">short_percent at or above 5%, or at or above 2% with days_to_cover at or above 5 or short_change up 2 points or more in a month</w:t>
+            </w:r>
+          </w:p>
+        </w:tc>
+        <w:tc>
+          <w:tcPr>
+            <w:tcW w:type="dxa" w:w="4145"/>
+            <w:tcBorders>
+              <w:top w:val="single" w:color="BFC9D9" w:sz="4"/>
+              <w:left w:val="single" w:color="BFC9D9" w:sz="4"/>
+              <w:bottom w:val="single" w:color="BFC9D9" w:sz="4"/>
+              <w:right w:val="single" w:color="BFC9D9" w:sz="4"/>
+            </w:tcBorders>
+            <w:shd w:fill="F2F5FA" w:color="auto" w:val="clear"/>
+            <w:tcMar>
+              <w:top w:type="dxa" w:w="60"/>
+              <w:left w:type="dxa" w:w="100"/>
+              <w:bottom w:type="dxa" w:w="60"/>
+              <w:right w:type="dxa" w:w="100"/>
+            </w:tcMar>
+          </w:tcPr>
+          <w:p>
+            <w:pPr>
+              <w:spacing w:after="0"/>
+            </w:pPr>
+            <w:r>
+              <w:rPr>
+                <w:sz w:val="18"/>
+                <w:szCs w:val="18"/>
+              </w:rPr>
+              <w:t xml:space="preserve">caution: shorted (X% of shares sold short, Y days to cover): expect bigger price swings than usual</w:t>
             </w:r>
           </w:p>
         </w:tc>
@@ -14620,7 +14945,7 @@
                 <w:sz w:val="18"/>
                 <w:szCs w:val="18"/>
               </w:rPr>
-              <w:t xml:space="preserve">Dividends paid as new shares instead of cash. Each reinvestment creates a new parcel.</w:t>
+              <w:t xml:space="preserve">A dividend reinvestment plan (DRP) uses your cash dividend to buy new shares in the same company instead of paying it to your bank account, usually with no brokerage and sometimes at a small discount.</w:t>
             </w:r>
           </w:p>
         </w:tc>
@@ -16945,6 +17270,70 @@
                 <w:sz w:val="18"/>
                 <w:szCs w:val="18"/>
               </w:rPr>
+              <w:t xml:space="preserve">Appendix 3Y</w:t>
+            </w:r>
+          </w:p>
+        </w:tc>
+        <w:tc>
+          <w:tcPr>
+            <w:tcW w:type="dxa" w:w="7133"/>
+            <w:tcBorders>
+              <w:top w:val="single" w:color="BFC9D9" w:sz="4"/>
+              <w:left w:val="single" w:color="BFC9D9" w:sz="4"/>
+              <w:bottom w:val="single" w:color="BFC9D9" w:sz="4"/>
+              <w:right w:val="single" w:color="BFC9D9" w:sz="4"/>
+            </w:tcBorders>
+            <w:shd w:fill="F2F5FA" w:color="auto" w:val="clear"/>
+            <w:tcMar>
+              <w:top w:type="dxa" w:w="60"/>
+              <w:left w:type="dxa" w:w="100"/>
+              <w:bottom w:type="dxa" w:w="60"/>
+              <w:right w:type="dxa" w:w="100"/>
+            </w:tcMar>
+          </w:tcPr>
+          <w:p>
+            <w:pPr>
+              <w:spacing w:after="0"/>
+            </w:pPr>
+            <w:r>
+              <w:rPr>
+                <w:sz w:val="18"/>
+                <w:szCs w:val="18"/>
+              </w:rPr>
+              <w:t xml:space="preserve">A director buying or selling their own company's shares, which ASX requires them to report within five business days on an Appendix 3Y, "Change of Director's Interest Notice".</w:t>
+            </w:r>
+          </w:p>
+        </w:tc>
+      </w:tr>
+      <w:tr>
+        <w:trPr>
+          <w:cantSplit/>
+        </w:trPr>
+        <w:tc>
+          <w:tcPr>
+            <w:tcW w:type="dxa" w:w="2505"/>
+            <w:tcBorders>
+              <w:top w:val="single" w:color="BFC9D9" w:sz="4"/>
+              <w:left w:val="single" w:color="BFC9D9" w:sz="4"/>
+              <w:bottom w:val="single" w:color="BFC9D9" w:sz="4"/>
+              <w:right w:val="single" w:color="BFC9D9" w:sz="4"/>
+            </w:tcBorders>
+            <w:tcMar>
+              <w:top w:type="dxa" w:w="60"/>
+              <w:left w:type="dxa" w:w="100"/>
+              <w:bottom w:type="dxa" w:w="60"/>
+              <w:right w:type="dxa" w:w="100"/>
+            </w:tcMar>
+          </w:tcPr>
+          <w:p>
+            <w:pPr>
+              <w:spacing w:after="0"/>
+            </w:pPr>
+            <w:r>
+              <w:rPr>
+                <w:sz w:val="18"/>
+                <w:szCs w:val="18"/>
+              </w:rPr>
               <w:t xml:space="preserve">Book value</w:t>
             </w:r>
           </w:p>
@@ -16958,7 +17347,6 @@
               <w:bottom w:val="single" w:color="BFC9D9" w:sz="4"/>
               <w:right w:val="single" w:color="BFC9D9" w:sz="4"/>
             </w:tcBorders>
-            <w:shd w:fill="F2F5FA" w:color="auto" w:val="clear"/>
             <w:tcMar>
               <w:top w:type="dxa" w:w="60"/>
               <w:left w:type="dxa" w:w="100"/>
@@ -16993,6 +17381,7 @@
               <w:bottom w:val="single" w:color="BFC9D9" w:sz="4"/>
               <w:right w:val="single" w:color="BFC9D9" w:sz="4"/>
             </w:tcBorders>
+            <w:shd w:fill="F2F5FA" w:color="auto" w:val="clear"/>
             <w:tcMar>
               <w:top w:type="dxa" w:w="60"/>
               <w:left w:type="dxa" w:w="100"/>
@@ -17022,6 +17411,7 @@
               <w:bottom w:val="single" w:color="BFC9D9" w:sz="4"/>
               <w:right w:val="single" w:color="BFC9D9" w:sz="4"/>
             </w:tcBorders>
+            <w:shd w:fill="F2F5FA" w:color="auto" w:val="clear"/>
             <w:tcMar>
               <w:top w:type="dxa" w:w="60"/>
               <w:left w:type="dxa" w:w="100"/>
@@ -17056,7 +17446,6 @@
               <w:bottom w:val="single" w:color="BFC9D9" w:sz="4"/>
               <w:right w:val="single" w:color="BFC9D9" w:sz="4"/>
             </w:tcBorders>
-            <w:shd w:fill="F2F5FA" w:color="auto" w:val="clear"/>
             <w:tcMar>
               <w:top w:type="dxa" w:w="60"/>
               <w:left w:type="dxa" w:w="100"/>
@@ -17086,7 +17475,6 @@
               <w:bottom w:val="single" w:color="BFC9D9" w:sz="4"/>
               <w:right w:val="single" w:color="BFC9D9" w:sz="4"/>
             </w:tcBorders>
-            <w:shd w:fill="F2F5FA" w:color="auto" w:val="clear"/>
             <w:tcMar>
               <w:top w:type="dxa" w:w="60"/>
               <w:left w:type="dxa" w:w="100"/>
@@ -17121,6 +17509,7 @@
               <w:bottom w:val="single" w:color="BFC9D9" w:sz="4"/>
               <w:right w:val="single" w:color="BFC9D9" w:sz="4"/>
             </w:tcBorders>
+            <w:shd w:fill="F2F5FA" w:color="auto" w:val="clear"/>
             <w:tcMar>
               <w:top w:type="dxa" w:w="60"/>
               <w:left w:type="dxa" w:w="100"/>
@@ -17150,6 +17539,7 @@
               <w:bottom w:val="single" w:color="BFC9D9" w:sz="4"/>
               <w:right w:val="single" w:color="BFC9D9" w:sz="4"/>
             </w:tcBorders>
+            <w:shd w:fill="F2F5FA" w:color="auto" w:val="clear"/>
             <w:tcMar>
               <w:top w:type="dxa" w:w="60"/>
               <w:left w:type="dxa" w:w="100"/>
@@ -17184,6 +17574,69 @@
               <w:bottom w:val="single" w:color="BFC9D9" w:sz="4"/>
               <w:right w:val="single" w:color="BFC9D9" w:sz="4"/>
             </w:tcBorders>
+            <w:tcMar>
+              <w:top w:type="dxa" w:w="60"/>
+              <w:left w:type="dxa" w:w="100"/>
+              <w:bottom w:type="dxa" w:w="60"/>
+              <w:right w:type="dxa" w:w="100"/>
+            </w:tcMar>
+          </w:tcPr>
+          <w:p>
+            <w:pPr>
+              <w:spacing w:after="0"/>
+            </w:pPr>
+            <w:r>
+              <w:rPr>
+                <w:sz w:val="18"/>
+                <w:szCs w:val="18"/>
+              </w:rPr>
+              <w:t xml:space="preserve">Coattail investing</w:t>
+            </w:r>
+          </w:p>
+        </w:tc>
+        <w:tc>
+          <w:tcPr>
+            <w:tcW w:type="dxa" w:w="7133"/>
+            <w:tcBorders>
+              <w:top w:val="single" w:color="BFC9D9" w:sz="4"/>
+              <w:left w:val="single" w:color="BFC9D9" w:sz="4"/>
+              <w:bottom w:val="single" w:color="BFC9D9" w:sz="4"/>
+              <w:right w:val="single" w:color="BFC9D9" w:sz="4"/>
+            </w:tcBorders>
+            <w:tcMar>
+              <w:top w:type="dxa" w:w="60"/>
+              <w:left w:type="dxa" w:w="100"/>
+              <w:bottom w:type="dxa" w:w="60"/>
+              <w:right w:type="dxa" w:w="100"/>
+            </w:tcMar>
+          </w:tcPr>
+          <w:p>
+            <w:pPr>
+              <w:spacing w:after="0"/>
+            </w:pPr>
+            <w:r>
+              <w:rPr>
+                <w:sz w:val="18"/>
+                <w:szCs w:val="18"/>
+              </w:rPr>
+              <w:t xml:space="preserve">Coattail investing simply means letting the "smart money" do the heavy lifting, then copying their moves.</w:t>
+            </w:r>
+          </w:p>
+        </w:tc>
+      </w:tr>
+      <w:tr>
+        <w:trPr>
+          <w:cantSplit/>
+        </w:trPr>
+        <w:tc>
+          <w:tcPr>
+            <w:tcW w:type="dxa" w:w="2505"/>
+            <w:tcBorders>
+              <w:top w:val="single" w:color="BFC9D9" w:sz="4"/>
+              <w:left w:val="single" w:color="BFC9D9" w:sz="4"/>
+              <w:bottom w:val="single" w:color="BFC9D9" w:sz="4"/>
+              <w:right w:val="single" w:color="BFC9D9" w:sz="4"/>
+            </w:tcBorders>
             <w:shd w:fill="F2F5FA" w:color="auto" w:val="clear"/>
             <w:tcMar>
               <w:top w:type="dxa" w:w="60"/>
@@ -18417,6 +18870,70 @@
                 <w:sz w:val="18"/>
                 <w:szCs w:val="18"/>
               </w:rPr>
+              <w:t xml:space="preserve">Share registry</w:t>
+            </w:r>
+          </w:p>
+        </w:tc>
+        <w:tc>
+          <w:tcPr>
+            <w:tcW w:type="dxa" w:w="7133"/>
+            <w:tcBorders>
+              <w:top w:val="single" w:color="BFC9D9" w:sz="4"/>
+              <w:left w:val="single" w:color="BFC9D9" w:sz="4"/>
+              <w:bottom w:val="single" w:color="BFC9D9" w:sz="4"/>
+              <w:right w:val="single" w:color="BFC9D9" w:sz="4"/>
+            </w:tcBorders>
+            <w:tcMar>
+              <w:top w:type="dxa" w:w="60"/>
+              <w:left w:type="dxa" w:w="100"/>
+              <w:bottom w:type="dxa" w:w="60"/>
+              <w:right w:type="dxa" w:w="100"/>
+            </w:tcMar>
+          </w:tcPr>
+          <w:p>
+            <w:pPr>
+              <w:spacing w:after="0"/>
+            </w:pPr>
+            <w:r>
+              <w:rPr>
+                <w:sz w:val="18"/>
+                <w:szCs w:val="18"/>
+              </w:rPr>
+              <w:t xml:space="preserve">The company that keeps a listed company's register of shareholders on its behalf: it records who owns the shares, pays dividends, runs the dividend reinvestment plan and sends holding statements.</w:t>
+            </w:r>
+          </w:p>
+        </w:tc>
+      </w:tr>
+      <w:tr>
+        <w:trPr>
+          <w:cantSplit/>
+        </w:trPr>
+        <w:tc>
+          <w:tcPr>
+            <w:tcW w:type="dxa" w:w="2505"/>
+            <w:tcBorders>
+              <w:top w:val="single" w:color="BFC9D9" w:sz="4"/>
+              <w:left w:val="single" w:color="BFC9D9" w:sz="4"/>
+              <w:bottom w:val="single" w:color="BFC9D9" w:sz="4"/>
+              <w:right w:val="single" w:color="BFC9D9" w:sz="4"/>
+            </w:tcBorders>
+            <w:shd w:fill="F2F5FA" w:color="auto" w:val="clear"/>
+            <w:tcMar>
+              <w:top w:type="dxa" w:w="60"/>
+              <w:left w:type="dxa" w:w="100"/>
+              <w:bottom w:type="dxa" w:w="60"/>
+              <w:right w:type="dxa" w:w="100"/>
+            </w:tcMar>
+          </w:tcPr>
+          <w:p>
+            <w:pPr>
+              <w:spacing w:after="0"/>
+            </w:pPr>
+            <w:r>
+              <w:rPr>
+                <w:sz w:val="18"/>
+                <w:szCs w:val="18"/>
+              </w:rPr>
               <w:t xml:space="preserve">Shares on issue</w:t>
             </w:r>
           </w:p>
@@ -18430,6 +18947,7 @@
               <w:bottom w:val="single" w:color="BFC9D9" w:sz="4"/>
               <w:right w:val="single" w:color="BFC9D9" w:sz="4"/>
             </w:tcBorders>
+            <w:shd w:fill="F2F5FA" w:color="auto" w:val="clear"/>
             <w:tcMar>
               <w:top w:type="dxa" w:w="60"/>
               <w:left w:type="dxa" w:w="100"/>
@@ -18464,6 +18982,69 @@
               <w:bottom w:val="single" w:color="BFC9D9" w:sz="4"/>
               <w:right w:val="single" w:color="BFC9D9" w:sz="4"/>
             </w:tcBorders>
+            <w:tcMar>
+              <w:top w:type="dxa" w:w="60"/>
+              <w:left w:type="dxa" w:w="100"/>
+              <w:bottom w:type="dxa" w:w="60"/>
+              <w:right w:type="dxa" w:w="100"/>
+            </w:tcMar>
+          </w:tcPr>
+          <w:p>
+            <w:pPr>
+              <w:spacing w:after="0"/>
+            </w:pPr>
+            <w:r>
+              <w:rPr>
+                <w:sz w:val="18"/>
+                <w:szCs w:val="18"/>
+              </w:rPr>
+              <w:t xml:space="preserve">Short selling</w:t>
+            </w:r>
+          </w:p>
+        </w:tc>
+        <w:tc>
+          <w:tcPr>
+            <w:tcW w:type="dxa" w:w="7133"/>
+            <w:tcBorders>
+              <w:top w:val="single" w:color="BFC9D9" w:sz="4"/>
+              <w:left w:val="single" w:color="BFC9D9" w:sz="4"/>
+              <w:bottom w:val="single" w:color="BFC9D9" w:sz="4"/>
+              <w:right w:val="single" w:color="BFC9D9" w:sz="4"/>
+            </w:tcBorders>
+            <w:tcMar>
+              <w:top w:type="dxa" w:w="60"/>
+              <w:left w:type="dxa" w:w="100"/>
+              <w:bottom w:type="dxa" w:w="60"/>
+              <w:right w:type="dxa" w:w="100"/>
+            </w:tcMar>
+          </w:tcPr>
+          <w:p>
+            <w:pPr>
+              <w:spacing w:after="0"/>
+            </w:pPr>
+            <w:r>
+              <w:rPr>
+                <w:sz w:val="18"/>
+                <w:szCs w:val="18"/>
+              </w:rPr>
+              <w:t xml:space="preserve">Selling borrowed shares in the hope of buying them back cheaper later. A short seller profits if the price falls.</w:t>
+            </w:r>
+          </w:p>
+        </w:tc>
+      </w:tr>
+      <w:tr>
+        <w:trPr>
+          <w:cantSplit/>
+        </w:trPr>
+        <w:tc>
+          <w:tcPr>
+            <w:tcW w:type="dxa" w:w="2505"/>
+            <w:tcBorders>
+              <w:top w:val="single" w:color="BFC9D9" w:sz="4"/>
+              <w:left w:val="single" w:color="BFC9D9" w:sz="4"/>
+              <w:bottom w:val="single" w:color="BFC9D9" w:sz="4"/>
+              <w:right w:val="single" w:color="BFC9D9" w:sz="4"/>
+            </w:tcBorders>
             <w:shd w:fill="F2F5FA" w:color="auto" w:val="clear"/>
             <w:tcMar>
               <w:top w:type="dxa" w:w="60"/>
@@ -18545,6 +19126,70 @@
                 <w:sz w:val="18"/>
                 <w:szCs w:val="18"/>
               </w:rPr>
+              <w:t xml:space="preserve">Substantial holder</w:t>
+            </w:r>
+          </w:p>
+        </w:tc>
+        <w:tc>
+          <w:tcPr>
+            <w:tcW w:type="dxa" w:w="7133"/>
+            <w:tcBorders>
+              <w:top w:val="single" w:color="BFC9D9" w:sz="4"/>
+              <w:left w:val="single" w:color="BFC9D9" w:sz="4"/>
+              <w:bottom w:val="single" w:color="BFC9D9" w:sz="4"/>
+              <w:right w:val="single" w:color="BFC9D9" w:sz="4"/>
+            </w:tcBorders>
+            <w:tcMar>
+              <w:top w:type="dxa" w:w="60"/>
+              <w:left w:type="dxa" w:w="100"/>
+              <w:bottom w:type="dxa" w:w="60"/>
+              <w:right w:type="dxa" w:w="100"/>
+            </w:tcMar>
+          </w:tcPr>
+          <w:p>
+            <w:pPr>
+              <w:spacing w:after="0"/>
+            </w:pPr>
+            <w:r>
+              <w:rPr>
+                <w:sz w:val="18"/>
+                <w:szCs w:val="18"/>
+              </w:rPr>
+              <w:t xml:space="preserve">An investor with 5% or more of a company's votes. They must tell ASX when they cross 5% (form 603, "Becoming a substantial holder"), when their stake moves by 1% or more (form 604, "Change in substantial holding") and when they fall below 5% (form 605, "Ceasing to be a substantial holder").</w:t>
+            </w:r>
+          </w:p>
+        </w:tc>
+      </w:tr>
+      <w:tr>
+        <w:trPr>
+          <w:cantSplit/>
+        </w:trPr>
+        <w:tc>
+          <w:tcPr>
+            <w:tcW w:type="dxa" w:w="2505"/>
+            <w:tcBorders>
+              <w:top w:val="single" w:color="BFC9D9" w:sz="4"/>
+              <w:left w:val="single" w:color="BFC9D9" w:sz="4"/>
+              <w:bottom w:val="single" w:color="BFC9D9" w:sz="4"/>
+              <w:right w:val="single" w:color="BFC9D9" w:sz="4"/>
+            </w:tcBorders>
+            <w:shd w:fill="F2F5FA" w:color="auto" w:val="clear"/>
+            <w:tcMar>
+              <w:top w:type="dxa" w:w="60"/>
+              <w:left w:type="dxa" w:w="100"/>
+              <w:bottom w:type="dxa" w:w="60"/>
+              <w:right w:type="dxa" w:w="100"/>
+            </w:tcMar>
+          </w:tcPr>
+          <w:p>
+            <w:pPr>
+              <w:spacing w:after="0"/>
+            </w:pPr>
+            <w:r>
+              <w:rPr>
+                <w:sz w:val="18"/>
+                <w:szCs w:val="18"/>
+              </w:rPr>
               <w:t xml:space="preserve">Terminal value</w:t>
             </w:r>
           </w:p>
@@ -18558,6 +19203,7 @@
               <w:bottom w:val="single" w:color="BFC9D9" w:sz="4"/>
               <w:right w:val="single" w:color="BFC9D9" w:sz="4"/>
             </w:tcBorders>
+            <w:shd w:fill="F2F5FA" w:color="auto" w:val="clear"/>
             <w:tcMar>
               <w:top w:type="dxa" w:w="60"/>
               <w:left w:type="dxa" w:w="100"/>
@@ -18592,7 +19238,6 @@
               <w:bottom w:val="single" w:color="BFC9D9" w:sz="4"/>
               <w:right w:val="single" w:color="BFC9D9" w:sz="4"/>
             </w:tcBorders>
-            <w:shd w:fill="F2F5FA" w:color="auto" w:val="clear"/>
             <w:tcMar>
               <w:top w:type="dxa" w:w="60"/>
               <w:left w:type="dxa" w:w="100"/>
@@ -18622,7 +19267,6 @@
               <w:bottom w:val="single" w:color="BFC9D9" w:sz="4"/>
               <w:right w:val="single" w:color="BFC9D9" w:sz="4"/>
             </w:tcBorders>
-            <w:shd w:fill="F2F5FA" w:color="auto" w:val="clear"/>
             <w:tcMar>
               <w:top w:type="dxa" w:w="60"/>
               <w:left w:type="dxa" w:w="100"/>
@@ -18657,6 +19301,7 @@
               <w:bottom w:val="single" w:color="BFC9D9" w:sz="4"/>
               <w:right w:val="single" w:color="BFC9D9" w:sz="4"/>
             </w:tcBorders>
+            <w:shd w:fill="F2F5FA" w:color="auto" w:val="clear"/>
             <w:tcMar>
               <w:top w:type="dxa" w:w="60"/>
               <w:left w:type="dxa" w:w="100"/>
@@ -18686,6 +19331,7 @@
               <w:bottom w:val="single" w:color="BFC9D9" w:sz="4"/>
               <w:right w:val="single" w:color="BFC9D9" w:sz="4"/>
             </w:tcBorders>
+            <w:shd w:fill="F2F5FA" w:color="auto" w:val="clear"/>
             <w:tcMar>
               <w:top w:type="dxa" w:w="60"/>
               <w:left w:type="dxa" w:w="100"/>
@@ -18720,7 +19366,6 @@
               <w:bottom w:val="single" w:color="BFC9D9" w:sz="4"/>
               <w:right w:val="single" w:color="BFC9D9" w:sz="4"/>
             </w:tcBorders>
-            <w:shd w:fill="F2F5FA" w:color="auto" w:val="clear"/>
             <w:tcMar>
               <w:top w:type="dxa" w:w="60"/>
               <w:left w:type="dxa" w:w="100"/>
@@ -18750,7 +19395,6 @@
               <w:bottom w:val="single" w:color="BFC9D9" w:sz="4"/>
               <w:right w:val="single" w:color="BFC9D9" w:sz="4"/>
             </w:tcBorders>
-            <w:shd w:fill="F2F5FA" w:color="auto" w:val="clear"/>
             <w:tcMar>
               <w:top w:type="dxa" w:w="60"/>
               <w:left w:type="dxa" w:w="100"/>
@@ -18768,6 +19412,71 @@
                 <w:szCs w:val="18"/>
               </w:rPr>
               <w:t xml:space="preserve">A share that looks cheap because its business is deteriorating, not because the market has mispriced it.</w:t>
+            </w:r>
+          </w:p>
+        </w:tc>
+      </w:tr>
+      <w:tr>
+        <w:trPr>
+          <w:cantSplit/>
+        </w:trPr>
+        <w:tc>
+          <w:tcPr>
+            <w:tcW w:type="dxa" w:w="2505"/>
+            <w:tcBorders>
+              <w:top w:val="single" w:color="BFC9D9" w:sz="4"/>
+              <w:left w:val="single" w:color="BFC9D9" w:sz="4"/>
+              <w:bottom w:val="single" w:color="BFC9D9" w:sz="4"/>
+              <w:right w:val="single" w:color="BFC9D9" w:sz="4"/>
+            </w:tcBorders>
+            <w:shd w:fill="F2F5FA" w:color="auto" w:val="clear"/>
+            <w:tcMar>
+              <w:top w:type="dxa" w:w="60"/>
+              <w:left w:type="dxa" w:w="100"/>
+              <w:bottom w:type="dxa" w:w="60"/>
+              <w:right w:type="dxa" w:w="100"/>
+            </w:tcMar>
+          </w:tcPr>
+          <w:p>
+            <w:pPr>
+              <w:spacing w:after="0"/>
+            </w:pPr>
+            <w:r>
+              <w:rPr>
+                <w:sz w:val="18"/>
+                <w:szCs w:val="18"/>
+              </w:rPr>
+              <w:t xml:space="preserve">Volume</w:t>
+            </w:r>
+          </w:p>
+        </w:tc>
+        <w:tc>
+          <w:tcPr>
+            <w:tcW w:type="dxa" w:w="7133"/>
+            <w:tcBorders>
+              <w:top w:val="single" w:color="BFC9D9" w:sz="4"/>
+              <w:left w:val="single" w:color="BFC9D9" w:sz="4"/>
+              <w:bottom w:val="single" w:color="BFC9D9" w:sz="4"/>
+              <w:right w:val="single" w:color="BFC9D9" w:sz="4"/>
+            </w:tcBorders>
+            <w:shd w:fill="F2F5FA" w:color="auto" w:val="clear"/>
+            <w:tcMar>
+              <w:top w:type="dxa" w:w="60"/>
+              <w:left w:type="dxa" w:w="100"/>
+              <w:bottom w:type="dxa" w:w="60"/>
+              <w:right w:type="dxa" w:w="100"/>
+            </w:tcMar>
+          </w:tcPr>
+          <w:p>
+            <w:pPr>
+              <w:spacing w:after="0"/>
+            </w:pPr>
+            <w:r>
+              <w:rPr>
+                <w:sz w:val="18"/>
+                <w:szCs w:val="18"/>
+              </w:rPr>
+              <w:t xml:space="preserve">The number of a company's shares that changed hands on the day.</w:t>
             </w:r>
           </w:p>
         </w:tc>

</xml_diff>

<commit_message>
Statistics in the admin console, the rules document and the knowledge base
Admin, Model and rules gains a Statistics group: the calls needed before a
rule is judged (30) and the years of price history (3) are settings, and
the methods that are fixed by design (confidence, overlap allowance,
benchmark, price model, beta, words) are listed beneath them. The group is
left out of what-if scenarios, since no statistic changes an action.

The rules and methodology document gains chapter 13, Statistics. Help gains
"The theory behind Sift's statistics" with full citations; the developer
articles gain References sections. Only links checked today are included.

Co-Authored-By: Claude Opus 5.5 <noreply@anthropic.com>
Claude-Session: https://claude.ai/code/session_013woDwy1Jw8XbwbT1HUNgCF
</commit_message>
<xml_diff>
--- a/docs/ASX_Value_Screener_Rules_and_Methodology.docx
+++ b/docs/ASX_Value_Screener_Rules_and_Methodology.docx
@@ -14048,7 +14048,1474 @@
         <w:pStyle w:val="Heading1"/>
       </w:pPr>
       <w:r>
-        <w:t xml:space="preserve">13. Key Limitations</w:t>
+        <w:t xml:space="preserve">13. Statistics</w:t>
+      </w:r>
+    </w:p>
+    <w:p>
+      <w:pPr>
+        <w:spacing w:after="120"/>
+      </w:pPr>
+      <w:r>
+        <w:t xml:space="preserve">Three statistics put Sift's results into plain words. None of them changes an action, so none changes the rules version. They are recalculated each night (the Statistics step, after Track Record).</w:t>
+      </w:r>
+    </w:p>
+    <w:tbl>
+      <w:tblPr>
+        <w:tblW w:type="dxa" w:w="9638"/>
+        <w:tblBorders>
+          <w:top w:val="single" w:color="auto" w:sz="4"/>
+          <w:left w:val="single" w:color="auto" w:sz="4"/>
+          <w:bottom w:val="single" w:color="auto" w:sz="4"/>
+          <w:right w:val="single" w:color="auto" w:sz="4"/>
+          <w:insideH w:val="single" w:color="auto" w:sz="4"/>
+          <w:insideV w:val="single" w:color="auto" w:sz="4"/>
+        </w:tblBorders>
+      </w:tblPr>
+      <w:tblGrid>
+        <w:gridCol w:w="1638"/>
+        <w:gridCol w:w="1734"/>
+        <w:gridCol w:w="4144"/>
+        <w:gridCol w:w="2122"/>
+      </w:tblGrid>
+      <w:tr>
+        <w:trPr>
+          <w:tblHeader/>
+        </w:trPr>
+        <w:tc>
+          <w:tcPr>
+            <w:tcW w:type="dxa" w:w="1638"/>
+            <w:tcBorders>
+              <w:top w:val="single" w:color="BFC9D9" w:sz="4"/>
+              <w:left w:val="single" w:color="BFC9D9" w:sz="4"/>
+              <w:bottom w:val="single" w:color="BFC9D9" w:sz="4"/>
+              <w:right w:val="single" w:color="BFC9D9" w:sz="4"/>
+            </w:tcBorders>
+            <w:shd w:fill="D9E2F3" w:color="auto" w:val="clear"/>
+            <w:tcMar>
+              <w:top w:type="dxa" w:w="60"/>
+              <w:left w:type="dxa" w:w="100"/>
+              <w:bottom w:type="dxa" w:w="60"/>
+              <w:right w:type="dxa" w:w="100"/>
+            </w:tcMar>
+          </w:tcPr>
+          <w:p>
+            <w:pPr>
+              <w:spacing w:after="0"/>
+            </w:pPr>
+            <w:r>
+              <w:rPr>
+                <w:b/>
+                <w:bCs/>
+                <w:color w:val="1F3864"/>
+                <w:sz w:val="18"/>
+                <w:szCs w:val="18"/>
+              </w:rPr>
+              <w:t xml:space="preserve">Statistic</w:t>
+            </w:r>
+          </w:p>
+        </w:tc>
+        <w:tc>
+          <w:tcPr>
+            <w:tcW w:type="dxa" w:w="1734"/>
+            <w:tcBorders>
+              <w:top w:val="single" w:color="BFC9D9" w:sz="4"/>
+              <w:left w:val="single" w:color="BFC9D9" w:sz="4"/>
+              <w:bottom w:val="single" w:color="BFC9D9" w:sz="4"/>
+              <w:right w:val="single" w:color="BFC9D9" w:sz="4"/>
+            </w:tcBorders>
+            <w:shd w:fill="D9E2F3" w:color="auto" w:val="clear"/>
+            <w:tcMar>
+              <w:top w:type="dxa" w:w="60"/>
+              <w:left w:type="dxa" w:w="100"/>
+              <w:bottom w:type="dxa" w:w="60"/>
+              <w:right w:type="dxa" w:w="100"/>
+            </w:tcMar>
+          </w:tcPr>
+          <w:p>
+            <w:pPr>
+              <w:spacing w:after="0"/>
+            </w:pPr>
+            <w:r>
+              <w:rPr>
+                <w:b/>
+                <w:bCs/>
+                <w:color w:val="1F3864"/>
+                <w:sz w:val="18"/>
+                <w:szCs w:val="18"/>
+              </w:rPr>
+              <w:t xml:space="preserve">Where</w:t>
+            </w:r>
+          </w:p>
+        </w:tc>
+        <w:tc>
+          <w:tcPr>
+            <w:tcW w:type="dxa" w:w="4144"/>
+            <w:tcBorders>
+              <w:top w:val="single" w:color="BFC9D9" w:sz="4"/>
+              <w:left w:val="single" w:color="BFC9D9" w:sz="4"/>
+              <w:bottom w:val="single" w:color="BFC9D9" w:sz="4"/>
+              <w:right w:val="single" w:color="BFC9D9" w:sz="4"/>
+            </w:tcBorders>
+            <w:shd w:fill="D9E2F3" w:color="auto" w:val="clear"/>
+            <w:tcMar>
+              <w:top w:type="dxa" w:w="60"/>
+              <w:left w:type="dxa" w:w="100"/>
+              <w:bottom w:type="dxa" w:w="60"/>
+              <w:right w:type="dxa" w:w="100"/>
+            </w:tcMar>
+          </w:tcPr>
+          <w:p>
+            <w:pPr>
+              <w:spacing w:after="0"/>
+            </w:pPr>
+            <w:r>
+              <w:rPr>
+                <w:b/>
+                <w:bCs/>
+                <w:color w:val="1F3864"/>
+                <w:sz w:val="18"/>
+                <w:szCs w:val="18"/>
+              </w:rPr>
+              <w:t xml:space="preserve">How it is worked out</w:t>
+            </w:r>
+          </w:p>
+        </w:tc>
+        <w:tc>
+          <w:tcPr>
+            <w:tcW w:type="dxa" w:w="2122"/>
+            <w:tcBorders>
+              <w:top w:val="single" w:color="BFC9D9" w:sz="4"/>
+              <w:left w:val="single" w:color="BFC9D9" w:sz="4"/>
+              <w:bottom w:val="single" w:color="BFC9D9" w:sz="4"/>
+              <w:right w:val="single" w:color="BFC9D9" w:sz="4"/>
+            </w:tcBorders>
+            <w:shd w:fill="D9E2F3" w:color="auto" w:val="clear"/>
+            <w:tcMar>
+              <w:top w:type="dxa" w:w="60"/>
+              <w:left w:type="dxa" w:w="100"/>
+              <w:bottom w:type="dxa" w:w="60"/>
+              <w:right w:type="dxa" w:w="100"/>
+            </w:tcMar>
+          </w:tcPr>
+          <w:p>
+            <w:pPr>
+              <w:spacing w:after="0"/>
+            </w:pPr>
+            <w:r>
+              <w:rPr>
+                <w:b/>
+                <w:bCs/>
+                <w:color w:val="1F3864"/>
+                <w:sz w:val="18"/>
+                <w:szCs w:val="18"/>
+              </w:rPr>
+              <w:t xml:space="preserve">Shown as</w:t>
+            </w:r>
+          </w:p>
+        </w:tc>
+      </w:tr>
+      <w:tr>
+        <w:trPr>
+          <w:cantSplit/>
+        </w:trPr>
+        <w:tc>
+          <w:tcPr>
+            <w:tcW w:type="dxa" w:w="1638"/>
+            <w:tcBorders>
+              <w:top w:val="single" w:color="BFC9D9" w:sz="4"/>
+              <w:left w:val="single" w:color="BFC9D9" w:sz="4"/>
+              <w:bottom w:val="single" w:color="BFC9D9" w:sz="4"/>
+              <w:right w:val="single" w:color="BFC9D9" w:sz="4"/>
+            </w:tcBorders>
+            <w:tcMar>
+              <w:top w:type="dxa" w:w="60"/>
+              <w:left w:type="dxa" w:w="100"/>
+              <w:bottom w:type="dxa" w:w="60"/>
+              <w:right w:type="dxa" w:w="100"/>
+            </w:tcMar>
+          </w:tcPr>
+          <w:p>
+            <w:pPr>
+              <w:spacing w:after="0"/>
+            </w:pPr>
+            <w:r>
+              <w:rPr>
+                <w:sz w:val="18"/>
+                <w:szCs w:val="18"/>
+              </w:rPr>
+              <w:t xml:space="preserve">Is each rule working?</w:t>
+            </w:r>
+          </w:p>
+        </w:tc>
+        <w:tc>
+          <w:tcPr>
+            <w:tcW w:type="dxa" w:w="1734"/>
+            <w:tcBorders>
+              <w:top w:val="single" w:color="BFC9D9" w:sz="4"/>
+              <w:left w:val="single" w:color="BFC9D9" w:sz="4"/>
+              <w:bottom w:val="single" w:color="BFC9D9" w:sz="4"/>
+              <w:right w:val="single" w:color="BFC9D9" w:sz="4"/>
+            </w:tcBorders>
+            <w:tcMar>
+              <w:top w:type="dxa" w:w="60"/>
+              <w:left w:type="dxa" w:w="100"/>
+              <w:bottom w:type="dxa" w:w="60"/>
+              <w:right w:type="dxa" w:w="100"/>
+            </w:tcMar>
+          </w:tcPr>
+          <w:p>
+            <w:pPr>
+              <w:spacing w:after="0"/>
+            </w:pPr>
+            <w:r>
+              <w:rPr>
+                <w:sz w:val="18"/>
+                <w:szCs w:val="18"/>
+              </w:rPr>
+              <w:t xml:space="preserve">Track record (Is Sift accurate?) and the dashboard</w:t>
+            </w:r>
+          </w:p>
+        </w:tc>
+        <w:tc>
+          <w:tcPr>
+            <w:tcW w:type="dxa" w:w="4144"/>
+            <w:tcBorders>
+              <w:top w:val="single" w:color="BFC9D9" w:sz="4"/>
+              <w:left w:val="single" w:color="BFC9D9" w:sz="4"/>
+              <w:bottom w:val="single" w:color="BFC9D9" w:sz="4"/>
+              <w:right w:val="single" w:color="BFC9D9" w:sz="4"/>
+            </w:tcBorders>
+            <w:tcMar>
+              <w:top w:type="dxa" w:w="60"/>
+              <w:left w:type="dxa" w:w="100"/>
+              <w:bottom w:type="dxa" w:w="60"/>
+              <w:right w:type="dxa" w:w="100"/>
+            </w:tcMar>
+          </w:tcPr>
+          <w:p>
+            <w:pPr>
+              <w:spacing w:after="0"/>
+            </w:pPr>
+            <w:r>
+              <w:rPr>
+                <w:sz w:val="18"/>
+                <w:szCs w:val="18"/>
+              </w:rPr>
+              <w:t xml:space="preserve">For each action and period: the average excess return of its monthly calls against the average screened share, and a t-test at 95% (Student, 1908). The standard error is widened by the square root of the period in months, because calls a month apart overlap (Hansen and Hodrick, 1980). Judged from stats_min_calls calls (30).</w:t>
+            </w:r>
+          </w:p>
+        </w:tc>
+        <w:tc>
+          <w:tcPr>
+            <w:tcW w:type="dxa" w:w="2122"/>
+            <w:tcBorders>
+              <w:top w:val="single" w:color="BFC9D9" w:sz="4"/>
+              <w:left w:val="single" w:color="BFC9D9" w:sz="4"/>
+              <w:bottom w:val="single" w:color="BFC9D9" w:sz="4"/>
+              <w:right w:val="single" w:color="BFC9D9" w:sz="4"/>
+            </w:tcBorders>
+            <w:tcMar>
+              <w:top w:type="dxa" w:w="60"/>
+              <w:left w:type="dxa" w:w="100"/>
+              <w:bottom w:type="dxa" w:w="60"/>
+              <w:right w:type="dxa" w:w="100"/>
+            </w:tcMar>
+          </w:tcPr>
+          <w:p>
+            <w:pPr>
+              <w:spacing w:after="0"/>
+            </w:pPr>
+            <w:r>
+              <w:rPr>
+                <w:sz w:val="18"/>
+                <w:szCs w:val="18"/>
+              </w:rPr>
+              <w:t xml:space="preserve">Beating the average, Trailing the average, Too early to tell or Needs more calls; the chance it is luck as odds; a bar of the likely true edge</w:t>
+            </w:r>
+          </w:p>
+        </w:tc>
+      </w:tr>
+      <w:tr>
+        <w:trPr>
+          <w:cantSplit/>
+        </w:trPr>
+        <w:tc>
+          <w:tcPr>
+            <w:tcW w:type="dxa" w:w="1638"/>
+            <w:tcBorders>
+              <w:top w:val="single" w:color="BFC9D9" w:sz="4"/>
+              <w:left w:val="single" w:color="BFC9D9" w:sz="4"/>
+              <w:bottom w:val="single" w:color="BFC9D9" w:sz="4"/>
+              <w:right w:val="single" w:color="BFC9D9" w:sz="4"/>
+            </w:tcBorders>
+            <w:shd w:fill="F2F5FA" w:color="auto" w:val="clear"/>
+            <w:tcMar>
+              <w:top w:type="dxa" w:w="60"/>
+              <w:left w:type="dxa" w:w="100"/>
+              <w:bottom w:type="dxa" w:w="60"/>
+              <w:right w:type="dxa" w:w="100"/>
+            </w:tcMar>
+          </w:tcPr>
+          <w:p>
+            <w:pPr>
+              <w:spacing w:after="0"/>
+            </w:pPr>
+            <w:r>
+              <w:rPr>
+                <w:sz w:val="18"/>
+                <w:szCs w:val="18"/>
+              </w:rPr>
+              <w:t xml:space="preserve">Chance of reaching a price</w:t>
+            </w:r>
+          </w:p>
+        </w:tc>
+        <w:tc>
+          <w:tcPr>
+            <w:tcW w:type="dxa" w:w="1734"/>
+            <w:tcBorders>
+              <w:top w:val="single" w:color="BFC9D9" w:sz="4"/>
+              <w:left w:val="single" w:color="BFC9D9" w:sz="4"/>
+              <w:bottom w:val="single" w:color="BFC9D9" w:sz="4"/>
+              <w:right w:val="single" w:color="BFC9D9" w:sz="4"/>
+            </w:tcBorders>
+            <w:shd w:fill="F2F5FA" w:color="auto" w:val="clear"/>
+            <w:tcMar>
+              <w:top w:type="dxa" w:w="60"/>
+              <w:left w:type="dxa" w:w="100"/>
+              <w:bottom w:type="dxa" w:w="60"/>
+              <w:right w:type="dxa" w:w="100"/>
+            </w:tcMar>
+          </w:tcPr>
+          <w:p>
+            <w:pPr>
+              <w:spacing w:after="0"/>
+            </w:pPr>
+            <w:r>
+              <w:rPr>
+                <w:sz w:val="18"/>
+                <w:szCs w:val="18"/>
+              </w:rPr>
+              <w:t xml:space="preserve">Company page, under Price against estimated value</w:t>
+            </w:r>
+          </w:p>
+        </w:tc>
+        <w:tc>
+          <w:tcPr>
+            <w:tcW w:type="dxa" w:w="4144"/>
+            <w:tcBorders>
+              <w:top w:val="single" w:color="BFC9D9" w:sz="4"/>
+              <w:left w:val="single" w:color="BFC9D9" w:sz="4"/>
+              <w:bottom w:val="single" w:color="BFC9D9" w:sz="4"/>
+              <w:right w:val="single" w:color="BFC9D9" w:sz="4"/>
+            </w:tcBorders>
+            <w:shd w:fill="F2F5FA" w:color="auto" w:val="clear"/>
+            <w:tcMar>
+              <w:top w:type="dxa" w:w="60"/>
+              <w:left w:type="dxa" w:w="100"/>
+              <w:bottom w:type="dxa" w:w="60"/>
+              <w:right w:type="dxa" w:w="100"/>
+            </w:tcMar>
+          </w:tcPr>
+          <w:p>
+            <w:pPr>
+              <w:spacing w:after="0"/>
+            </w:pPr>
+            <w:r>
+              <w:rPr>
+                <w:sz w:val="18"/>
+                <w:szCs w:val="18"/>
+              </w:rPr>
+              <w:t xml:space="preserve">Volatility = standard deviation of daily log returns over stats_years years (3) x sqrt(252). Chance of touching level L from price P within a year, no trend assumed: 2 x (1 - N(ln(L / P) / volatility)) (the reflection principle). Already reached when L &lt;= P.</w:t>
+            </w:r>
+          </w:p>
+        </w:tc>
+        <w:tc>
+          <w:tcPr>
+            <w:tcW w:type="dxa" w:w="2122"/>
+            <w:tcBorders>
+              <w:top w:val="single" w:color="BFC9D9" w:sz="4"/>
+              <w:left w:val="single" w:color="BFC9D9" w:sz="4"/>
+              <w:bottom w:val="single" w:color="BFC9D9" w:sz="4"/>
+              <w:right w:val="single" w:color="BFC9D9" w:sz="4"/>
+            </w:tcBorders>
+            <w:shd w:fill="F2F5FA" w:color="auto" w:val="clear"/>
+            <w:tcMar>
+              <w:top w:type="dxa" w:w="60"/>
+              <w:left w:type="dxa" w:w="100"/>
+              <w:bottom w:type="dxa" w:w="60"/>
+              <w:right w:type="dxa" w:w="100"/>
+            </w:tcMar>
+          </w:tcPr>
+          <w:p>
+            <w:pPr>
+              <w:spacing w:after="0"/>
+            </w:pPr>
+            <w:r>
+              <w:rPr>
+                <w:sz w:val="18"/>
+                <w:szCs w:val="18"/>
+              </w:rPr>
+              <w:t xml:space="preserve">Ten dots and words: Very unlikely, Unlikely, Possible, About even, Likely, Very likely (numbers in 10)</w:t>
+            </w:r>
+          </w:p>
+        </w:tc>
+      </w:tr>
+      <w:tr>
+        <w:trPr>
+          <w:cantSplit/>
+        </w:trPr>
+        <w:tc>
+          <w:tcPr>
+            <w:tcW w:type="dxa" w:w="1638"/>
+            <w:tcBorders>
+              <w:top w:val="single" w:color="BFC9D9" w:sz="4"/>
+              <w:left w:val="single" w:color="BFC9D9" w:sz="4"/>
+              <w:bottom w:val="single" w:color="BFC9D9" w:sz="4"/>
+              <w:right w:val="single" w:color="BFC9D9" w:sz="4"/>
+            </w:tcBorders>
+            <w:tcMar>
+              <w:top w:type="dxa" w:w="60"/>
+              <w:left w:type="dxa" w:w="100"/>
+              <w:bottom w:type="dxa" w:w="60"/>
+              <w:right w:type="dxa" w:w="100"/>
+            </w:tcMar>
+          </w:tcPr>
+          <w:p>
+            <w:pPr>
+              <w:spacing w:after="0"/>
+            </w:pPr>
+            <w:r>
+              <w:rPr>
+                <w:sz w:val="18"/>
+                <w:szCs w:val="18"/>
+              </w:rPr>
+              <w:t xml:space="preserve">Likely price range</w:t>
+            </w:r>
+          </w:p>
+        </w:tc>
+        <w:tc>
+          <w:tcPr>
+            <w:tcW w:type="dxa" w:w="1734"/>
+            <w:tcBorders>
+              <w:top w:val="single" w:color="BFC9D9" w:sz="4"/>
+              <w:left w:val="single" w:color="BFC9D9" w:sz="4"/>
+              <w:bottom w:val="single" w:color="BFC9D9" w:sz="4"/>
+              <w:right w:val="single" w:color="BFC9D9" w:sz="4"/>
+            </w:tcBorders>
+            <w:tcMar>
+              <w:top w:type="dxa" w:w="60"/>
+              <w:left w:type="dxa" w:w="100"/>
+              <w:bottom w:type="dxa" w:w="60"/>
+              <w:right w:type="dxa" w:w="100"/>
+            </w:tcMar>
+          </w:tcPr>
+          <w:p>
+            <w:pPr>
+              <w:spacing w:after="0"/>
+            </w:pPr>
+            <w:r>
+              <w:rPr>
+                <w:sz w:val="18"/>
+                <w:szCs w:val="18"/>
+              </w:rPr>
+              <w:t xml:space="preserve">Company page, share price chart</w:t>
+            </w:r>
+          </w:p>
+        </w:tc>
+        <w:tc>
+          <w:tcPr>
+            <w:tcW w:type="dxa" w:w="4144"/>
+            <w:tcBorders>
+              <w:top w:val="single" w:color="BFC9D9" w:sz="4"/>
+              <w:left w:val="single" w:color="BFC9D9" w:sz="4"/>
+              <w:bottom w:val="single" w:color="BFC9D9" w:sz="4"/>
+              <w:right w:val="single" w:color="BFC9D9" w:sz="4"/>
+            </w:tcBorders>
+            <w:tcMar>
+              <w:top w:type="dxa" w:w="60"/>
+              <w:left w:type="dxa" w:w="100"/>
+              <w:bottom w:type="dxa" w:w="60"/>
+              <w:right w:type="dxa" w:w="100"/>
+            </w:tcMar>
+          </w:tcPr>
+          <w:p>
+            <w:pPr>
+              <w:spacing w:after="0"/>
+            </w:pPr>
+            <w:r>
+              <w:rPr>
+                <w:sz w:val="18"/>
+                <w:szCs w:val="18"/>
+              </w:rPr>
+              <w:t xml:space="preserve">P x e^(-volatility) to P x e^(+volatility) after 12 months, widening with the square root of time; about two years in three.</w:t>
+            </w:r>
+          </w:p>
+        </w:tc>
+        <w:tc>
+          <w:tcPr>
+            <w:tcW w:type="dxa" w:w="2122"/>
+            <w:tcBorders>
+              <w:top w:val="single" w:color="BFC9D9" w:sz="4"/>
+              <w:left w:val="single" w:color="BFC9D9" w:sz="4"/>
+              <w:bottom w:val="single" w:color="BFC9D9" w:sz="4"/>
+              <w:right w:val="single" w:color="BFC9D9" w:sz="4"/>
+            </w:tcBorders>
+            <w:tcMar>
+              <w:top w:type="dxa" w:w="60"/>
+              <w:left w:type="dxa" w:w="100"/>
+              <w:bottom w:type="dxa" w:w="60"/>
+              <w:right w:type="dxa" w:w="100"/>
+            </w:tcMar>
+          </w:tcPr>
+          <w:p>
+            <w:pPr>
+              <w:spacing w:after="0"/>
+            </w:pPr>
+            <w:r>
+              <w:rPr>
+                <w:sz w:val="18"/>
+                <w:szCs w:val="18"/>
+              </w:rPr>
+              <w:t xml:space="preserve">A shaded range after Today, with a sentence</w:t>
+            </w:r>
+          </w:p>
+        </w:tc>
+      </w:tr>
+      <w:tr>
+        <w:trPr>
+          <w:cantSplit/>
+        </w:trPr>
+        <w:tc>
+          <w:tcPr>
+            <w:tcW w:type="dxa" w:w="1638"/>
+            <w:tcBorders>
+              <w:top w:val="single" w:color="BFC9D9" w:sz="4"/>
+              <w:left w:val="single" w:color="BFC9D9" w:sz="4"/>
+              <w:bottom w:val="single" w:color="BFC9D9" w:sz="4"/>
+              <w:right w:val="single" w:color="BFC9D9" w:sz="4"/>
+            </w:tcBorders>
+            <w:shd w:fill="F2F5FA" w:color="auto" w:val="clear"/>
+            <w:tcMar>
+              <w:top w:type="dxa" w:w="60"/>
+              <w:left w:type="dxa" w:w="100"/>
+              <w:bottom w:type="dxa" w:w="60"/>
+              <w:right w:type="dxa" w:w="100"/>
+            </w:tcMar>
+          </w:tcPr>
+          <w:p>
+            <w:pPr>
+              <w:spacing w:after="0"/>
+            </w:pPr>
+            <w:r>
+              <w:rPr>
+                <w:sz w:val="18"/>
+                <w:szCs w:val="18"/>
+              </w:rPr>
+              <w:t xml:space="preserve">Beta (kept for the crash test)</w:t>
+            </w:r>
+          </w:p>
+        </w:tc>
+        <w:tc>
+          <w:tcPr>
+            <w:tcW w:type="dxa" w:w="1734"/>
+            <w:tcBorders>
+              <w:top w:val="single" w:color="BFC9D9" w:sz="4"/>
+              <w:left w:val="single" w:color="BFC9D9" w:sz="4"/>
+              <w:bottom w:val="single" w:color="BFC9D9" w:sz="4"/>
+              <w:right w:val="single" w:color="BFC9D9" w:sz="4"/>
+            </w:tcBorders>
+            <w:shd w:fill="F2F5FA" w:color="auto" w:val="clear"/>
+            <w:tcMar>
+              <w:top w:type="dxa" w:w="60"/>
+              <w:left w:type="dxa" w:w="100"/>
+              <w:bottom w:type="dxa" w:w="60"/>
+              <w:right w:type="dxa" w:w="100"/>
+            </w:tcMar>
+          </w:tcPr>
+          <w:p>
+            <w:pPr>
+              <w:spacing w:after="0"/>
+            </w:pPr>
+            <w:r>
+              <w:rPr>
+                <w:sz w:val="18"/>
+                <w:szCs w:val="18"/>
+              </w:rPr>
+              <w:t xml:space="preserve">Not shown yet</w:t>
+            </w:r>
+          </w:p>
+        </w:tc>
+        <w:tc>
+          <w:tcPr>
+            <w:tcW w:type="dxa" w:w="4144"/>
+            <w:tcBorders>
+              <w:top w:val="single" w:color="BFC9D9" w:sz="4"/>
+              <w:left w:val="single" w:color="BFC9D9" w:sz="4"/>
+              <w:bottom w:val="single" w:color="BFC9D9" w:sz="4"/>
+              <w:right w:val="single" w:color="BFC9D9" w:sz="4"/>
+            </w:tcBorders>
+            <w:shd w:fill="F2F5FA" w:color="auto" w:val="clear"/>
+            <w:tcMar>
+              <w:top w:type="dxa" w:w="60"/>
+              <w:left w:type="dxa" w:w="100"/>
+              <w:bottom w:type="dxa" w:w="60"/>
+              <w:right w:type="dxa" w:w="100"/>
+            </w:tcMar>
+          </w:tcPr>
+          <w:p>
+            <w:pPr>
+              <w:spacing w:after="0"/>
+            </w:pPr>
+            <w:r>
+              <w:rPr>
+                <w:sz w:val="18"/>
+                <w:szCs w:val="18"/>
+              </w:rPr>
+              <w:t xml:space="preserve">Slope of weekly log returns on an ASX 200 fund's (IOZ, else STW, A200 or VAS) over stats_years years (Sharpe, 1964; weekly as in Scholes and Williams, 1977).</w:t>
+            </w:r>
+          </w:p>
+        </w:tc>
+        <w:tc>
+          <w:tcPr>
+            <w:tcW w:type="dxa" w:w="2122"/>
+            <w:tcBorders>
+              <w:top w:val="single" w:color="BFC9D9" w:sz="4"/>
+              <w:left w:val="single" w:color="BFC9D9" w:sz="4"/>
+              <w:bottom w:val="single" w:color="BFC9D9" w:sz="4"/>
+              <w:right w:val="single" w:color="BFC9D9" w:sz="4"/>
+            </w:tcBorders>
+            <w:shd w:fill="F2F5FA" w:color="auto" w:val="clear"/>
+            <w:tcMar>
+              <w:top w:type="dxa" w:w="60"/>
+              <w:left w:type="dxa" w:w="100"/>
+              <w:bottom w:type="dxa" w:w="60"/>
+              <w:right w:type="dxa" w:w="100"/>
+            </w:tcMar>
+          </w:tcPr>
+          <w:p>
+            <w:pPr>
+              <w:spacing w:after="0"/>
+            </w:pPr>
+            <w:r>
+              <w:rPr>
+                <w:sz w:val="18"/>
+                <w:szCs w:val="18"/>
+              </w:rPr>
+              <w:t xml:space="preserve">AI tools and the graph export</w:t>
+            </w:r>
+          </w:p>
+        </w:tc>
+      </w:tr>
+    </w:tbl>
+    <w:p>
+      <w:pPr>
+        <w:spacing w:after="120"/>
+      </w:pPr>
+    </w:p>
+    <w:p>
+      <w:pPr>
+        <w:pStyle w:val="Heading2"/>
+      </w:pPr>
+      <w:r>
+        <w:t xml:space="preserve">13.1 Settings and fixed methods</w:t>
+      </w:r>
+    </w:p>
+    <w:tbl>
+      <w:tblPr>
+        <w:tblW w:type="dxa" w:w="9638"/>
+        <w:tblBorders>
+          <w:top w:val="single" w:color="auto" w:sz="4"/>
+          <w:left w:val="single" w:color="auto" w:sz="4"/>
+          <w:bottom w:val="single" w:color="auto" w:sz="4"/>
+          <w:right w:val="single" w:color="auto" w:sz="4"/>
+          <w:insideH w:val="single" w:color="auto" w:sz="4"/>
+          <w:insideV w:val="single" w:color="auto" w:sz="4"/>
+        </w:tblBorders>
+      </w:tblPr>
+      <w:tblGrid>
+        <w:gridCol w:w="2120"/>
+        <w:gridCol w:w="4047"/>
+        <w:gridCol w:w="3471"/>
+      </w:tblGrid>
+      <w:tr>
+        <w:trPr>
+          <w:tblHeader/>
+        </w:trPr>
+        <w:tc>
+          <w:tcPr>
+            <w:tcW w:type="dxa" w:w="2120"/>
+            <w:tcBorders>
+              <w:top w:val="single" w:color="BFC9D9" w:sz="4"/>
+              <w:left w:val="single" w:color="BFC9D9" w:sz="4"/>
+              <w:bottom w:val="single" w:color="BFC9D9" w:sz="4"/>
+              <w:right w:val="single" w:color="BFC9D9" w:sz="4"/>
+            </w:tcBorders>
+            <w:shd w:fill="D9E2F3" w:color="auto" w:val="clear"/>
+            <w:tcMar>
+              <w:top w:type="dxa" w:w="60"/>
+              <w:left w:type="dxa" w:w="100"/>
+              <w:bottom w:type="dxa" w:w="60"/>
+              <w:right w:type="dxa" w:w="100"/>
+            </w:tcMar>
+          </w:tcPr>
+          <w:p>
+            <w:pPr>
+              <w:spacing w:after="0"/>
+            </w:pPr>
+            <w:r>
+              <w:rPr>
+                <w:b/>
+                <w:bCs/>
+                <w:color w:val="1F3864"/>
+                <w:sz w:val="18"/>
+                <w:szCs w:val="18"/>
+              </w:rPr>
+              <w:t xml:space="preserve">Item</w:t>
+            </w:r>
+          </w:p>
+        </w:tc>
+        <w:tc>
+          <w:tcPr>
+            <w:tcW w:type="dxa" w:w="4047"/>
+            <w:tcBorders>
+              <w:top w:val="single" w:color="BFC9D9" w:sz="4"/>
+              <w:left w:val="single" w:color="BFC9D9" w:sz="4"/>
+              <w:bottom w:val="single" w:color="BFC9D9" w:sz="4"/>
+              <w:right w:val="single" w:color="BFC9D9" w:sz="4"/>
+            </w:tcBorders>
+            <w:shd w:fill="D9E2F3" w:color="auto" w:val="clear"/>
+            <w:tcMar>
+              <w:top w:type="dxa" w:w="60"/>
+              <w:left w:type="dxa" w:w="100"/>
+              <w:bottom w:type="dxa" w:w="60"/>
+              <w:right w:type="dxa" w:w="100"/>
+            </w:tcMar>
+          </w:tcPr>
+          <w:p>
+            <w:pPr>
+              <w:spacing w:after="0"/>
+            </w:pPr>
+            <w:r>
+              <w:rPr>
+                <w:b/>
+                <w:bCs/>
+                <w:color w:val="1F3864"/>
+                <w:sz w:val="18"/>
+                <w:szCs w:val="18"/>
+              </w:rPr>
+              <w:t xml:space="preserve">Value</w:t>
+            </w:r>
+          </w:p>
+        </w:tc>
+        <w:tc>
+          <w:tcPr>
+            <w:tcW w:type="dxa" w:w="3471"/>
+            <w:tcBorders>
+              <w:top w:val="single" w:color="BFC9D9" w:sz="4"/>
+              <w:left w:val="single" w:color="BFC9D9" w:sz="4"/>
+              <w:bottom w:val="single" w:color="BFC9D9" w:sz="4"/>
+              <w:right w:val="single" w:color="BFC9D9" w:sz="4"/>
+            </w:tcBorders>
+            <w:shd w:fill="D9E2F3" w:color="auto" w:val="clear"/>
+            <w:tcMar>
+              <w:top w:type="dxa" w:w="60"/>
+              <w:left w:type="dxa" w:w="100"/>
+              <w:bottom w:type="dxa" w:w="60"/>
+              <w:right w:type="dxa" w:w="100"/>
+            </w:tcMar>
+          </w:tcPr>
+          <w:p>
+            <w:pPr>
+              <w:spacing w:after="0"/>
+            </w:pPr>
+            <w:r>
+              <w:rPr>
+                <w:b/>
+                <w:bCs/>
+                <w:color w:val="1F3864"/>
+                <w:sz w:val="18"/>
+                <w:szCs w:val="18"/>
+              </w:rPr>
+              <w:t xml:space="preserve">Adjustable</w:t>
+            </w:r>
+          </w:p>
+        </w:tc>
+      </w:tr>
+      <w:tr>
+        <w:trPr>
+          <w:cantSplit/>
+        </w:trPr>
+        <w:tc>
+          <w:tcPr>
+            <w:tcW w:type="dxa" w:w="2120"/>
+            <w:tcBorders>
+              <w:top w:val="single" w:color="BFC9D9" w:sz="4"/>
+              <w:left w:val="single" w:color="BFC9D9" w:sz="4"/>
+              <w:bottom w:val="single" w:color="BFC9D9" w:sz="4"/>
+              <w:right w:val="single" w:color="BFC9D9" w:sz="4"/>
+            </w:tcBorders>
+            <w:tcMar>
+              <w:top w:type="dxa" w:w="60"/>
+              <w:left w:type="dxa" w:w="100"/>
+              <w:bottom w:type="dxa" w:w="60"/>
+              <w:right w:type="dxa" w:w="100"/>
+            </w:tcMar>
+          </w:tcPr>
+          <w:p>
+            <w:pPr>
+              <w:spacing w:after="0"/>
+            </w:pPr>
+            <w:r>
+              <w:rPr>
+                <w:sz w:val="18"/>
+                <w:szCs w:val="18"/>
+              </w:rPr>
+              <w:t xml:space="preserve">stats_min_calls</w:t>
+            </w:r>
+          </w:p>
+        </w:tc>
+        <w:tc>
+          <w:tcPr>
+            <w:tcW w:type="dxa" w:w="4047"/>
+            <w:tcBorders>
+              <w:top w:val="single" w:color="BFC9D9" w:sz="4"/>
+              <w:left w:val="single" w:color="BFC9D9" w:sz="4"/>
+              <w:bottom w:val="single" w:color="BFC9D9" w:sz="4"/>
+              <w:right w:val="single" w:color="BFC9D9" w:sz="4"/>
+            </w:tcBorders>
+            <w:tcMar>
+              <w:top w:type="dxa" w:w="60"/>
+              <w:left w:type="dxa" w:w="100"/>
+              <w:bottom w:type="dxa" w:w="60"/>
+              <w:right w:type="dxa" w:w="100"/>
+            </w:tcMar>
+          </w:tcPr>
+          <w:p>
+            <w:pPr>
+              <w:spacing w:after="0"/>
+            </w:pPr>
+            <w:r>
+              <w:rPr>
+                <w:sz w:val="18"/>
+                <w:szCs w:val="18"/>
+              </w:rPr>
+              <w:t xml:space="preserve">30 calls before an action is judged</w:t>
+            </w:r>
+          </w:p>
+        </w:tc>
+        <w:tc>
+          <w:tcPr>
+            <w:tcW w:type="dxa" w:w="3471"/>
+            <w:tcBorders>
+              <w:top w:val="single" w:color="BFC9D9" w:sz="4"/>
+              <w:left w:val="single" w:color="BFC9D9" w:sz="4"/>
+              <w:bottom w:val="single" w:color="BFC9D9" w:sz="4"/>
+              <w:right w:val="single" w:color="BFC9D9" w:sz="4"/>
+            </w:tcBorders>
+            <w:tcMar>
+              <w:top w:type="dxa" w:w="60"/>
+              <w:left w:type="dxa" w:w="100"/>
+              <w:bottom w:type="dxa" w:w="60"/>
+              <w:right w:type="dxa" w:w="100"/>
+            </w:tcMar>
+          </w:tcPr>
+          <w:p>
+            <w:pPr>
+              <w:spacing w:after="0"/>
+            </w:pPr>
+            <w:r>
+              <w:rPr>
+                <w:sz w:val="18"/>
+                <w:szCs w:val="18"/>
+              </w:rPr>
+              <w:t xml:space="preserve">Yes (Admin, Model and rules, Statistics)</w:t>
+            </w:r>
+          </w:p>
+        </w:tc>
+      </w:tr>
+      <w:tr>
+        <w:trPr>
+          <w:cantSplit/>
+        </w:trPr>
+        <w:tc>
+          <w:tcPr>
+            <w:tcW w:type="dxa" w:w="2120"/>
+            <w:tcBorders>
+              <w:top w:val="single" w:color="BFC9D9" w:sz="4"/>
+              <w:left w:val="single" w:color="BFC9D9" w:sz="4"/>
+              <w:bottom w:val="single" w:color="BFC9D9" w:sz="4"/>
+              <w:right w:val="single" w:color="BFC9D9" w:sz="4"/>
+            </w:tcBorders>
+            <w:shd w:fill="F2F5FA" w:color="auto" w:val="clear"/>
+            <w:tcMar>
+              <w:top w:type="dxa" w:w="60"/>
+              <w:left w:type="dxa" w:w="100"/>
+              <w:bottom w:type="dxa" w:w="60"/>
+              <w:right w:type="dxa" w:w="100"/>
+            </w:tcMar>
+          </w:tcPr>
+          <w:p>
+            <w:pPr>
+              <w:spacing w:after="0"/>
+            </w:pPr>
+            <w:r>
+              <w:rPr>
+                <w:sz w:val="18"/>
+                <w:szCs w:val="18"/>
+              </w:rPr>
+              <w:t xml:space="preserve">stats_years</w:t>
+            </w:r>
+          </w:p>
+        </w:tc>
+        <w:tc>
+          <w:tcPr>
+            <w:tcW w:type="dxa" w:w="4047"/>
+            <w:tcBorders>
+              <w:top w:val="single" w:color="BFC9D9" w:sz="4"/>
+              <w:left w:val="single" w:color="BFC9D9" w:sz="4"/>
+              <w:bottom w:val="single" w:color="BFC9D9" w:sz="4"/>
+              <w:right w:val="single" w:color="BFC9D9" w:sz="4"/>
+            </w:tcBorders>
+            <w:shd w:fill="F2F5FA" w:color="auto" w:val="clear"/>
+            <w:tcMar>
+              <w:top w:type="dxa" w:w="60"/>
+              <w:left w:type="dxa" w:w="100"/>
+              <w:bottom w:type="dxa" w:w="60"/>
+              <w:right w:type="dxa" w:w="100"/>
+            </w:tcMar>
+          </w:tcPr>
+          <w:p>
+            <w:pPr>
+              <w:spacing w:after="0"/>
+            </w:pPr>
+            <w:r>
+              <w:rPr>
+                <w:sz w:val="18"/>
+                <w:szCs w:val="18"/>
+              </w:rPr>
+              <w:t xml:space="preserve">3 years of price history (at least one needed)</w:t>
+            </w:r>
+          </w:p>
+        </w:tc>
+        <w:tc>
+          <w:tcPr>
+            <w:tcW w:type="dxa" w:w="3471"/>
+            <w:tcBorders>
+              <w:top w:val="single" w:color="BFC9D9" w:sz="4"/>
+              <w:left w:val="single" w:color="BFC9D9" w:sz="4"/>
+              <w:bottom w:val="single" w:color="BFC9D9" w:sz="4"/>
+              <w:right w:val="single" w:color="BFC9D9" w:sz="4"/>
+            </w:tcBorders>
+            <w:shd w:fill="F2F5FA" w:color="auto" w:val="clear"/>
+            <w:tcMar>
+              <w:top w:type="dxa" w:w="60"/>
+              <w:left w:type="dxa" w:w="100"/>
+              <w:bottom w:type="dxa" w:w="60"/>
+              <w:right w:type="dxa" w:w="100"/>
+            </w:tcMar>
+          </w:tcPr>
+          <w:p>
+            <w:pPr>
+              <w:spacing w:after="0"/>
+            </w:pPr>
+            <w:r>
+              <w:rPr>
+                <w:sz w:val="18"/>
+                <w:szCs w:val="18"/>
+              </w:rPr>
+              <w:t xml:space="preserve">Yes</w:t>
+            </w:r>
+          </w:p>
+        </w:tc>
+      </w:tr>
+      <w:tr>
+        <w:trPr>
+          <w:cantSplit/>
+        </w:trPr>
+        <w:tc>
+          <w:tcPr>
+            <w:tcW w:type="dxa" w:w="2120"/>
+            <w:tcBorders>
+              <w:top w:val="single" w:color="BFC9D9" w:sz="4"/>
+              <w:left w:val="single" w:color="BFC9D9" w:sz="4"/>
+              <w:bottom w:val="single" w:color="BFC9D9" w:sz="4"/>
+              <w:right w:val="single" w:color="BFC9D9" w:sz="4"/>
+            </w:tcBorders>
+            <w:tcMar>
+              <w:top w:type="dxa" w:w="60"/>
+              <w:left w:type="dxa" w:w="100"/>
+              <w:bottom w:type="dxa" w:w="60"/>
+              <w:right w:type="dxa" w:w="100"/>
+            </w:tcMar>
+          </w:tcPr>
+          <w:p>
+            <w:pPr>
+              <w:spacing w:after="0"/>
+            </w:pPr>
+            <w:r>
+              <w:rPr>
+                <w:sz w:val="18"/>
+                <w:szCs w:val="18"/>
+              </w:rPr>
+              <w:t xml:space="preserve">Confidence</w:t>
+            </w:r>
+          </w:p>
+        </w:tc>
+        <w:tc>
+          <w:tcPr>
+            <w:tcW w:type="dxa" w:w="4047"/>
+            <w:tcBorders>
+              <w:top w:val="single" w:color="BFC9D9" w:sz="4"/>
+              <w:left w:val="single" w:color="BFC9D9" w:sz="4"/>
+              <w:bottom w:val="single" w:color="BFC9D9" w:sz="4"/>
+              <w:right w:val="single" w:color="BFC9D9" w:sz="4"/>
+            </w:tcBorders>
+            <w:tcMar>
+              <w:top w:type="dxa" w:w="60"/>
+              <w:left w:type="dxa" w:w="100"/>
+              <w:bottom w:type="dxa" w:w="60"/>
+              <w:right w:type="dxa" w:w="100"/>
+            </w:tcMar>
+          </w:tcPr>
+          <w:p>
+            <w:pPr>
+              <w:spacing w:after="0"/>
+            </w:pPr>
+            <w:r>
+              <w:rPr>
+                <w:sz w:val="18"/>
+                <w:szCs w:val="18"/>
+              </w:rPr>
+              <w:t xml:space="preserve">95% (19 times in 20)</w:t>
+            </w:r>
+          </w:p>
+        </w:tc>
+        <w:tc>
+          <w:tcPr>
+            <w:tcW w:type="dxa" w:w="3471"/>
+            <w:tcBorders>
+              <w:top w:val="single" w:color="BFC9D9" w:sz="4"/>
+              <w:left w:val="single" w:color="BFC9D9" w:sz="4"/>
+              <w:bottom w:val="single" w:color="BFC9D9" w:sz="4"/>
+              <w:right w:val="single" w:color="BFC9D9" w:sz="4"/>
+            </w:tcBorders>
+            <w:tcMar>
+              <w:top w:type="dxa" w:w="60"/>
+              <w:left w:type="dxa" w:w="100"/>
+              <w:bottom w:type="dxa" w:w="60"/>
+              <w:right w:type="dxa" w:w="100"/>
+            </w:tcMar>
+          </w:tcPr>
+          <w:p>
+            <w:pPr>
+              <w:spacing w:after="0"/>
+            </w:pPr>
+            <w:r>
+              <w:rPr>
+                <w:sz w:val="18"/>
+                <w:szCs w:val="18"/>
+              </w:rPr>
+              <w:t xml:space="preserve">No: fixed so a result can't be tuned until a rule passes</w:t>
+            </w:r>
+          </w:p>
+        </w:tc>
+      </w:tr>
+      <w:tr>
+        <w:trPr>
+          <w:cantSplit/>
+        </w:trPr>
+        <w:tc>
+          <w:tcPr>
+            <w:tcW w:type="dxa" w:w="2120"/>
+            <w:tcBorders>
+              <w:top w:val="single" w:color="BFC9D9" w:sz="4"/>
+              <w:left w:val="single" w:color="BFC9D9" w:sz="4"/>
+              <w:bottom w:val="single" w:color="BFC9D9" w:sz="4"/>
+              <w:right w:val="single" w:color="BFC9D9" w:sz="4"/>
+            </w:tcBorders>
+            <w:shd w:fill="F2F5FA" w:color="auto" w:val="clear"/>
+            <w:tcMar>
+              <w:top w:type="dxa" w:w="60"/>
+              <w:left w:type="dxa" w:w="100"/>
+              <w:bottom w:type="dxa" w:w="60"/>
+              <w:right w:type="dxa" w:w="100"/>
+            </w:tcMar>
+          </w:tcPr>
+          <w:p>
+            <w:pPr>
+              <w:spacing w:after="0"/>
+            </w:pPr>
+            <w:r>
+              <w:rPr>
+                <w:sz w:val="18"/>
+                <w:szCs w:val="18"/>
+              </w:rPr>
+              <w:t xml:space="preserve">Overlap allowance</w:t>
+            </w:r>
+          </w:p>
+        </w:tc>
+        <w:tc>
+          <w:tcPr>
+            <w:tcW w:type="dxa" w:w="4047"/>
+            <w:tcBorders>
+              <w:top w:val="single" w:color="BFC9D9" w:sz="4"/>
+              <w:left w:val="single" w:color="BFC9D9" w:sz="4"/>
+              <w:bottom w:val="single" w:color="BFC9D9" w:sz="4"/>
+              <w:right w:val="single" w:color="BFC9D9" w:sz="4"/>
+            </w:tcBorders>
+            <w:shd w:fill="F2F5FA" w:color="auto" w:val="clear"/>
+            <w:tcMar>
+              <w:top w:type="dxa" w:w="60"/>
+              <w:left w:type="dxa" w:w="100"/>
+              <w:bottom w:type="dxa" w:w="60"/>
+              <w:right w:type="dxa" w:w="100"/>
+            </w:tcMar>
+          </w:tcPr>
+          <w:p>
+            <w:pPr>
+              <w:spacing w:after="0"/>
+            </w:pPr>
+            <w:r>
+              <w:rPr>
+                <w:sz w:val="18"/>
+                <w:szCs w:val="18"/>
+              </w:rPr>
+              <w:t xml:space="preserve">Error x sqrt(months)</w:t>
+            </w:r>
+          </w:p>
+        </w:tc>
+        <w:tc>
+          <w:tcPr>
+            <w:tcW w:type="dxa" w:w="3471"/>
+            <w:tcBorders>
+              <w:top w:val="single" w:color="BFC9D9" w:sz="4"/>
+              <w:left w:val="single" w:color="BFC9D9" w:sz="4"/>
+              <w:bottom w:val="single" w:color="BFC9D9" w:sz="4"/>
+              <w:right w:val="single" w:color="BFC9D9" w:sz="4"/>
+            </w:tcBorders>
+            <w:shd w:fill="F2F5FA" w:color="auto" w:val="clear"/>
+            <w:tcMar>
+              <w:top w:type="dxa" w:w="60"/>
+              <w:left w:type="dxa" w:w="100"/>
+              <w:bottom w:type="dxa" w:w="60"/>
+              <w:right w:type="dxa" w:w="100"/>
+            </w:tcMar>
+          </w:tcPr>
+          <w:p>
+            <w:pPr>
+              <w:spacing w:after="0"/>
+            </w:pPr>
+            <w:r>
+              <w:rPr>
+                <w:sz w:val="18"/>
+                <w:szCs w:val="18"/>
+              </w:rPr>
+              <w:t xml:space="preserve">No</w:t>
+            </w:r>
+          </w:p>
+        </w:tc>
+      </w:tr>
+      <w:tr>
+        <w:trPr>
+          <w:cantSplit/>
+        </w:trPr>
+        <w:tc>
+          <w:tcPr>
+            <w:tcW w:type="dxa" w:w="2120"/>
+            <w:tcBorders>
+              <w:top w:val="single" w:color="BFC9D9" w:sz="4"/>
+              <w:left w:val="single" w:color="BFC9D9" w:sz="4"/>
+              <w:bottom w:val="single" w:color="BFC9D9" w:sz="4"/>
+              <w:right w:val="single" w:color="BFC9D9" w:sz="4"/>
+            </w:tcBorders>
+            <w:tcMar>
+              <w:top w:type="dxa" w:w="60"/>
+              <w:left w:type="dxa" w:w="100"/>
+              <w:bottom w:type="dxa" w:w="60"/>
+              <w:right w:type="dxa" w:w="100"/>
+            </w:tcMar>
+          </w:tcPr>
+          <w:p>
+            <w:pPr>
+              <w:spacing w:after="0"/>
+            </w:pPr>
+            <w:r>
+              <w:rPr>
+                <w:sz w:val="18"/>
+                <w:szCs w:val="18"/>
+              </w:rPr>
+              <w:t xml:space="preserve">Benchmark</w:t>
+            </w:r>
+          </w:p>
+        </w:tc>
+        <w:tc>
+          <w:tcPr>
+            <w:tcW w:type="dxa" w:w="4047"/>
+            <w:tcBorders>
+              <w:top w:val="single" w:color="BFC9D9" w:sz="4"/>
+              <w:left w:val="single" w:color="BFC9D9" w:sz="4"/>
+              <w:bottom w:val="single" w:color="BFC9D9" w:sz="4"/>
+              <w:right w:val="single" w:color="BFC9D9" w:sz="4"/>
+            </w:tcBorders>
+            <w:tcMar>
+              <w:top w:type="dxa" w:w="60"/>
+              <w:left w:type="dxa" w:w="100"/>
+              <w:bottom w:type="dxa" w:w="60"/>
+              <w:right w:type="dxa" w:w="100"/>
+            </w:tcMar>
+          </w:tcPr>
+          <w:p>
+            <w:pPr>
+              <w:spacing w:after="0"/>
+            </w:pPr>
+            <w:r>
+              <w:rPr>
+                <w:sz w:val="18"/>
+                <w:szCs w:val="18"/>
+              </w:rPr>
+              <w:t xml:space="preserve">The average screened share, total return</w:t>
+            </w:r>
+          </w:p>
+        </w:tc>
+        <w:tc>
+          <w:tcPr>
+            <w:tcW w:type="dxa" w:w="3471"/>
+            <w:tcBorders>
+              <w:top w:val="single" w:color="BFC9D9" w:sz="4"/>
+              <w:left w:val="single" w:color="BFC9D9" w:sz="4"/>
+              <w:bottom w:val="single" w:color="BFC9D9" w:sz="4"/>
+              <w:right w:val="single" w:color="BFC9D9" w:sz="4"/>
+            </w:tcBorders>
+            <w:tcMar>
+              <w:top w:type="dxa" w:w="60"/>
+              <w:left w:type="dxa" w:w="100"/>
+              <w:bottom w:type="dxa" w:w="60"/>
+              <w:right w:type="dxa" w:w="100"/>
+            </w:tcMar>
+          </w:tcPr>
+          <w:p>
+            <w:pPr>
+              <w:spacing w:after="0"/>
+            </w:pPr>
+            <w:r>
+              <w:rPr>
+                <w:sz w:val="18"/>
+                <w:szCs w:val="18"/>
+              </w:rPr>
+              <w:t xml:space="preserve">No: the track record's own</w:t>
+            </w:r>
+          </w:p>
+        </w:tc>
+      </w:tr>
+      <w:tr>
+        <w:trPr>
+          <w:cantSplit/>
+        </w:trPr>
+        <w:tc>
+          <w:tcPr>
+            <w:tcW w:type="dxa" w:w="2120"/>
+            <w:tcBorders>
+              <w:top w:val="single" w:color="BFC9D9" w:sz="4"/>
+              <w:left w:val="single" w:color="BFC9D9" w:sz="4"/>
+              <w:bottom w:val="single" w:color="BFC9D9" w:sz="4"/>
+              <w:right w:val="single" w:color="BFC9D9" w:sz="4"/>
+            </w:tcBorders>
+            <w:shd w:fill="F2F5FA" w:color="auto" w:val="clear"/>
+            <w:tcMar>
+              <w:top w:type="dxa" w:w="60"/>
+              <w:left w:type="dxa" w:w="100"/>
+              <w:bottom w:type="dxa" w:w="60"/>
+              <w:right w:type="dxa" w:w="100"/>
+            </w:tcMar>
+          </w:tcPr>
+          <w:p>
+            <w:pPr>
+              <w:spacing w:after="0"/>
+            </w:pPr>
+            <w:r>
+              <w:rPr>
+                <w:sz w:val="18"/>
+                <w:szCs w:val="18"/>
+              </w:rPr>
+              <w:t xml:space="preserve">Price model</w:t>
+            </w:r>
+          </w:p>
+        </w:tc>
+        <w:tc>
+          <w:tcPr>
+            <w:tcW w:type="dxa" w:w="4047"/>
+            <w:tcBorders>
+              <w:top w:val="single" w:color="BFC9D9" w:sz="4"/>
+              <w:left w:val="single" w:color="BFC9D9" w:sz="4"/>
+              <w:bottom w:val="single" w:color="BFC9D9" w:sz="4"/>
+              <w:right w:val="single" w:color="BFC9D9" w:sz="4"/>
+            </w:tcBorders>
+            <w:shd w:fill="F2F5FA" w:color="auto" w:val="clear"/>
+            <w:tcMar>
+              <w:top w:type="dxa" w:w="60"/>
+              <w:left w:type="dxa" w:w="100"/>
+              <w:bottom w:type="dxa" w:w="60"/>
+              <w:right w:type="dxa" w:w="100"/>
+            </w:tcMar>
+          </w:tcPr>
+          <w:p>
+            <w:pPr>
+              <w:spacing w:after="0"/>
+            </w:pPr>
+            <w:r>
+              <w:rPr>
+                <w:sz w:val="18"/>
+                <w:szCs w:val="18"/>
+              </w:rPr>
+              <w:t xml:space="preserve">Random walk in the log price, no trend</w:t>
+            </w:r>
+          </w:p>
+        </w:tc>
+        <w:tc>
+          <w:tcPr>
+            <w:tcW w:type="dxa" w:w="3471"/>
+            <w:tcBorders>
+              <w:top w:val="single" w:color="BFC9D9" w:sz="4"/>
+              <w:left w:val="single" w:color="BFC9D9" w:sz="4"/>
+              <w:bottom w:val="single" w:color="BFC9D9" w:sz="4"/>
+              <w:right w:val="single" w:color="BFC9D9" w:sz="4"/>
+            </w:tcBorders>
+            <w:shd w:fill="F2F5FA" w:color="auto" w:val="clear"/>
+            <w:tcMar>
+              <w:top w:type="dxa" w:w="60"/>
+              <w:left w:type="dxa" w:w="100"/>
+              <w:bottom w:type="dxa" w:w="60"/>
+              <w:right w:type="dxa" w:w="100"/>
+            </w:tcMar>
+          </w:tcPr>
+          <w:p>
+            <w:pPr>
+              <w:spacing w:after="0"/>
+            </w:pPr>
+            <w:r>
+              <w:rPr>
+                <w:sz w:val="18"/>
+                <w:szCs w:val="18"/>
+              </w:rPr>
+              <w:t xml:space="preserve">No</w:t>
+            </w:r>
+          </w:p>
+        </w:tc>
+      </w:tr>
+      <w:tr>
+        <w:trPr>
+          <w:cantSplit/>
+        </w:trPr>
+        <w:tc>
+          <w:tcPr>
+            <w:tcW w:type="dxa" w:w="2120"/>
+            <w:tcBorders>
+              <w:top w:val="single" w:color="BFC9D9" w:sz="4"/>
+              <w:left w:val="single" w:color="BFC9D9" w:sz="4"/>
+              <w:bottom w:val="single" w:color="BFC9D9" w:sz="4"/>
+              <w:right w:val="single" w:color="BFC9D9" w:sz="4"/>
+            </w:tcBorders>
+            <w:tcMar>
+              <w:top w:type="dxa" w:w="60"/>
+              <w:left w:type="dxa" w:w="100"/>
+              <w:bottom w:type="dxa" w:w="60"/>
+              <w:right w:type="dxa" w:w="100"/>
+            </w:tcMar>
+          </w:tcPr>
+          <w:p>
+            <w:pPr>
+              <w:spacing w:after="0"/>
+            </w:pPr>
+            <w:r>
+              <w:rPr>
+                <w:sz w:val="18"/>
+                <w:szCs w:val="18"/>
+              </w:rPr>
+              <w:t xml:space="preserve">Words for chances</w:t>
+            </w:r>
+          </w:p>
+        </w:tc>
+        <w:tc>
+          <w:tcPr>
+            <w:tcW w:type="dxa" w:w="4047"/>
+            <w:tcBorders>
+              <w:top w:val="single" w:color="BFC9D9" w:sz="4"/>
+              <w:left w:val="single" w:color="BFC9D9" w:sz="4"/>
+              <w:bottom w:val="single" w:color="BFC9D9" w:sz="4"/>
+              <w:right w:val="single" w:color="BFC9D9" w:sz="4"/>
+            </w:tcBorders>
+            <w:tcMar>
+              <w:top w:type="dxa" w:w="60"/>
+              <w:left w:type="dxa" w:w="100"/>
+              <w:bottom w:type="dxa" w:w="60"/>
+              <w:right w:type="dxa" w:w="100"/>
+            </w:tcMar>
+          </w:tcPr>
+          <w:p>
+            <w:pPr>
+              <w:spacing w:after="0"/>
+            </w:pPr>
+            <w:r>
+              <w:rPr>
+                <w:sz w:val="18"/>
+                <w:szCs w:val="18"/>
+              </w:rPr>
+              <w:t xml:space="preserve">Six fixed words, numbers in 10</w:t>
+            </w:r>
+          </w:p>
+        </w:tc>
+        <w:tc>
+          <w:tcPr>
+            <w:tcW w:type="dxa" w:w="3471"/>
+            <w:tcBorders>
+              <w:top w:val="single" w:color="BFC9D9" w:sz="4"/>
+              <w:left w:val="single" w:color="BFC9D9" w:sz="4"/>
+              <w:bottom w:val="single" w:color="BFC9D9" w:sz="4"/>
+              <w:right w:val="single" w:color="BFC9D9" w:sz="4"/>
+            </w:tcBorders>
+            <w:tcMar>
+              <w:top w:type="dxa" w:w="60"/>
+              <w:left w:type="dxa" w:w="100"/>
+              <w:bottom w:type="dxa" w:w="60"/>
+              <w:right w:type="dxa" w:w="100"/>
+            </w:tcMar>
+          </w:tcPr>
+          <w:p>
+            <w:pPr>
+              <w:spacing w:after="0"/>
+            </w:pPr>
+            <w:r>
+              <w:rPr>
+                <w:sz w:val="18"/>
+                <w:szCs w:val="18"/>
+              </w:rPr>
+              <w:t xml:space="preserve">No</w:t>
+            </w:r>
+          </w:p>
+        </w:tc>
+      </w:tr>
+    </w:tbl>
+    <w:p>
+      <w:pPr>
+        <w:spacing w:after="160" w:before="60"/>
+      </w:pPr>
+      <w:r>
+        <w:rPr>
+          <w:i/>
+          <w:iCs/>
+          <w:color w:val="555555"/>
+          <w:sz w:val="18"/>
+          <w:szCs w:val="18"/>
+        </w:rPr>
+        <w:t xml:space="preserve">Ranges and chances describe how prices have moved. They know nothing about news, results or value, and real prices have fatter tails than the model (Mandelbrot, 1963). Full references: Help, The theory behind Sift's statistics, and the developer article Statistics.</w:t>
+      </w:r>
+    </w:p>
+    <w:p>
+      <w:pPr>
+        <w:pStyle w:val="Heading1"/>
+      </w:pPr>
+      <w:r>
+        <w:t xml:space="preserve">14. Key Limitations</w:t>
       </w:r>
     </w:p>
     <w:p>
@@ -17590,6 +19057,70 @@
                 <w:sz w:val="18"/>
                 <w:szCs w:val="18"/>
               </w:rPr>
+              <w:t xml:space="preserve">Chance of reaching a price</w:t>
+            </w:r>
+          </w:p>
+        </w:tc>
+        <w:tc>
+          <w:tcPr>
+            <w:tcW w:type="dxa" w:w="7133"/>
+            <w:tcBorders>
+              <w:top w:val="single" w:color="BFC9D9" w:sz="4"/>
+              <w:left w:val="single" w:color="BFC9D9" w:sz="4"/>
+              <w:bottom w:val="single" w:color="BFC9D9" w:sz="4"/>
+              <w:right w:val="single" w:color="BFC9D9" w:sz="4"/>
+            </w:tcBorders>
+            <w:tcMar>
+              <w:top w:type="dxa" w:w="60"/>
+              <w:left w:type="dxa" w:w="100"/>
+              <w:bottom w:type="dxa" w:w="60"/>
+              <w:right w:type="dxa" w:w="100"/>
+            </w:tcMar>
+          </w:tcPr>
+          <w:p>
+            <w:pPr>
+              <w:spacing w:after="0"/>
+            </w:pPr>
+            <w:r>
+              <w:rPr>
+                <w:sz w:val="18"/>
+                <w:szCs w:val="18"/>
+              </w:rPr>
+              <w:t xml:space="preserve">How often a share whose price moves like this one's touches a level at least once within 12 months.</w:t>
+            </w:r>
+          </w:p>
+        </w:tc>
+      </w:tr>
+      <w:tr>
+        <w:trPr>
+          <w:cantSplit/>
+        </w:trPr>
+        <w:tc>
+          <w:tcPr>
+            <w:tcW w:type="dxa" w:w="2505"/>
+            <w:tcBorders>
+              <w:top w:val="single" w:color="BFC9D9" w:sz="4"/>
+              <w:left w:val="single" w:color="BFC9D9" w:sz="4"/>
+              <w:bottom w:val="single" w:color="BFC9D9" w:sz="4"/>
+              <w:right w:val="single" w:color="BFC9D9" w:sz="4"/>
+            </w:tcBorders>
+            <w:shd w:fill="F2F5FA" w:color="auto" w:val="clear"/>
+            <w:tcMar>
+              <w:top w:type="dxa" w:w="60"/>
+              <w:left w:type="dxa" w:w="100"/>
+              <w:bottom w:type="dxa" w:w="60"/>
+              <w:right w:type="dxa" w:w="100"/>
+            </w:tcMar>
+          </w:tcPr>
+          <w:p>
+            <w:pPr>
+              <w:spacing w:after="0"/>
+            </w:pPr>
+            <w:r>
+              <w:rPr>
+                <w:sz w:val="18"/>
+                <w:szCs w:val="18"/>
+              </w:rPr>
               <w:t xml:space="preserve">Coattail investing</w:t>
             </w:r>
           </w:p>
@@ -17603,6 +19134,7 @@
               <w:bottom w:val="single" w:color="BFC9D9" w:sz="4"/>
               <w:right w:val="single" w:color="BFC9D9" w:sz="4"/>
             </w:tcBorders>
+            <w:shd w:fill="F2F5FA" w:color="auto" w:val="clear"/>
             <w:tcMar>
               <w:top w:type="dxa" w:w="60"/>
               <w:left w:type="dxa" w:w="100"/>
@@ -17637,7 +19169,6 @@
               <w:bottom w:val="single" w:color="BFC9D9" w:sz="4"/>
               <w:right w:val="single" w:color="BFC9D9" w:sz="4"/>
             </w:tcBorders>
-            <w:shd w:fill="F2F5FA" w:color="auto" w:val="clear"/>
             <w:tcMar>
               <w:top w:type="dxa" w:w="60"/>
               <w:left w:type="dxa" w:w="100"/>
@@ -17667,7 +19198,6 @@
               <w:bottom w:val="single" w:color="BFC9D9" w:sz="4"/>
               <w:right w:val="single" w:color="BFC9D9" w:sz="4"/>
             </w:tcBorders>
-            <w:shd w:fill="F2F5FA" w:color="auto" w:val="clear"/>
             <w:tcMar>
               <w:top w:type="dxa" w:w="60"/>
               <w:left w:type="dxa" w:w="100"/>
@@ -17702,6 +19232,7 @@
               <w:bottom w:val="single" w:color="BFC9D9" w:sz="4"/>
               <w:right w:val="single" w:color="BFC9D9" w:sz="4"/>
             </w:tcBorders>
+            <w:shd w:fill="F2F5FA" w:color="auto" w:val="clear"/>
             <w:tcMar>
               <w:top w:type="dxa" w:w="60"/>
               <w:left w:type="dxa" w:w="100"/>
@@ -17731,6 +19262,7 @@
               <w:bottom w:val="single" w:color="BFC9D9" w:sz="4"/>
               <w:right w:val="single" w:color="BFC9D9" w:sz="4"/>
             </w:tcBorders>
+            <w:shd w:fill="F2F5FA" w:color="auto" w:val="clear"/>
             <w:tcMar>
               <w:top w:type="dxa" w:w="60"/>
               <w:left w:type="dxa" w:w="100"/>
@@ -17765,7 +19297,6 @@
               <w:bottom w:val="single" w:color="BFC9D9" w:sz="4"/>
               <w:right w:val="single" w:color="BFC9D9" w:sz="4"/>
             </w:tcBorders>
-            <w:shd w:fill="F2F5FA" w:color="auto" w:val="clear"/>
             <w:tcMar>
               <w:top w:type="dxa" w:w="60"/>
               <w:left w:type="dxa" w:w="100"/>
@@ -17795,7 +19326,6 @@
               <w:bottom w:val="single" w:color="BFC9D9" w:sz="4"/>
               <w:right w:val="single" w:color="BFC9D9" w:sz="4"/>
             </w:tcBorders>
-            <w:shd w:fill="F2F5FA" w:color="auto" w:val="clear"/>
             <w:tcMar>
               <w:top w:type="dxa" w:w="60"/>
               <w:left w:type="dxa" w:w="100"/>
@@ -17830,6 +19360,7 @@
               <w:bottom w:val="single" w:color="BFC9D9" w:sz="4"/>
               <w:right w:val="single" w:color="BFC9D9" w:sz="4"/>
             </w:tcBorders>
+            <w:shd w:fill="F2F5FA" w:color="auto" w:val="clear"/>
             <w:tcMar>
               <w:top w:type="dxa" w:w="60"/>
               <w:left w:type="dxa" w:w="100"/>
@@ -17859,6 +19390,7 @@
               <w:bottom w:val="single" w:color="BFC9D9" w:sz="4"/>
               <w:right w:val="single" w:color="BFC9D9" w:sz="4"/>
             </w:tcBorders>
+            <w:shd w:fill="F2F5FA" w:color="auto" w:val="clear"/>
             <w:tcMar>
               <w:top w:type="dxa" w:w="60"/>
               <w:left w:type="dxa" w:w="100"/>
@@ -17893,7 +19425,6 @@
               <w:bottom w:val="single" w:color="BFC9D9" w:sz="4"/>
               <w:right w:val="single" w:color="BFC9D9" w:sz="4"/>
             </w:tcBorders>
-            <w:shd w:fill="F2F5FA" w:color="auto" w:val="clear"/>
             <w:tcMar>
               <w:top w:type="dxa" w:w="60"/>
               <w:left w:type="dxa" w:w="100"/>
@@ -17923,7 +19454,6 @@
               <w:bottom w:val="single" w:color="BFC9D9" w:sz="4"/>
               <w:right w:val="single" w:color="BFC9D9" w:sz="4"/>
             </w:tcBorders>
-            <w:shd w:fill="F2F5FA" w:color="auto" w:val="clear"/>
             <w:tcMar>
               <w:top w:type="dxa" w:w="60"/>
               <w:left w:type="dxa" w:w="100"/>
@@ -17958,6 +19488,7 @@
               <w:bottom w:val="single" w:color="BFC9D9" w:sz="4"/>
               <w:right w:val="single" w:color="BFC9D9" w:sz="4"/>
             </w:tcBorders>
+            <w:shd w:fill="F2F5FA" w:color="auto" w:val="clear"/>
             <w:tcMar>
               <w:top w:type="dxa" w:w="60"/>
               <w:left w:type="dxa" w:w="100"/>
@@ -17987,6 +19518,7 @@
               <w:bottom w:val="single" w:color="BFC9D9" w:sz="4"/>
               <w:right w:val="single" w:color="BFC9D9" w:sz="4"/>
             </w:tcBorders>
+            <w:shd w:fill="F2F5FA" w:color="auto" w:val="clear"/>
             <w:tcMar>
               <w:top w:type="dxa" w:w="60"/>
               <w:left w:type="dxa" w:w="100"/>
@@ -18021,7 +19553,6 @@
               <w:bottom w:val="single" w:color="BFC9D9" w:sz="4"/>
               <w:right w:val="single" w:color="BFC9D9" w:sz="4"/>
             </w:tcBorders>
-            <w:shd w:fill="F2F5FA" w:color="auto" w:val="clear"/>
             <w:tcMar>
               <w:top w:type="dxa" w:w="60"/>
               <w:left w:type="dxa" w:w="100"/>
@@ -18051,7 +19582,6 @@
               <w:bottom w:val="single" w:color="BFC9D9" w:sz="4"/>
               <w:right w:val="single" w:color="BFC9D9" w:sz="4"/>
             </w:tcBorders>
-            <w:shd w:fill="F2F5FA" w:color="auto" w:val="clear"/>
             <w:tcMar>
               <w:top w:type="dxa" w:w="60"/>
               <w:left w:type="dxa" w:w="100"/>
@@ -18086,6 +19616,7 @@
               <w:bottom w:val="single" w:color="BFC9D9" w:sz="4"/>
               <w:right w:val="single" w:color="BFC9D9" w:sz="4"/>
             </w:tcBorders>
+            <w:shd w:fill="F2F5FA" w:color="auto" w:val="clear"/>
             <w:tcMar>
               <w:top w:type="dxa" w:w="60"/>
               <w:left w:type="dxa" w:w="100"/>
@@ -18115,6 +19646,7 @@
               <w:bottom w:val="single" w:color="BFC9D9" w:sz="4"/>
               <w:right w:val="single" w:color="BFC9D9" w:sz="4"/>
             </w:tcBorders>
+            <w:shd w:fill="F2F5FA" w:color="auto" w:val="clear"/>
             <w:tcMar>
               <w:top w:type="dxa" w:w="60"/>
               <w:left w:type="dxa" w:w="100"/>
@@ -18149,7 +19681,6 @@
               <w:bottom w:val="single" w:color="BFC9D9" w:sz="4"/>
               <w:right w:val="single" w:color="BFC9D9" w:sz="4"/>
             </w:tcBorders>
-            <w:shd w:fill="F2F5FA" w:color="auto" w:val="clear"/>
             <w:tcMar>
               <w:top w:type="dxa" w:w="60"/>
               <w:left w:type="dxa" w:w="100"/>
@@ -18179,7 +19710,6 @@
               <w:bottom w:val="single" w:color="BFC9D9" w:sz="4"/>
               <w:right w:val="single" w:color="BFC9D9" w:sz="4"/>
             </w:tcBorders>
-            <w:shd w:fill="F2F5FA" w:color="auto" w:val="clear"/>
             <w:tcMar>
               <w:top w:type="dxa" w:w="60"/>
               <w:left w:type="dxa" w:w="100"/>
@@ -18214,6 +19744,71 @@
               <w:bottom w:val="single" w:color="BFC9D9" w:sz="4"/>
               <w:right w:val="single" w:color="BFC9D9" w:sz="4"/>
             </w:tcBorders>
+            <w:shd w:fill="F2F5FA" w:color="auto" w:val="clear"/>
+            <w:tcMar>
+              <w:top w:type="dxa" w:w="60"/>
+              <w:left w:type="dxa" w:w="100"/>
+              <w:bottom w:type="dxa" w:w="60"/>
+              <w:right w:type="dxa" w:w="100"/>
+            </w:tcMar>
+          </w:tcPr>
+          <w:p>
+            <w:pPr>
+              <w:spacing w:after="0"/>
+            </w:pPr>
+            <w:r>
+              <w:rPr>
+                <w:sz w:val="18"/>
+                <w:szCs w:val="18"/>
+              </w:rPr>
+              <w:t xml:space="preserve">Likely price range</w:t>
+            </w:r>
+          </w:p>
+        </w:tc>
+        <w:tc>
+          <w:tcPr>
+            <w:tcW w:type="dxa" w:w="7133"/>
+            <w:tcBorders>
+              <w:top w:val="single" w:color="BFC9D9" w:sz="4"/>
+              <w:left w:val="single" w:color="BFC9D9" w:sz="4"/>
+              <w:bottom w:val="single" w:color="BFC9D9" w:sz="4"/>
+              <w:right w:val="single" w:color="BFC9D9" w:sz="4"/>
+            </w:tcBorders>
+            <w:shd w:fill="F2F5FA" w:color="auto" w:val="clear"/>
+            <w:tcMar>
+              <w:top w:type="dxa" w:w="60"/>
+              <w:left w:type="dxa" w:w="100"/>
+              <w:bottom w:type="dxa" w:w="60"/>
+              <w:right w:type="dxa" w:w="100"/>
+            </w:tcMar>
+          </w:tcPr>
+          <w:p>
+            <w:pPr>
+              <w:spacing w:after="0"/>
+            </w:pPr>
+            <w:r>
+              <w:rPr>
+                <w:sz w:val="18"/>
+                <w:szCs w:val="18"/>
+              </w:rPr>
+              <w:t xml:space="preserve">Where a share's price would end in a typical year, two years in three, given how much it usually moves.</w:t>
+            </w:r>
+          </w:p>
+        </w:tc>
+      </w:tr>
+      <w:tr>
+        <w:trPr>
+          <w:cantSplit/>
+        </w:trPr>
+        <w:tc>
+          <w:tcPr>
+            <w:tcW w:type="dxa" w:w="2505"/>
+            <w:tcBorders>
+              <w:top w:val="single" w:color="BFC9D9" w:sz="4"/>
+              <w:left w:val="single" w:color="BFC9D9" w:sz="4"/>
+              <w:bottom w:val="single" w:color="BFC9D9" w:sz="4"/>
+              <w:right w:val="single" w:color="BFC9D9" w:sz="4"/>
+            </w:tcBorders>
             <w:tcMar>
               <w:top w:type="dxa" w:w="60"/>
               <w:left w:type="dxa" w:w="100"/>
@@ -18742,6 +20337,70 @@
                 <w:sz w:val="18"/>
                 <w:szCs w:val="18"/>
               </w:rPr>
+              <w:t xml:space="preserve">Rule reliability</w:t>
+            </w:r>
+          </w:p>
+        </w:tc>
+        <w:tc>
+          <w:tcPr>
+            <w:tcW w:type="dxa" w:w="7133"/>
+            <w:tcBorders>
+              <w:top w:val="single" w:color="BFC9D9" w:sz="4"/>
+              <w:left w:val="single" w:color="BFC9D9" w:sz="4"/>
+              <w:bottom w:val="single" w:color="BFC9D9" w:sz="4"/>
+              <w:right w:val="single" w:color="BFC9D9" w:sz="4"/>
+            </w:tcBorders>
+            <w:tcMar>
+              <w:top w:type="dxa" w:w="60"/>
+              <w:left w:type="dxa" w:w="100"/>
+              <w:bottom w:type="dxa" w:w="60"/>
+              <w:right w:type="dxa" w:w="100"/>
+            </w:tcMar>
+          </w:tcPr>
+          <w:p>
+            <w:pPr>
+              <w:spacing w:after="0"/>
+            </w:pPr>
+            <w:r>
+              <w:rPr>
+                <w:sz w:val="18"/>
+                <w:szCs w:val="18"/>
+              </w:rPr>
+              <w:t xml:space="preserve">Whether an action's calls beat (or trailed) the average screened share by more than luck would explain.</w:t>
+            </w:r>
+          </w:p>
+        </w:tc>
+      </w:tr>
+      <w:tr>
+        <w:trPr>
+          <w:cantSplit/>
+        </w:trPr>
+        <w:tc>
+          <w:tcPr>
+            <w:tcW w:type="dxa" w:w="2505"/>
+            <w:tcBorders>
+              <w:top w:val="single" w:color="BFC9D9" w:sz="4"/>
+              <w:left w:val="single" w:color="BFC9D9" w:sz="4"/>
+              <w:bottom w:val="single" w:color="BFC9D9" w:sz="4"/>
+              <w:right w:val="single" w:color="BFC9D9" w:sz="4"/>
+            </w:tcBorders>
+            <w:shd w:fill="F2F5FA" w:color="auto" w:val="clear"/>
+            <w:tcMar>
+              <w:top w:type="dxa" w:w="60"/>
+              <w:left w:type="dxa" w:w="100"/>
+              <w:bottom w:type="dxa" w:w="60"/>
+              <w:right w:type="dxa" w:w="100"/>
+            </w:tcMar>
+          </w:tcPr>
+          <w:p>
+            <w:pPr>
+              <w:spacing w:after="0"/>
+            </w:pPr>
+            <w:r>
+              <w:rPr>
+                <w:sz w:val="18"/>
+                <w:szCs w:val="18"/>
+              </w:rPr>
               <w:t xml:space="preserve">Scenario</w:t>
             </w:r>
           </w:p>
@@ -18755,6 +20414,7 @@
               <w:bottom w:val="single" w:color="BFC9D9" w:sz="4"/>
               <w:right w:val="single" w:color="BFC9D9" w:sz="4"/>
             </w:tcBorders>
+            <w:shd w:fill="F2F5FA" w:color="auto" w:val="clear"/>
             <w:tcMar>
               <w:top w:type="dxa" w:w="60"/>
               <w:left w:type="dxa" w:w="100"/>
@@ -18789,7 +20449,6 @@
               <w:bottom w:val="single" w:color="BFC9D9" w:sz="4"/>
               <w:right w:val="single" w:color="BFC9D9" w:sz="4"/>
             </w:tcBorders>
-            <w:shd w:fill="F2F5FA" w:color="auto" w:val="clear"/>
             <w:tcMar>
               <w:top w:type="dxa" w:w="60"/>
               <w:left w:type="dxa" w:w="100"/>
@@ -18819,7 +20478,6 @@
               <w:bottom w:val="single" w:color="BFC9D9" w:sz="4"/>
               <w:right w:val="single" w:color="BFC9D9" w:sz="4"/>
             </w:tcBorders>
-            <w:shd w:fill="F2F5FA" w:color="auto" w:val="clear"/>
             <w:tcMar>
               <w:top w:type="dxa" w:w="60"/>
               <w:left w:type="dxa" w:w="100"/>
@@ -18854,6 +20512,7 @@
               <w:bottom w:val="single" w:color="BFC9D9" w:sz="4"/>
               <w:right w:val="single" w:color="BFC9D9" w:sz="4"/>
             </w:tcBorders>
+            <w:shd w:fill="F2F5FA" w:color="auto" w:val="clear"/>
             <w:tcMar>
               <w:top w:type="dxa" w:w="60"/>
               <w:left w:type="dxa" w:w="100"/>
@@ -18883,6 +20542,7 @@
               <w:bottom w:val="single" w:color="BFC9D9" w:sz="4"/>
               <w:right w:val="single" w:color="BFC9D9" w:sz="4"/>
             </w:tcBorders>
+            <w:shd w:fill="F2F5FA" w:color="auto" w:val="clear"/>
             <w:tcMar>
               <w:top w:type="dxa" w:w="60"/>
               <w:left w:type="dxa" w:w="100"/>
@@ -18917,7 +20577,6 @@
               <w:bottom w:val="single" w:color="BFC9D9" w:sz="4"/>
               <w:right w:val="single" w:color="BFC9D9" w:sz="4"/>
             </w:tcBorders>
-            <w:shd w:fill="F2F5FA" w:color="auto" w:val="clear"/>
             <w:tcMar>
               <w:top w:type="dxa" w:w="60"/>
               <w:left w:type="dxa" w:w="100"/>
@@ -18947,7 +20606,6 @@
               <w:bottom w:val="single" w:color="BFC9D9" w:sz="4"/>
               <w:right w:val="single" w:color="BFC9D9" w:sz="4"/>
             </w:tcBorders>
-            <w:shd w:fill="F2F5FA" w:color="auto" w:val="clear"/>
             <w:tcMar>
               <w:top w:type="dxa" w:w="60"/>
               <w:left w:type="dxa" w:w="100"/>
@@ -18982,6 +20640,7 @@
               <w:bottom w:val="single" w:color="BFC9D9" w:sz="4"/>
               <w:right w:val="single" w:color="BFC9D9" w:sz="4"/>
             </w:tcBorders>
+            <w:shd w:fill="F2F5FA" w:color="auto" w:val="clear"/>
             <w:tcMar>
               <w:top w:type="dxa" w:w="60"/>
               <w:left w:type="dxa" w:w="100"/>
@@ -19011,6 +20670,7 @@
               <w:bottom w:val="single" w:color="BFC9D9" w:sz="4"/>
               <w:right w:val="single" w:color="BFC9D9" w:sz="4"/>
             </w:tcBorders>
+            <w:shd w:fill="F2F5FA" w:color="auto" w:val="clear"/>
             <w:tcMar>
               <w:top w:type="dxa" w:w="60"/>
               <w:left w:type="dxa" w:w="100"/>
@@ -19045,7 +20705,6 @@
               <w:bottom w:val="single" w:color="BFC9D9" w:sz="4"/>
               <w:right w:val="single" w:color="BFC9D9" w:sz="4"/>
             </w:tcBorders>
-            <w:shd w:fill="F2F5FA" w:color="auto" w:val="clear"/>
             <w:tcMar>
               <w:top w:type="dxa" w:w="60"/>
               <w:left w:type="dxa" w:w="100"/>
@@ -19075,7 +20734,6 @@
               <w:bottom w:val="single" w:color="BFC9D9" w:sz="4"/>
               <w:right w:val="single" w:color="BFC9D9" w:sz="4"/>
             </w:tcBorders>
-            <w:shd w:fill="F2F5FA" w:color="auto" w:val="clear"/>
             <w:tcMar>
               <w:top w:type="dxa" w:w="60"/>
               <w:left w:type="dxa" w:w="100"/>
@@ -19110,6 +20768,71 @@
               <w:bottom w:val="single" w:color="BFC9D9" w:sz="4"/>
               <w:right w:val="single" w:color="BFC9D9" w:sz="4"/>
             </w:tcBorders>
+            <w:shd w:fill="F2F5FA" w:color="auto" w:val="clear"/>
+            <w:tcMar>
+              <w:top w:type="dxa" w:w="60"/>
+              <w:left w:type="dxa" w:w="100"/>
+              <w:bottom w:type="dxa" w:w="60"/>
+              <w:right w:type="dxa" w:w="100"/>
+            </w:tcMar>
+          </w:tcPr>
+          <w:p>
+            <w:pPr>
+              <w:spacing w:after="0"/>
+            </w:pPr>
+            <w:r>
+              <w:rPr>
+                <w:sz w:val="18"/>
+                <w:szCs w:val="18"/>
+              </w:rPr>
+              <w:t xml:space="preserve">Statistics: theory and references</w:t>
+            </w:r>
+          </w:p>
+        </w:tc>
+        <w:tc>
+          <w:tcPr>
+            <w:tcW w:type="dxa" w:w="7133"/>
+            <w:tcBorders>
+              <w:top w:val="single" w:color="BFC9D9" w:sz="4"/>
+              <w:left w:val="single" w:color="BFC9D9" w:sz="4"/>
+              <w:bottom w:val="single" w:color="BFC9D9" w:sz="4"/>
+              <w:right w:val="single" w:color="BFC9D9" w:sz="4"/>
+            </w:tcBorders>
+            <w:shd w:fill="F2F5FA" w:color="auto" w:val="clear"/>
+            <w:tcMar>
+              <w:top w:type="dxa" w:w="60"/>
+              <w:left w:type="dxa" w:w="100"/>
+              <w:bottom w:type="dxa" w:w="60"/>
+              <w:right w:type="dxa" w:w="100"/>
+            </w:tcMar>
+          </w:tcPr>
+          <w:p>
+            <w:pPr>
+              <w:spacing w:after="0"/>
+            </w:pPr>
+            <w:r>
+              <w:rPr>
+                <w:sz w:val="18"/>
+                <w:szCs w:val="18"/>
+              </w:rPr>
+              <w:t xml:space="preserve">The established methods behind Sift's rule verdicts, chances and likely ranges, with the work each comes from.</w:t>
+            </w:r>
+          </w:p>
+        </w:tc>
+      </w:tr>
+      <w:tr>
+        <w:trPr>
+          <w:cantSplit/>
+        </w:trPr>
+        <w:tc>
+          <w:tcPr>
+            <w:tcW w:type="dxa" w:w="2505"/>
+            <w:tcBorders>
+              <w:top w:val="single" w:color="BFC9D9" w:sz="4"/>
+              <w:left w:val="single" w:color="BFC9D9" w:sz="4"/>
+              <w:bottom w:val="single" w:color="BFC9D9" w:sz="4"/>
+              <w:right w:val="single" w:color="BFC9D9" w:sz="4"/>
+            </w:tcBorders>
             <w:tcMar>
               <w:top w:type="dxa" w:w="60"/>
               <w:left w:type="dxa" w:w="100"/>
@@ -19446,6 +21169,70 @@
                 <w:sz w:val="18"/>
                 <w:szCs w:val="18"/>
               </w:rPr>
+              <w:t xml:space="preserve">Volatility</w:t>
+            </w:r>
+          </w:p>
+        </w:tc>
+        <w:tc>
+          <w:tcPr>
+            <w:tcW w:type="dxa" w:w="7133"/>
+            <w:tcBorders>
+              <w:top w:val="single" w:color="BFC9D9" w:sz="4"/>
+              <w:left w:val="single" w:color="BFC9D9" w:sz="4"/>
+              <w:bottom w:val="single" w:color="BFC9D9" w:sz="4"/>
+              <w:right w:val="single" w:color="BFC9D9" w:sz="4"/>
+            </w:tcBorders>
+            <w:shd w:fill="F2F5FA" w:color="auto" w:val="clear"/>
+            <w:tcMar>
+              <w:top w:type="dxa" w:w="60"/>
+              <w:left w:type="dxa" w:w="100"/>
+              <w:bottom w:type="dxa" w:w="60"/>
+              <w:right w:type="dxa" w:w="100"/>
+            </w:tcMar>
+          </w:tcPr>
+          <w:p>
+            <w:pPr>
+              <w:spacing w:after="0"/>
+            </w:pPr>
+            <w:r>
+              <w:rPr>
+                <w:sz w:val="18"/>
+                <w:szCs w:val="18"/>
+              </w:rPr>
+              <w:t xml:space="preserve">Volatility is how much a share's price usually moves in a year; beta is how much it tends to move when the market moves.</w:t>
+            </w:r>
+          </w:p>
+        </w:tc>
+      </w:tr>
+      <w:tr>
+        <w:trPr>
+          <w:cantSplit/>
+        </w:trPr>
+        <w:tc>
+          <w:tcPr>
+            <w:tcW w:type="dxa" w:w="2505"/>
+            <w:tcBorders>
+              <w:top w:val="single" w:color="BFC9D9" w:sz="4"/>
+              <w:left w:val="single" w:color="BFC9D9" w:sz="4"/>
+              <w:bottom w:val="single" w:color="BFC9D9" w:sz="4"/>
+              <w:right w:val="single" w:color="BFC9D9" w:sz="4"/>
+            </w:tcBorders>
+            <w:tcMar>
+              <w:top w:type="dxa" w:w="60"/>
+              <w:left w:type="dxa" w:w="100"/>
+              <w:bottom w:type="dxa" w:w="60"/>
+              <w:right w:type="dxa" w:w="100"/>
+            </w:tcMar>
+          </w:tcPr>
+          <w:p>
+            <w:pPr>
+              <w:spacing w:after="0"/>
+            </w:pPr>
+            <w:r>
+              <w:rPr>
+                <w:sz w:val="18"/>
+                <w:szCs w:val="18"/>
+              </w:rPr>
               <w:t xml:space="preserve">Volume</w:t>
             </w:r>
           </w:p>
@@ -19459,7 +21246,6 @@
               <w:bottom w:val="single" w:color="BFC9D9" w:sz="4"/>
               <w:right w:val="single" w:color="BFC9D9" w:sz="4"/>
             </w:tcBorders>
-            <w:shd w:fill="F2F5FA" w:color="auto" w:val="clear"/>
             <w:tcMar>
               <w:top w:type="dxa" w:w="60"/>
               <w:left w:type="dxa" w:w="100"/>

</xml_diff>